<commit_message>
atualização da aula dia 17/09/26
</commit_message>
<xml_diff>
--- a/apostila/Projeto Space for me3.docx
+++ b/apostila/Projeto Space for me3.docx
@@ -7246,6 +7246,9 @@
     <w:p/>
     <w:p>
       <w:r>
+        <w:rPr>
+          <w:noProof/>
+        </w:rPr>
         <w:drawing>
           <wp:inline distT="0" distB="0" distL="0" distR="0" wp14:anchorId="32F730D0" wp14:editId="501861EB">
             <wp:extent cx="4753638" cy="1724266"/>
@@ -7445,6 +7448,9 @@
         </mc:AlternateContent>
       </w:r>
       <w:r>
+        <w:rPr>
+          <w:noProof/>
+        </w:rPr>
         <w:drawing>
           <wp:inline distT="0" distB="0" distL="0" distR="0" wp14:anchorId="797B4EE2" wp14:editId="0A8E1D4E">
             <wp:extent cx="4601217" cy="1028844"/>
@@ -7511,6 +7517,9 @@
     </w:p>
     <w:p>
       <w:r>
+        <w:rPr>
+          <w:noProof/>
+        </w:rPr>
         <w:drawing>
           <wp:inline distT="0" distB="0" distL="0" distR="0" wp14:anchorId="2C51593C" wp14:editId="47D912DC">
             <wp:extent cx="1848108" cy="847843"/>
@@ -7563,6 +7572,9 @@
     </w:p>
     <w:p>
       <w:r>
+        <w:rPr>
+          <w:noProof/>
+        </w:rPr>
         <w:drawing>
           <wp:inline distT="0" distB="0" distL="0" distR="0" wp14:anchorId="2D699EA4" wp14:editId="74605FDC">
             <wp:extent cx="4089928" cy="1123950"/>
@@ -7600,6 +7612,9 @@
         </w:drawing>
       </w:r>
       <w:r>
+        <w:rPr>
+          <w:noProof/>
+        </w:rPr>
         <w:drawing>
           <wp:inline distT="0" distB="0" distL="0" distR="0" wp14:anchorId="6744691C" wp14:editId="4F21A620">
             <wp:extent cx="4570100" cy="1148080"/>
@@ -7684,6 +7699,9 @@
     </w:p>
     <w:p>
       <w:r>
+        <w:rPr>
+          <w:noProof/>
+        </w:rPr>
         <w:drawing>
           <wp:inline distT="0" distB="0" distL="0" distR="0" wp14:anchorId="77EB102C" wp14:editId="0FD85A67">
             <wp:extent cx="3038899" cy="1543265"/>
@@ -7721,6 +7739,9 @@
         </w:drawing>
       </w:r>
       <w:r>
+        <w:rPr>
+          <w:noProof/>
+        </w:rPr>
         <w:drawing>
           <wp:inline distT="0" distB="0" distL="0" distR="0" wp14:anchorId="39FE7F3B" wp14:editId="05BFD76A">
             <wp:extent cx="5191125" cy="1595611"/>
@@ -7757,9 +7778,1375 @@
           </wp:inline>
         </w:drawing>
       </w:r>
+    </w:p>
+    <w:p>
+      <w:r>
+        <w:t xml:space="preserve">62- </w:t>
+      </w:r>
+      <w:r>
+        <w:t xml:space="preserve">Demos um espaço para o lado de baixo da </w:t>
+      </w:r>
+      <w:proofErr w:type="spellStart"/>
+      <w:r>
+        <w:t>label</w:t>
+      </w:r>
+      <w:proofErr w:type="spellEnd"/>
+      <w:r>
+        <w:t xml:space="preserve"> de margin:20px e aumentamos o tamanho da fonte, o input também acrescentamos um espaço do lado de baixo e aumentamos o espaço interno tanto na parte de cima, para baixo, para esquerda e direita.</w:t>
+      </w:r>
+    </w:p>
+    <w:p>
+      <w:r>
+        <w:rPr>
+          <w:noProof/>
+        </w:rPr>
+        <mc:AlternateContent>
+          <mc:Choice Requires="wps">
+            <w:drawing>
+              <wp:anchor distT="0" distB="0" distL="114300" distR="114300" simplePos="0" relativeHeight="251689984" behindDoc="0" locked="0" layoutInCell="1" allowOverlap="1" wp14:anchorId="7CD8F8F6" wp14:editId="26D4BE60">
+                <wp:simplePos x="0" y="0"/>
+                <wp:positionH relativeFrom="column">
+                  <wp:posOffset>1762125</wp:posOffset>
+                </wp:positionH>
+                <wp:positionV relativeFrom="paragraph">
+                  <wp:posOffset>1663065</wp:posOffset>
+                </wp:positionV>
+                <wp:extent cx="914400" cy="85725"/>
+                <wp:effectExtent l="38100" t="0" r="19050" b="85725"/>
+                <wp:wrapNone/>
+                <wp:docPr id="129" name="Conector de Seta Reta 129"/>
+                <wp:cNvGraphicFramePr/>
+                <a:graphic xmlns:a="http://schemas.openxmlformats.org/drawingml/2006/main">
+                  <a:graphicData uri="http://schemas.microsoft.com/office/word/2010/wordprocessingShape">
+                    <wps:wsp>
+                      <wps:cNvCnPr/>
+                      <wps:spPr>
+                        <a:xfrm flipH="1">
+                          <a:off x="0" y="0"/>
+                          <a:ext cx="914400" cy="85725"/>
+                        </a:xfrm>
+                        <a:prstGeom prst="straightConnector1">
+                          <a:avLst/>
+                        </a:prstGeom>
+                        <a:ln>
+                          <a:tailEnd type="triangle"/>
+                        </a:ln>
+                      </wps:spPr>
+                      <wps:style>
+                        <a:lnRef idx="1">
+                          <a:schemeClr val="accent1"/>
+                        </a:lnRef>
+                        <a:fillRef idx="0">
+                          <a:schemeClr val="accent1"/>
+                        </a:fillRef>
+                        <a:effectRef idx="0">
+                          <a:schemeClr val="accent1"/>
+                        </a:effectRef>
+                        <a:fontRef idx="minor">
+                          <a:schemeClr val="tx1"/>
+                        </a:fontRef>
+                      </wps:style>
+                      <wps:bodyPr/>
+                    </wps:wsp>
+                  </a:graphicData>
+                </a:graphic>
+              </wp:anchor>
+            </w:drawing>
+          </mc:Choice>
+          <mc:Fallback>
+            <w:pict>
+              <v:shapetype w14:anchorId="7CC5A28B" id="_x0000_t32" coordsize="21600,21600" o:spt="32" o:oned="t" path="m,l21600,21600e" filled="f">
+                <v:path arrowok="t" fillok="f" o:connecttype="none"/>
+                <o:lock v:ext="edit" shapetype="t"/>
+              </v:shapetype>
+              <v:shape id="Conector de Seta Reta 129" o:spid="_x0000_s1026" type="#_x0000_t32" style="position:absolute;margin-left:138.75pt;margin-top:130.95pt;width:1in;height:6.75pt;flip:x;z-index:251689984;visibility:visible;mso-wrap-style:square;mso-wrap-distance-left:9pt;mso-wrap-distance-top:0;mso-wrap-distance-right:9pt;mso-wrap-distance-bottom:0;mso-position-horizontal:absolute;mso-position-horizontal-relative:text;mso-position-vertical:absolute;mso-position-vertical-relative:text" o:gfxdata="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" strokecolor="#4472c4 [3204]" strokeweight=".5pt">
+                <v:stroke endarrow="block" joinstyle="miter"/>
+              </v:shape>
+            </w:pict>
+          </mc:Fallback>
+        </mc:AlternateContent>
+      </w:r>
+      <w:r>
+        <w:rPr>
+          <w:noProof/>
+        </w:rPr>
+        <mc:AlternateContent>
+          <mc:Choice Requires="wps">
+            <w:drawing>
+              <wp:anchor distT="0" distB="0" distL="114300" distR="114300" simplePos="0" relativeHeight="251688960" behindDoc="0" locked="0" layoutInCell="1" allowOverlap="1" wp14:anchorId="27A65372" wp14:editId="10AF3E51">
+                <wp:simplePos x="0" y="0"/>
+                <wp:positionH relativeFrom="column">
+                  <wp:posOffset>1676400</wp:posOffset>
+                </wp:positionH>
+                <wp:positionV relativeFrom="paragraph">
+                  <wp:posOffset>653415</wp:posOffset>
+                </wp:positionV>
+                <wp:extent cx="828675" cy="66675"/>
+                <wp:effectExtent l="0" t="57150" r="28575" b="28575"/>
+                <wp:wrapNone/>
+                <wp:docPr id="128" name="Conector de Seta Reta 128"/>
+                <wp:cNvGraphicFramePr/>
+                <a:graphic xmlns:a="http://schemas.openxmlformats.org/drawingml/2006/main">
+                  <a:graphicData uri="http://schemas.microsoft.com/office/word/2010/wordprocessingShape">
+                    <wps:wsp>
+                      <wps:cNvCnPr/>
+                      <wps:spPr>
+                        <a:xfrm flipH="1" flipV="1">
+                          <a:off x="0" y="0"/>
+                          <a:ext cx="828675" cy="66675"/>
+                        </a:xfrm>
+                        <a:prstGeom prst="straightConnector1">
+                          <a:avLst/>
+                        </a:prstGeom>
+                        <a:ln>
+                          <a:tailEnd type="triangle"/>
+                        </a:ln>
+                      </wps:spPr>
+                      <wps:style>
+                        <a:lnRef idx="1">
+                          <a:schemeClr val="accent1"/>
+                        </a:lnRef>
+                        <a:fillRef idx="0">
+                          <a:schemeClr val="accent1"/>
+                        </a:fillRef>
+                        <a:effectRef idx="0">
+                          <a:schemeClr val="accent1"/>
+                        </a:effectRef>
+                        <a:fontRef idx="minor">
+                          <a:schemeClr val="tx1"/>
+                        </a:fontRef>
+                      </wps:style>
+                      <wps:bodyPr/>
+                    </wps:wsp>
+                  </a:graphicData>
+                </a:graphic>
+              </wp:anchor>
+            </w:drawing>
+          </mc:Choice>
+          <mc:Fallback>
+            <w:pict>
+              <v:shape w14:anchorId="1E0C253B" id="Conector de Seta Reta 128" o:spid="_x0000_s1026" type="#_x0000_t32" style="position:absolute;margin-left:132pt;margin-top:51.45pt;width:65.25pt;height:5.25pt;flip:x y;z-index:251688960;visibility:visible;mso-wrap-style:square;mso-wrap-distance-left:9pt;mso-wrap-distance-top:0;mso-wrap-distance-right:9pt;mso-wrap-distance-bottom:0;mso-position-horizontal:absolute;mso-position-horizontal-relative:text;mso-position-vertical:absolute;mso-position-vertical-relative:text" o:gfxdata="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" strokecolor="#4472c4 [3204]" strokeweight=".5pt">
+                <v:stroke endarrow="block" joinstyle="miter"/>
+              </v:shape>
+            </w:pict>
+          </mc:Fallback>
+        </mc:AlternateContent>
+      </w:r>
+      <w:r>
+        <w:rPr>
+          <w:noProof/>
+        </w:rPr>
+        <mc:AlternateContent>
+          <mc:Choice Requires="wps">
+            <w:drawing>
+              <wp:anchor distT="0" distB="0" distL="114300" distR="114300" simplePos="0" relativeHeight="251687936" behindDoc="0" locked="0" layoutInCell="1" allowOverlap="1" wp14:anchorId="55B83290" wp14:editId="76C958AF">
+                <wp:simplePos x="0" y="0"/>
+                <wp:positionH relativeFrom="column">
+                  <wp:posOffset>1743075</wp:posOffset>
+                </wp:positionH>
+                <wp:positionV relativeFrom="paragraph">
+                  <wp:posOffset>234315</wp:posOffset>
+                </wp:positionV>
+                <wp:extent cx="1104900" cy="228600"/>
+                <wp:effectExtent l="38100" t="0" r="19050" b="76200"/>
+                <wp:wrapNone/>
+                <wp:docPr id="127" name="Conector de Seta Reta 127"/>
+                <wp:cNvGraphicFramePr/>
+                <a:graphic xmlns:a="http://schemas.openxmlformats.org/drawingml/2006/main">
+                  <a:graphicData uri="http://schemas.microsoft.com/office/word/2010/wordprocessingShape">
+                    <wps:wsp>
+                      <wps:cNvCnPr/>
+                      <wps:spPr>
+                        <a:xfrm flipH="1">
+                          <a:off x="0" y="0"/>
+                          <a:ext cx="1104900" cy="228600"/>
+                        </a:xfrm>
+                        <a:prstGeom prst="straightConnector1">
+                          <a:avLst/>
+                        </a:prstGeom>
+                        <a:ln>
+                          <a:tailEnd type="triangle"/>
+                        </a:ln>
+                      </wps:spPr>
+                      <wps:style>
+                        <a:lnRef idx="1">
+                          <a:schemeClr val="accent1"/>
+                        </a:lnRef>
+                        <a:fillRef idx="0">
+                          <a:schemeClr val="accent1"/>
+                        </a:fillRef>
+                        <a:effectRef idx="0">
+                          <a:schemeClr val="accent1"/>
+                        </a:effectRef>
+                        <a:fontRef idx="minor">
+                          <a:schemeClr val="tx1"/>
+                        </a:fontRef>
+                      </wps:style>
+                      <wps:bodyPr/>
+                    </wps:wsp>
+                  </a:graphicData>
+                </a:graphic>
+              </wp:anchor>
+            </w:drawing>
+          </mc:Choice>
+          <mc:Fallback>
+            <w:pict>
+              <v:shape w14:anchorId="74FD9C0A" id="Conector de Seta Reta 127" o:spid="_x0000_s1026" type="#_x0000_t32" style="position:absolute;margin-left:137.25pt;margin-top:18.45pt;width:87pt;height:18pt;flip:x;z-index:251687936;visibility:visible;mso-wrap-style:square;mso-wrap-distance-left:9pt;mso-wrap-distance-top:0;mso-wrap-distance-right:9pt;mso-wrap-distance-bottom:0;mso-position-horizontal:absolute;mso-position-horizontal-relative:text;mso-position-vertical:absolute;mso-position-vertical-relative:text" o:gfxdata="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" strokecolor="#4472c4 [3204]" strokeweight=".5pt">
+                <v:stroke endarrow="block" joinstyle="miter"/>
+              </v:shape>
+            </w:pict>
+          </mc:Fallback>
+        </mc:AlternateContent>
+      </w:r>
+      <w:r>
+        <w:rPr>
+          <w:noProof/>
+        </w:rPr>
+        <mc:AlternateContent>
+          <mc:Choice Requires="wps">
+            <w:drawing>
+              <wp:anchor distT="0" distB="0" distL="114300" distR="114300" simplePos="0" relativeHeight="251686912" behindDoc="0" locked="0" layoutInCell="1" allowOverlap="1" wp14:anchorId="0210CB04" wp14:editId="4D513168">
+                <wp:simplePos x="0" y="0"/>
+                <wp:positionH relativeFrom="column">
+                  <wp:posOffset>1657350</wp:posOffset>
+                </wp:positionH>
+                <wp:positionV relativeFrom="paragraph">
+                  <wp:posOffset>1043940</wp:posOffset>
+                </wp:positionV>
+                <wp:extent cx="1247775" cy="485775"/>
+                <wp:effectExtent l="38100" t="0" r="28575" b="66675"/>
+                <wp:wrapNone/>
+                <wp:docPr id="126" name="Conector de Seta Reta 126"/>
+                <wp:cNvGraphicFramePr/>
+                <a:graphic xmlns:a="http://schemas.openxmlformats.org/drawingml/2006/main">
+                  <a:graphicData uri="http://schemas.microsoft.com/office/word/2010/wordprocessingShape">
+                    <wps:wsp>
+                      <wps:cNvCnPr/>
+                      <wps:spPr>
+                        <a:xfrm flipH="1">
+                          <a:off x="0" y="0"/>
+                          <a:ext cx="1247775" cy="485775"/>
+                        </a:xfrm>
+                        <a:prstGeom prst="straightConnector1">
+                          <a:avLst/>
+                        </a:prstGeom>
+                        <a:ln>
+                          <a:tailEnd type="triangle"/>
+                        </a:ln>
+                      </wps:spPr>
+                      <wps:style>
+                        <a:lnRef idx="1">
+                          <a:schemeClr val="accent1"/>
+                        </a:lnRef>
+                        <a:fillRef idx="0">
+                          <a:schemeClr val="accent1"/>
+                        </a:fillRef>
+                        <a:effectRef idx="0">
+                          <a:schemeClr val="accent1"/>
+                        </a:effectRef>
+                        <a:fontRef idx="minor">
+                          <a:schemeClr val="tx1"/>
+                        </a:fontRef>
+                      </wps:style>
+                      <wps:bodyPr/>
+                    </wps:wsp>
+                  </a:graphicData>
+                </a:graphic>
+              </wp:anchor>
+            </w:drawing>
+          </mc:Choice>
+          <mc:Fallback>
+            <w:pict>
+              <v:shape w14:anchorId="3A8DADA0" id="Conector de Seta Reta 126" o:spid="_x0000_s1026" type="#_x0000_t32" style="position:absolute;margin-left:130.5pt;margin-top:82.2pt;width:98.25pt;height:38.25pt;flip:x;z-index:251686912;visibility:visible;mso-wrap-style:square;mso-wrap-distance-left:9pt;mso-wrap-distance-top:0;mso-wrap-distance-right:9pt;mso-wrap-distance-bottom:0;mso-position-horizontal:absolute;mso-position-horizontal-relative:text;mso-position-vertical:absolute;mso-position-vertical-relative:text" o:gfxdata="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" strokecolor="#4472c4 [3204]" strokeweight=".5pt">
+                <v:stroke endarrow="block" joinstyle="miter"/>
+              </v:shape>
+            </w:pict>
+          </mc:Fallback>
+        </mc:AlternateContent>
+      </w:r>
+      <w:r>
+        <w:drawing>
+          <wp:inline distT="0" distB="0" distL="0" distR="0" wp14:anchorId="4E0B6321" wp14:editId="25E6D509">
+            <wp:extent cx="2438740" cy="2143424"/>
+            <wp:effectExtent l="0" t="0" r="0" b="9525"/>
+            <wp:docPr id="125" name="Imagem 125"/>
+            <wp:cNvGraphicFramePr>
+              <a:graphicFrameLocks xmlns:a="http://schemas.openxmlformats.org/drawingml/2006/main" noChangeAspect="1"/>
+            </wp:cNvGraphicFramePr>
+            <a:graphic xmlns:a="http://schemas.openxmlformats.org/drawingml/2006/main">
+              <a:graphicData uri="http://schemas.openxmlformats.org/drawingml/2006/picture">
+                <pic:pic xmlns:pic="http://schemas.openxmlformats.org/drawingml/2006/picture">
+                  <pic:nvPicPr>
+                    <pic:cNvPr id="1" name=""/>
+                    <pic:cNvPicPr/>
+                  </pic:nvPicPr>
+                  <pic:blipFill>
+                    <a:blip r:embed="rId108"/>
+                    <a:stretch>
+                      <a:fillRect/>
+                    </a:stretch>
+                  </pic:blipFill>
+                  <pic:spPr>
+                    <a:xfrm>
+                      <a:off x="0" y="0"/>
+                      <a:ext cx="2438740" cy="2143424"/>
+                    </a:xfrm>
+                    <a:prstGeom prst="rect">
+                      <a:avLst/>
+                    </a:prstGeom>
+                  </pic:spPr>
+                </pic:pic>
+              </a:graphicData>
+            </a:graphic>
+          </wp:inline>
+        </w:drawing>
+      </w:r>
+      <w:r>
+        <w:drawing>
+          <wp:inline distT="0" distB="0" distL="0" distR="0" wp14:anchorId="5A21DFA5" wp14:editId="384308F3">
+            <wp:extent cx="3728545" cy="2162007"/>
+            <wp:effectExtent l="0" t="0" r="5715" b="0"/>
+            <wp:docPr id="130" name="Imagem 130"/>
+            <wp:cNvGraphicFramePr>
+              <a:graphicFrameLocks xmlns:a="http://schemas.openxmlformats.org/drawingml/2006/main" noChangeAspect="1"/>
+            </wp:cNvGraphicFramePr>
+            <a:graphic xmlns:a="http://schemas.openxmlformats.org/drawingml/2006/main">
+              <a:graphicData uri="http://schemas.openxmlformats.org/drawingml/2006/picture">
+                <pic:pic xmlns:pic="http://schemas.openxmlformats.org/drawingml/2006/picture">
+                  <pic:nvPicPr>
+                    <pic:cNvPr id="1" name=""/>
+                    <pic:cNvPicPr/>
+                  </pic:nvPicPr>
+                  <pic:blipFill>
+                    <a:blip r:embed="rId109"/>
+                    <a:stretch>
+                      <a:fillRect/>
+                    </a:stretch>
+                  </pic:blipFill>
+                  <pic:spPr>
+                    <a:xfrm>
+                      <a:off x="0" y="0"/>
+                      <a:ext cx="3795275" cy="2200700"/>
+                    </a:xfrm>
+                    <a:prstGeom prst="rect">
+                      <a:avLst/>
+                    </a:prstGeom>
+                  </pic:spPr>
+                </pic:pic>
+              </a:graphicData>
+            </a:graphic>
+          </wp:inline>
+        </w:drawing>
+      </w:r>
+    </w:p>
+    <w:p>
+      <w:r>
+        <w:t xml:space="preserve">63- </w:t>
+      </w:r>
+      <w:r>
+        <w:t>Incluímos uma porcentagem de 50% para cada input do nosso Formulário.</w:t>
+      </w:r>
+    </w:p>
+    <w:p>
+      <w:r>
+        <w:drawing>
+          <wp:inline distT="0" distB="0" distL="0" distR="0" wp14:anchorId="6CB1A6BB" wp14:editId="6E132C1C">
+            <wp:extent cx="3051643" cy="1438275"/>
+            <wp:effectExtent l="0" t="0" r="0" b="0"/>
+            <wp:docPr id="131" name="Imagem 131"/>
+            <wp:cNvGraphicFramePr>
+              <a:graphicFrameLocks xmlns:a="http://schemas.openxmlformats.org/drawingml/2006/main" noChangeAspect="1"/>
+            </wp:cNvGraphicFramePr>
+            <a:graphic xmlns:a="http://schemas.openxmlformats.org/drawingml/2006/main">
+              <a:graphicData uri="http://schemas.openxmlformats.org/drawingml/2006/picture">
+                <pic:pic xmlns:pic="http://schemas.openxmlformats.org/drawingml/2006/picture">
+                  <pic:nvPicPr>
+                    <pic:cNvPr id="1" name=""/>
+                    <pic:cNvPicPr/>
+                  </pic:nvPicPr>
+                  <pic:blipFill>
+                    <a:blip r:embed="rId110"/>
+                    <a:stretch>
+                      <a:fillRect/>
+                    </a:stretch>
+                  </pic:blipFill>
+                  <pic:spPr>
+                    <a:xfrm>
+                      <a:off x="0" y="0"/>
+                      <a:ext cx="3058536" cy="1441524"/>
+                    </a:xfrm>
+                    <a:prstGeom prst="rect">
+                      <a:avLst/>
+                    </a:prstGeom>
+                  </pic:spPr>
+                </pic:pic>
+              </a:graphicData>
+            </a:graphic>
+          </wp:inline>
+        </w:drawing>
+      </w:r>
+      <w:r>
+        <w:drawing>
+          <wp:inline distT="0" distB="0" distL="0" distR="0" wp14:anchorId="43F89EC5" wp14:editId="41FE3DD3">
+            <wp:extent cx="3034666" cy="1428750"/>
+            <wp:effectExtent l="0" t="0" r="0" b="0"/>
+            <wp:docPr id="132" name="Imagem 132"/>
+            <wp:cNvGraphicFramePr>
+              <a:graphicFrameLocks xmlns:a="http://schemas.openxmlformats.org/drawingml/2006/main" noChangeAspect="1"/>
+            </wp:cNvGraphicFramePr>
+            <a:graphic xmlns:a="http://schemas.openxmlformats.org/drawingml/2006/main">
+              <a:graphicData uri="http://schemas.openxmlformats.org/drawingml/2006/picture">
+                <pic:pic xmlns:pic="http://schemas.openxmlformats.org/drawingml/2006/picture">
+                  <pic:nvPicPr>
+                    <pic:cNvPr id="1" name=""/>
+                    <pic:cNvPicPr/>
+                  </pic:nvPicPr>
+                  <pic:blipFill>
+                    <a:blip r:embed="rId111"/>
+                    <a:stretch>
+                      <a:fillRect/>
+                    </a:stretch>
+                  </pic:blipFill>
+                  <pic:spPr>
+                    <a:xfrm>
+                      <a:off x="0" y="0"/>
+                      <a:ext cx="3053174" cy="1437464"/>
+                    </a:xfrm>
+                    <a:prstGeom prst="rect">
+                      <a:avLst/>
+                    </a:prstGeom>
+                  </pic:spPr>
+                </pic:pic>
+              </a:graphicData>
+            </a:graphic>
+          </wp:inline>
+        </w:drawing>
+      </w:r>
+      <w:r>
+        <w:t xml:space="preserve"> </w:t>
+      </w:r>
+    </w:p>
+    <w:p>
+      <w:r>
+        <w:t xml:space="preserve">64 – Inserimos um </w:t>
+      </w:r>
+      <w:proofErr w:type="spellStart"/>
+      <w:proofErr w:type="gramStart"/>
+      <w:r>
+        <w:t>textarea</w:t>
+      </w:r>
+      <w:proofErr w:type="spellEnd"/>
+      <w:r>
+        <w:t>(</w:t>
+      </w:r>
+      <w:proofErr w:type="gramEnd"/>
+      <w:r>
+        <w:t xml:space="preserve">inputs de mensagem) em baixo do input telefone </w:t>
+      </w:r>
+      <w:r>
+        <w:t>e aumentamos o tamanho da coluna para ficar alinhada com os outros inputs.</w:t>
+      </w:r>
+    </w:p>
+    <w:p>
+      <w:r>
+        <w:rPr>
+          <w:noProof/>
+        </w:rPr>
+        <mc:AlternateContent>
+          <mc:Choice Requires="wps">
+            <w:drawing>
+              <wp:anchor distT="0" distB="0" distL="114300" distR="114300" simplePos="0" relativeHeight="251691008" behindDoc="0" locked="0" layoutInCell="1" allowOverlap="1" wp14:anchorId="26FC6127" wp14:editId="6E3E8C1D">
+                <wp:simplePos x="0" y="0"/>
+                <wp:positionH relativeFrom="column">
+                  <wp:posOffset>114300</wp:posOffset>
+                </wp:positionH>
+                <wp:positionV relativeFrom="paragraph">
+                  <wp:posOffset>674370</wp:posOffset>
+                </wp:positionV>
+                <wp:extent cx="295275" cy="285750"/>
+                <wp:effectExtent l="0" t="0" r="66675" b="57150"/>
+                <wp:wrapNone/>
+                <wp:docPr id="135" name="Conector de Seta Reta 135"/>
+                <wp:cNvGraphicFramePr/>
+                <a:graphic xmlns:a="http://schemas.openxmlformats.org/drawingml/2006/main">
+                  <a:graphicData uri="http://schemas.microsoft.com/office/word/2010/wordprocessingShape">
+                    <wps:wsp>
+                      <wps:cNvCnPr/>
+                      <wps:spPr>
+                        <a:xfrm>
+                          <a:off x="0" y="0"/>
+                          <a:ext cx="295275" cy="285750"/>
+                        </a:xfrm>
+                        <a:prstGeom prst="straightConnector1">
+                          <a:avLst/>
+                        </a:prstGeom>
+                        <a:ln>
+                          <a:tailEnd type="triangle"/>
+                        </a:ln>
+                      </wps:spPr>
+                      <wps:style>
+                        <a:lnRef idx="1">
+                          <a:schemeClr val="accent2"/>
+                        </a:lnRef>
+                        <a:fillRef idx="0">
+                          <a:schemeClr val="accent2"/>
+                        </a:fillRef>
+                        <a:effectRef idx="0">
+                          <a:schemeClr val="accent2"/>
+                        </a:effectRef>
+                        <a:fontRef idx="minor">
+                          <a:schemeClr val="tx1"/>
+                        </a:fontRef>
+                      </wps:style>
+                      <wps:bodyPr/>
+                    </wps:wsp>
+                  </a:graphicData>
+                </a:graphic>
+              </wp:anchor>
+            </w:drawing>
+          </mc:Choice>
+          <mc:Fallback>
+            <w:pict>
+              <v:shape w14:anchorId="769C3514" id="Conector de Seta Reta 135" o:spid="_x0000_s1026" type="#_x0000_t32" style="position:absolute;margin-left:9pt;margin-top:53.1pt;width:23.25pt;height:22.5pt;z-index:251691008;visibility:visible;mso-wrap-style:square;mso-wrap-distance-left:9pt;mso-wrap-distance-top:0;mso-wrap-distance-right:9pt;mso-wrap-distance-bottom:0;mso-position-horizontal:absolute;mso-position-horizontal-relative:text;mso-position-vertical:absolute;mso-position-vertical-relative:text" o:gfxdata="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" strokecolor="#ed7d31 [3205]" strokeweight=".5pt">
+                <v:stroke endarrow="block" joinstyle="miter"/>
+              </v:shape>
+            </w:pict>
+          </mc:Fallback>
+        </mc:AlternateContent>
+      </w:r>
+      <w:r>
+        <w:drawing>
+          <wp:inline distT="0" distB="0" distL="0" distR="0" wp14:anchorId="61615A8D" wp14:editId="4CD63970">
+            <wp:extent cx="5782482" cy="1409897"/>
+            <wp:effectExtent l="0" t="0" r="0" b="0"/>
+            <wp:docPr id="133" name="Imagem 133"/>
+            <wp:cNvGraphicFramePr>
+              <a:graphicFrameLocks xmlns:a="http://schemas.openxmlformats.org/drawingml/2006/main" noChangeAspect="1"/>
+            </wp:cNvGraphicFramePr>
+            <a:graphic xmlns:a="http://schemas.openxmlformats.org/drawingml/2006/main">
+              <a:graphicData uri="http://schemas.openxmlformats.org/drawingml/2006/picture">
+                <pic:pic xmlns:pic="http://schemas.openxmlformats.org/drawingml/2006/picture">
+                  <pic:nvPicPr>
+                    <pic:cNvPr id="1" name=""/>
+                    <pic:cNvPicPr/>
+                  </pic:nvPicPr>
+                  <pic:blipFill>
+                    <a:blip r:embed="rId112"/>
+                    <a:stretch>
+                      <a:fillRect/>
+                    </a:stretch>
+                  </pic:blipFill>
+                  <pic:spPr>
+                    <a:xfrm>
+                      <a:off x="0" y="0"/>
+                      <a:ext cx="5782482" cy="1409897"/>
+                    </a:xfrm>
+                    <a:prstGeom prst="rect">
+                      <a:avLst/>
+                    </a:prstGeom>
+                  </pic:spPr>
+                </pic:pic>
+              </a:graphicData>
+            </a:graphic>
+          </wp:inline>
+        </w:drawing>
+      </w:r>
+    </w:p>
+    <w:p>
+      <w:r>
+        <w:drawing>
+          <wp:inline distT="0" distB="0" distL="0" distR="0" wp14:anchorId="2BA4C9D3" wp14:editId="6BDF61C4">
+            <wp:extent cx="3848637" cy="3448531"/>
+            <wp:effectExtent l="0" t="0" r="0" b="0"/>
+            <wp:docPr id="136" name="Imagem 136"/>
+            <wp:cNvGraphicFramePr>
+              <a:graphicFrameLocks xmlns:a="http://schemas.openxmlformats.org/drawingml/2006/main" noChangeAspect="1"/>
+            </wp:cNvGraphicFramePr>
+            <a:graphic xmlns:a="http://schemas.openxmlformats.org/drawingml/2006/main">
+              <a:graphicData uri="http://schemas.openxmlformats.org/drawingml/2006/picture">
+                <pic:pic xmlns:pic="http://schemas.openxmlformats.org/drawingml/2006/picture">
+                  <pic:nvPicPr>
+                    <pic:cNvPr id="1" name=""/>
+                    <pic:cNvPicPr/>
+                  </pic:nvPicPr>
+                  <pic:blipFill>
+                    <a:blip r:embed="rId113"/>
+                    <a:stretch>
+                      <a:fillRect/>
+                    </a:stretch>
+                  </pic:blipFill>
+                  <pic:spPr>
+                    <a:xfrm>
+                      <a:off x="0" y="0"/>
+                      <a:ext cx="3848637" cy="3448531"/>
+                    </a:xfrm>
+                    <a:prstGeom prst="rect">
+                      <a:avLst/>
+                    </a:prstGeom>
+                  </pic:spPr>
+                </pic:pic>
+              </a:graphicData>
+            </a:graphic>
+          </wp:inline>
+        </w:drawing>
+      </w:r>
+    </w:p>
+    <w:p>
+      <w:r>
+        <w:t xml:space="preserve">65 </w:t>
+      </w:r>
+      <w:r>
+        <w:t>–</w:t>
+      </w:r>
+      <w:r>
+        <w:t xml:space="preserve"> </w:t>
+      </w:r>
+      <w:r>
+        <w:t xml:space="preserve">Trabalhando com o input radio em nosso formulário inserimos os </w:t>
+      </w:r>
+      <w:proofErr w:type="spellStart"/>
+      <w:r>
+        <w:t>label</w:t>
+      </w:r>
+      <w:proofErr w:type="spellEnd"/>
+      <w:r>
+        <w:t xml:space="preserve"> e os input radio conforme código a baixo, transformamos que somente uma opção pode ser escolhida utilizando o mesmo nome na palavra </w:t>
+      </w:r>
+      <w:proofErr w:type="spellStart"/>
+      <w:r>
+        <w:t>name</w:t>
+      </w:r>
+      <w:proofErr w:type="spellEnd"/>
+      <w:r>
+        <w:t xml:space="preserve"> do código.</w:t>
+      </w:r>
+    </w:p>
+    <w:p>
+      <w:r>
+        <w:rPr>
+          <w:noProof/>
+        </w:rPr>
+        <mc:AlternateContent>
+          <mc:Choice Requires="wps">
+            <w:drawing>
+              <wp:anchor distT="0" distB="0" distL="114300" distR="114300" simplePos="0" relativeHeight="251694080" behindDoc="0" locked="0" layoutInCell="1" allowOverlap="1" wp14:anchorId="4230ED32" wp14:editId="25754F7D">
+                <wp:simplePos x="0" y="0"/>
+                <wp:positionH relativeFrom="column">
+                  <wp:posOffset>2952750</wp:posOffset>
+                </wp:positionH>
+                <wp:positionV relativeFrom="paragraph">
+                  <wp:posOffset>2620010</wp:posOffset>
+                </wp:positionV>
+                <wp:extent cx="1847850" cy="66675"/>
+                <wp:effectExtent l="19050" t="76200" r="19050" b="28575"/>
+                <wp:wrapNone/>
+                <wp:docPr id="140" name="Conector de Seta Reta 140"/>
+                <wp:cNvGraphicFramePr/>
+                <a:graphic xmlns:a="http://schemas.openxmlformats.org/drawingml/2006/main">
+                  <a:graphicData uri="http://schemas.microsoft.com/office/word/2010/wordprocessingShape">
+                    <wps:wsp>
+                      <wps:cNvCnPr/>
+                      <wps:spPr>
+                        <a:xfrm flipH="1" flipV="1">
+                          <a:off x="0" y="0"/>
+                          <a:ext cx="1847850" cy="66675"/>
+                        </a:xfrm>
+                        <a:prstGeom prst="straightConnector1">
+                          <a:avLst/>
+                        </a:prstGeom>
+                        <a:ln>
+                          <a:tailEnd type="triangle"/>
+                        </a:ln>
+                      </wps:spPr>
+                      <wps:style>
+                        <a:lnRef idx="1">
+                          <a:schemeClr val="accent1"/>
+                        </a:lnRef>
+                        <a:fillRef idx="0">
+                          <a:schemeClr val="accent1"/>
+                        </a:fillRef>
+                        <a:effectRef idx="0">
+                          <a:schemeClr val="accent1"/>
+                        </a:effectRef>
+                        <a:fontRef idx="minor">
+                          <a:schemeClr val="tx1"/>
+                        </a:fontRef>
+                      </wps:style>
+                      <wps:bodyPr/>
+                    </wps:wsp>
+                  </a:graphicData>
+                </a:graphic>
+              </wp:anchor>
+            </w:drawing>
+          </mc:Choice>
+          <mc:Fallback>
+            <w:pict>
+              <v:shape w14:anchorId="13DA1400" id="Conector de Seta Reta 140" o:spid="_x0000_s1026" type="#_x0000_t32" style="position:absolute;margin-left:232.5pt;margin-top:206.3pt;width:145.5pt;height:5.25pt;flip:x y;z-index:251694080;visibility:visible;mso-wrap-style:square;mso-wrap-distance-left:9pt;mso-wrap-distance-top:0;mso-wrap-distance-right:9pt;mso-wrap-distance-bottom:0;mso-position-horizontal:absolute;mso-position-horizontal-relative:text;mso-position-vertical:absolute;mso-position-vertical-relative:text" o:gfxdata="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" strokecolor="#4472c4 [3204]" strokeweight=".5pt">
+                <v:stroke endarrow="block" joinstyle="miter"/>
+              </v:shape>
+            </w:pict>
+          </mc:Fallback>
+        </mc:AlternateContent>
+      </w:r>
+      <w:r>
+        <w:rPr>
+          <w:noProof/>
+        </w:rPr>
+        <mc:AlternateContent>
+          <mc:Choice Requires="wps">
+            <w:drawing>
+              <wp:anchor distT="0" distB="0" distL="114300" distR="114300" simplePos="0" relativeHeight="251693056" behindDoc="0" locked="0" layoutInCell="1" allowOverlap="1" wp14:anchorId="6D74B3D8" wp14:editId="5F813137">
+                <wp:simplePos x="0" y="0"/>
+                <wp:positionH relativeFrom="column">
+                  <wp:posOffset>2867025</wp:posOffset>
+                </wp:positionH>
+                <wp:positionV relativeFrom="paragraph">
+                  <wp:posOffset>2191385</wp:posOffset>
+                </wp:positionV>
+                <wp:extent cx="2638425" cy="9525"/>
+                <wp:effectExtent l="19050" t="57150" r="0" b="85725"/>
+                <wp:wrapNone/>
+                <wp:docPr id="139" name="Conector de Seta Reta 139"/>
+                <wp:cNvGraphicFramePr/>
+                <a:graphic xmlns:a="http://schemas.openxmlformats.org/drawingml/2006/main">
+                  <a:graphicData uri="http://schemas.microsoft.com/office/word/2010/wordprocessingShape">
+                    <wps:wsp>
+                      <wps:cNvCnPr/>
+                      <wps:spPr>
+                        <a:xfrm flipH="1">
+                          <a:off x="0" y="0"/>
+                          <a:ext cx="2638425" cy="9525"/>
+                        </a:xfrm>
+                        <a:prstGeom prst="straightConnector1">
+                          <a:avLst/>
+                        </a:prstGeom>
+                        <a:ln>
+                          <a:tailEnd type="triangle"/>
+                        </a:ln>
+                      </wps:spPr>
+                      <wps:style>
+                        <a:lnRef idx="1">
+                          <a:schemeClr val="accent2"/>
+                        </a:lnRef>
+                        <a:fillRef idx="0">
+                          <a:schemeClr val="accent2"/>
+                        </a:fillRef>
+                        <a:effectRef idx="0">
+                          <a:schemeClr val="accent2"/>
+                        </a:effectRef>
+                        <a:fontRef idx="minor">
+                          <a:schemeClr val="tx1"/>
+                        </a:fontRef>
+                      </wps:style>
+                      <wps:bodyPr/>
+                    </wps:wsp>
+                  </a:graphicData>
+                </a:graphic>
+              </wp:anchor>
+            </w:drawing>
+          </mc:Choice>
+          <mc:Fallback>
+            <w:pict>
+              <v:shape w14:anchorId="7EF386E1" id="Conector de Seta Reta 139" o:spid="_x0000_s1026" type="#_x0000_t32" style="position:absolute;margin-left:225.75pt;margin-top:172.55pt;width:207.75pt;height:.75pt;flip:x;z-index:251693056;visibility:visible;mso-wrap-style:square;mso-wrap-distance-left:9pt;mso-wrap-distance-top:0;mso-wrap-distance-right:9pt;mso-wrap-distance-bottom:0;mso-position-horizontal:absolute;mso-position-horizontal-relative:text;mso-position-vertical:absolute;mso-position-vertical-relative:text" o:gfxdata="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" strokecolor="#ed7d31 [3205]" strokeweight=".5pt">
+                <v:stroke endarrow="block" joinstyle="miter"/>
+              </v:shape>
+            </w:pict>
+          </mc:Fallback>
+        </mc:AlternateContent>
+      </w:r>
+      <w:r>
+        <w:rPr>
+          <w:noProof/>
+        </w:rPr>
+        <mc:AlternateContent>
+          <mc:Choice Requires="wps">
+            <w:drawing>
+              <wp:anchor distT="0" distB="0" distL="114300" distR="114300" simplePos="0" relativeHeight="251692032" behindDoc="0" locked="0" layoutInCell="1" allowOverlap="1" wp14:anchorId="299DF55A" wp14:editId="43A8BA77">
+                <wp:simplePos x="0" y="0"/>
+                <wp:positionH relativeFrom="column">
+                  <wp:posOffset>2466975</wp:posOffset>
+                </wp:positionH>
+                <wp:positionV relativeFrom="paragraph">
+                  <wp:posOffset>1800860</wp:posOffset>
+                </wp:positionV>
+                <wp:extent cx="3400425" cy="28575"/>
+                <wp:effectExtent l="38100" t="38100" r="28575" b="85725"/>
+                <wp:wrapNone/>
+                <wp:docPr id="138" name="Conector de Seta Reta 138"/>
+                <wp:cNvGraphicFramePr/>
+                <a:graphic xmlns:a="http://schemas.openxmlformats.org/drawingml/2006/main">
+                  <a:graphicData uri="http://schemas.microsoft.com/office/word/2010/wordprocessingShape">
+                    <wps:wsp>
+                      <wps:cNvCnPr/>
+                      <wps:spPr>
+                        <a:xfrm flipH="1">
+                          <a:off x="0" y="0"/>
+                          <a:ext cx="3400425" cy="28575"/>
+                        </a:xfrm>
+                        <a:prstGeom prst="straightConnector1">
+                          <a:avLst/>
+                        </a:prstGeom>
+                        <a:ln>
+                          <a:tailEnd type="triangle"/>
+                        </a:ln>
+                      </wps:spPr>
+                      <wps:style>
+                        <a:lnRef idx="1">
+                          <a:schemeClr val="accent2"/>
+                        </a:lnRef>
+                        <a:fillRef idx="0">
+                          <a:schemeClr val="accent2"/>
+                        </a:fillRef>
+                        <a:effectRef idx="0">
+                          <a:schemeClr val="accent2"/>
+                        </a:effectRef>
+                        <a:fontRef idx="minor">
+                          <a:schemeClr val="tx1"/>
+                        </a:fontRef>
+                      </wps:style>
+                      <wps:bodyPr/>
+                    </wps:wsp>
+                  </a:graphicData>
+                </a:graphic>
+              </wp:anchor>
+            </w:drawing>
+          </mc:Choice>
+          <mc:Fallback>
+            <w:pict>
+              <v:shape w14:anchorId="53AD9519" id="Conector de Seta Reta 138" o:spid="_x0000_s1026" type="#_x0000_t32" style="position:absolute;margin-left:194.25pt;margin-top:141.8pt;width:267.75pt;height:2.25pt;flip:x;z-index:251692032;visibility:visible;mso-wrap-style:square;mso-wrap-distance-left:9pt;mso-wrap-distance-top:0;mso-wrap-distance-right:9pt;mso-wrap-distance-bottom:0;mso-position-horizontal:absolute;mso-position-horizontal-relative:text;mso-position-vertical:absolute;mso-position-vertical-relative:text" o:gfxdata="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" strokecolor="#ed7d31 [3205]" strokeweight=".5pt">
+                <v:stroke endarrow="block" joinstyle="miter"/>
+              </v:shape>
+            </w:pict>
+          </mc:Fallback>
+        </mc:AlternateContent>
+      </w:r>
+      <w:r>
+        <w:drawing>
+          <wp:inline distT="0" distB="0" distL="0" distR="0" wp14:anchorId="16BA6AE8" wp14:editId="08A408E5">
+            <wp:extent cx="5792008" cy="3124636"/>
+            <wp:effectExtent l="0" t="0" r="0" b="0"/>
+            <wp:docPr id="137" name="Imagem 137"/>
+            <wp:cNvGraphicFramePr>
+              <a:graphicFrameLocks xmlns:a="http://schemas.openxmlformats.org/drawingml/2006/main" noChangeAspect="1"/>
+            </wp:cNvGraphicFramePr>
+            <a:graphic xmlns:a="http://schemas.openxmlformats.org/drawingml/2006/main">
+              <a:graphicData uri="http://schemas.openxmlformats.org/drawingml/2006/picture">
+                <pic:pic xmlns:pic="http://schemas.openxmlformats.org/drawingml/2006/picture">
+                  <pic:nvPicPr>
+                    <pic:cNvPr id="1" name=""/>
+                    <pic:cNvPicPr/>
+                  </pic:nvPicPr>
+                  <pic:blipFill>
+                    <a:blip r:embed="rId114"/>
+                    <a:stretch>
+                      <a:fillRect/>
+                    </a:stretch>
+                  </pic:blipFill>
+                  <pic:spPr>
+                    <a:xfrm>
+                      <a:off x="0" y="0"/>
+                      <a:ext cx="5792008" cy="3124636"/>
+                    </a:xfrm>
+                    <a:prstGeom prst="rect">
+                      <a:avLst/>
+                    </a:prstGeom>
+                  </pic:spPr>
+                </pic:pic>
+              </a:graphicData>
+            </a:graphic>
+          </wp:inline>
+        </w:drawing>
+      </w:r>
+      <w:r>
+        <w:drawing>
+          <wp:inline distT="0" distB="0" distL="0" distR="0" wp14:anchorId="1DC0AA0A" wp14:editId="034805F9">
+            <wp:extent cx="2362530" cy="1181265"/>
+            <wp:effectExtent l="0" t="0" r="0" b="0"/>
+            <wp:docPr id="141" name="Imagem 141"/>
+            <wp:cNvGraphicFramePr>
+              <a:graphicFrameLocks xmlns:a="http://schemas.openxmlformats.org/drawingml/2006/main" noChangeAspect="1"/>
+            </wp:cNvGraphicFramePr>
+            <a:graphic xmlns:a="http://schemas.openxmlformats.org/drawingml/2006/main">
+              <a:graphicData uri="http://schemas.openxmlformats.org/drawingml/2006/picture">
+                <pic:pic xmlns:pic="http://schemas.openxmlformats.org/drawingml/2006/picture">
+                  <pic:nvPicPr>
+                    <pic:cNvPr id="1" name=""/>
+                    <pic:cNvPicPr/>
+                  </pic:nvPicPr>
+                  <pic:blipFill>
+                    <a:blip r:embed="rId115"/>
+                    <a:stretch>
+                      <a:fillRect/>
+                    </a:stretch>
+                  </pic:blipFill>
+                  <pic:spPr>
+                    <a:xfrm>
+                      <a:off x="0" y="0"/>
+                      <a:ext cx="2362530" cy="1181265"/>
+                    </a:xfrm>
+                    <a:prstGeom prst="rect">
+                      <a:avLst/>
+                    </a:prstGeom>
+                  </pic:spPr>
+                </pic:pic>
+              </a:graphicData>
+            </a:graphic>
+          </wp:inline>
+        </w:drawing>
+      </w:r>
+    </w:p>
+    <w:p>
+      <w:r>
+        <w:rPr>
+          <w:noProof/>
+        </w:rPr>
+        <mc:AlternateContent>
+          <mc:Choice Requires="wps">
+            <w:drawing>
+              <wp:anchor distT="0" distB="0" distL="114300" distR="114300" simplePos="0" relativeHeight="251695104" behindDoc="0" locked="0" layoutInCell="1" allowOverlap="1" wp14:anchorId="11B1530B" wp14:editId="62BB8477">
+                <wp:simplePos x="0" y="0"/>
+                <wp:positionH relativeFrom="column">
+                  <wp:posOffset>-85725</wp:posOffset>
+                </wp:positionH>
+                <wp:positionV relativeFrom="paragraph">
+                  <wp:posOffset>75565</wp:posOffset>
+                </wp:positionV>
+                <wp:extent cx="428625" cy="371475"/>
+                <wp:effectExtent l="0" t="0" r="47625" b="47625"/>
+                <wp:wrapNone/>
+                <wp:docPr id="143" name="Conector de Seta Reta 143"/>
+                <wp:cNvGraphicFramePr/>
+                <a:graphic xmlns:a="http://schemas.openxmlformats.org/drawingml/2006/main">
+                  <a:graphicData uri="http://schemas.microsoft.com/office/word/2010/wordprocessingShape">
+                    <wps:wsp>
+                      <wps:cNvCnPr/>
+                      <wps:spPr>
+                        <a:xfrm>
+                          <a:off x="0" y="0"/>
+                          <a:ext cx="428625" cy="371475"/>
+                        </a:xfrm>
+                        <a:prstGeom prst="straightConnector1">
+                          <a:avLst/>
+                        </a:prstGeom>
+                        <a:ln>
+                          <a:tailEnd type="triangle"/>
+                        </a:ln>
+                      </wps:spPr>
+                      <wps:style>
+                        <a:lnRef idx="1">
+                          <a:schemeClr val="accent2"/>
+                        </a:lnRef>
+                        <a:fillRef idx="0">
+                          <a:schemeClr val="accent2"/>
+                        </a:fillRef>
+                        <a:effectRef idx="0">
+                          <a:schemeClr val="accent2"/>
+                        </a:effectRef>
+                        <a:fontRef idx="minor">
+                          <a:schemeClr val="tx1"/>
+                        </a:fontRef>
+                      </wps:style>
+                      <wps:bodyPr/>
+                    </wps:wsp>
+                  </a:graphicData>
+                </a:graphic>
+                <wp14:sizeRelH relativeFrom="margin">
+                  <wp14:pctWidth>0</wp14:pctWidth>
+                </wp14:sizeRelH>
+                <wp14:sizeRelV relativeFrom="margin">
+                  <wp14:pctHeight>0</wp14:pctHeight>
+                </wp14:sizeRelV>
+              </wp:anchor>
+            </w:drawing>
+          </mc:Choice>
+          <mc:Fallback>
+            <w:pict>
+              <v:shape w14:anchorId="6F794422" id="Conector de Seta Reta 143" o:spid="_x0000_s1026" type="#_x0000_t32" style="position:absolute;margin-left:-6.75pt;margin-top:5.95pt;width:33.75pt;height:29.25pt;z-index:251695104;visibility:visible;mso-wrap-style:square;mso-width-percent:0;mso-height-percent:0;mso-wrap-distance-left:9pt;mso-wrap-distance-top:0;mso-wrap-distance-right:9pt;mso-wrap-distance-bottom:0;mso-position-horizontal:absolute;mso-position-horizontal-relative:text;mso-position-vertical:absolute;mso-position-vertical-relative:text;mso-width-percent:0;mso-height-percent:0;mso-width-relative:margin;mso-height-relative:margin" o:gfxdata="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" strokecolor="#ed7d31 [3205]" strokeweight=".5pt">
+                <v:stroke endarrow="block" joinstyle="miter"/>
+              </v:shape>
+            </w:pict>
+          </mc:Fallback>
+        </mc:AlternateContent>
+      </w:r>
+      <w:r>
+        <w:t xml:space="preserve">66 – Inserimos um parágrafo em cima da </w:t>
+      </w:r>
+      <w:proofErr w:type="spellStart"/>
+      <w:r>
+        <w:t>label</w:t>
+      </w:r>
+      <w:proofErr w:type="spellEnd"/>
+      <w:r>
+        <w:t xml:space="preserve"> radio-box telefone.</w:t>
+      </w:r>
+    </w:p>
+    <w:p>
+      <w:r>
+        <w:drawing>
+          <wp:inline distT="0" distB="0" distL="0" distR="0" wp14:anchorId="601F63DD" wp14:editId="2F47053B">
+            <wp:extent cx="3496163" cy="552527"/>
+            <wp:effectExtent l="0" t="0" r="9525" b="0"/>
+            <wp:docPr id="142" name="Imagem 142"/>
+            <wp:cNvGraphicFramePr>
+              <a:graphicFrameLocks xmlns:a="http://schemas.openxmlformats.org/drawingml/2006/main" noChangeAspect="1"/>
+            </wp:cNvGraphicFramePr>
+            <a:graphic xmlns:a="http://schemas.openxmlformats.org/drawingml/2006/main">
+              <a:graphicData uri="http://schemas.openxmlformats.org/drawingml/2006/picture">
+                <pic:pic xmlns:pic="http://schemas.openxmlformats.org/drawingml/2006/picture">
+                  <pic:nvPicPr>
+                    <pic:cNvPr id="1" name=""/>
+                    <pic:cNvPicPr/>
+                  </pic:nvPicPr>
+                  <pic:blipFill>
+                    <a:blip r:embed="rId116"/>
+                    <a:stretch>
+                      <a:fillRect/>
+                    </a:stretch>
+                  </pic:blipFill>
+                  <pic:spPr>
+                    <a:xfrm>
+                      <a:off x="0" y="0"/>
+                      <a:ext cx="3496163" cy="552527"/>
+                    </a:xfrm>
+                    <a:prstGeom prst="rect">
+                      <a:avLst/>
+                    </a:prstGeom>
+                  </pic:spPr>
+                </pic:pic>
+              </a:graphicData>
+            </a:graphic>
+          </wp:inline>
+        </w:drawing>
+      </w:r>
+    </w:p>
+    <w:p>
+      <w:r>
+        <w:t xml:space="preserve">67 </w:t>
+      </w:r>
+      <w:r>
+        <w:t>–</w:t>
+      </w:r>
+      <w:r>
+        <w:t xml:space="preserve"> </w:t>
+      </w:r>
+      <w:r>
+        <w:t xml:space="preserve">Adicionamos uma </w:t>
+      </w:r>
+      <w:proofErr w:type="spellStart"/>
+      <w:r>
+        <w:t>div</w:t>
+      </w:r>
+      <w:proofErr w:type="spellEnd"/>
+      <w:r>
+        <w:t xml:space="preserve"> envolvendo o parágrafo, como prefere o nosso contato e as </w:t>
+      </w:r>
+      <w:proofErr w:type="spellStart"/>
+      <w:r>
+        <w:t>label</w:t>
+      </w:r>
+      <w:proofErr w:type="spellEnd"/>
+      <w:r>
+        <w:t xml:space="preserve"> e input rádio.</w:t>
+      </w:r>
+    </w:p>
+    <w:p>
+      <w:r>
+        <w:drawing>
+          <wp:inline distT="0" distB="0" distL="0" distR="0" wp14:anchorId="15690ADE" wp14:editId="79D2AF67">
+            <wp:extent cx="4115374" cy="1714739"/>
+            <wp:effectExtent l="0" t="0" r="0" b="0"/>
+            <wp:docPr id="144" name="Imagem 144"/>
+            <wp:cNvGraphicFramePr>
+              <a:graphicFrameLocks xmlns:a="http://schemas.openxmlformats.org/drawingml/2006/main" noChangeAspect="1"/>
+            </wp:cNvGraphicFramePr>
+            <a:graphic xmlns:a="http://schemas.openxmlformats.org/drawingml/2006/main">
+              <a:graphicData uri="http://schemas.openxmlformats.org/drawingml/2006/picture">
+                <pic:pic xmlns:pic="http://schemas.openxmlformats.org/drawingml/2006/picture">
+                  <pic:nvPicPr>
+                    <pic:cNvPr id="1" name=""/>
+                    <pic:cNvPicPr/>
+                  </pic:nvPicPr>
+                  <pic:blipFill>
+                    <a:blip r:embed="rId117"/>
+                    <a:stretch>
+                      <a:fillRect/>
+                    </a:stretch>
+                  </pic:blipFill>
+                  <pic:spPr>
+                    <a:xfrm>
+                      <a:off x="0" y="0"/>
+                      <a:ext cx="4115374" cy="1714739"/>
+                    </a:xfrm>
+                    <a:prstGeom prst="rect">
+                      <a:avLst/>
+                    </a:prstGeom>
+                  </pic:spPr>
+                </pic:pic>
+              </a:graphicData>
+            </a:graphic>
+          </wp:inline>
+        </w:drawing>
+      </w:r>
+    </w:p>
+    <w:p>
+      <w:r>
+        <w:t xml:space="preserve">68 – Posterior, adicionamos um </w:t>
+      </w:r>
+      <w:proofErr w:type="spellStart"/>
+      <w:r>
+        <w:t>label</w:t>
+      </w:r>
+      <w:proofErr w:type="spellEnd"/>
+      <w:r>
+        <w:t xml:space="preserve"> com o input checkbox.</w:t>
+      </w:r>
+    </w:p>
+    <w:p>
+      <w:r>
+        <w:drawing>
+          <wp:inline distT="0" distB="0" distL="0" distR="0" wp14:anchorId="29D563D4" wp14:editId="7A637E79">
+            <wp:extent cx="5010849" cy="295316"/>
+            <wp:effectExtent l="0" t="0" r="0" b="9525"/>
+            <wp:docPr id="145" name="Imagem 145"/>
+            <wp:cNvGraphicFramePr>
+              <a:graphicFrameLocks xmlns:a="http://schemas.openxmlformats.org/drawingml/2006/main" noChangeAspect="1"/>
+            </wp:cNvGraphicFramePr>
+            <a:graphic xmlns:a="http://schemas.openxmlformats.org/drawingml/2006/main">
+              <a:graphicData uri="http://schemas.openxmlformats.org/drawingml/2006/picture">
+                <pic:pic xmlns:pic="http://schemas.openxmlformats.org/drawingml/2006/picture">
+                  <pic:nvPicPr>
+                    <pic:cNvPr id="1" name=""/>
+                    <pic:cNvPicPr/>
+                  </pic:nvPicPr>
+                  <pic:blipFill>
+                    <a:blip r:embed="rId118"/>
+                    <a:stretch>
+                      <a:fillRect/>
+                    </a:stretch>
+                  </pic:blipFill>
+                  <pic:spPr>
+                    <a:xfrm>
+                      <a:off x="0" y="0"/>
+                      <a:ext cx="5010849" cy="295316"/>
+                    </a:xfrm>
+                    <a:prstGeom prst="rect">
+                      <a:avLst/>
+                    </a:prstGeom>
+                  </pic:spPr>
+                </pic:pic>
+              </a:graphicData>
+            </a:graphic>
+          </wp:inline>
+        </w:drawing>
+      </w:r>
+    </w:p>
+    <w:p>
+      <w:r>
+        <w:drawing>
+          <wp:inline distT="0" distB="0" distL="0" distR="0" wp14:anchorId="3F0F0A89" wp14:editId="3F140EFF">
+            <wp:extent cx="3610479" cy="466790"/>
+            <wp:effectExtent l="0" t="0" r="9525" b="9525"/>
+            <wp:docPr id="146" name="Imagem 146"/>
+            <wp:cNvGraphicFramePr>
+              <a:graphicFrameLocks xmlns:a="http://schemas.openxmlformats.org/drawingml/2006/main" noChangeAspect="1"/>
+            </wp:cNvGraphicFramePr>
+            <a:graphic xmlns:a="http://schemas.openxmlformats.org/drawingml/2006/main">
+              <a:graphicData uri="http://schemas.openxmlformats.org/drawingml/2006/picture">
+                <pic:pic xmlns:pic="http://schemas.openxmlformats.org/drawingml/2006/picture">
+                  <pic:nvPicPr>
+                    <pic:cNvPr id="1" name=""/>
+                    <pic:cNvPicPr/>
+                  </pic:nvPicPr>
+                  <pic:blipFill>
+                    <a:blip r:embed="rId119"/>
+                    <a:stretch>
+                      <a:fillRect/>
+                    </a:stretch>
+                  </pic:blipFill>
+                  <pic:spPr>
+                    <a:xfrm>
+                      <a:off x="0" y="0"/>
+                      <a:ext cx="3610479" cy="466790"/>
+                    </a:xfrm>
+                    <a:prstGeom prst="rect">
+                      <a:avLst/>
+                    </a:prstGeom>
+                  </pic:spPr>
+                </pic:pic>
+              </a:graphicData>
+            </a:graphic>
+          </wp:inline>
+        </w:drawing>
+      </w:r>
+    </w:p>
+    <w:p>
+      <w:r>
+        <w:t xml:space="preserve">69 – Para colocar os inputs radio-box e checkbox ao lado da </w:t>
+      </w:r>
+      <w:proofErr w:type="spellStart"/>
+      <w:r>
+        <w:t>label</w:t>
+      </w:r>
+      <w:proofErr w:type="spellEnd"/>
+      <w:r>
+        <w:t xml:space="preserve">, precisamos adicionar os inputs dentro da </w:t>
+      </w:r>
+      <w:proofErr w:type="spellStart"/>
+      <w:r>
+        <w:t>label</w:t>
+      </w:r>
+      <w:proofErr w:type="spellEnd"/>
+      <w:r>
+        <w:t xml:space="preserve"> conforme imagem abaixo.</w:t>
+      </w:r>
+    </w:p>
+    <w:p>
+      <w:r>
+        <w:drawing>
+          <wp:inline distT="0" distB="0" distL="0" distR="0" wp14:anchorId="463D1471" wp14:editId="30460F4A">
+            <wp:extent cx="5792008" cy="1495634"/>
+            <wp:effectExtent l="0" t="0" r="0" b="9525"/>
+            <wp:docPr id="147" name="Imagem 147"/>
+            <wp:cNvGraphicFramePr>
+              <a:graphicFrameLocks xmlns:a="http://schemas.openxmlformats.org/drawingml/2006/main" noChangeAspect="1"/>
+            </wp:cNvGraphicFramePr>
+            <a:graphic xmlns:a="http://schemas.openxmlformats.org/drawingml/2006/main">
+              <a:graphicData uri="http://schemas.openxmlformats.org/drawingml/2006/picture">
+                <pic:pic xmlns:pic="http://schemas.openxmlformats.org/drawingml/2006/picture">
+                  <pic:nvPicPr>
+                    <pic:cNvPr id="1" name=""/>
+                    <pic:cNvPicPr/>
+                  </pic:nvPicPr>
+                  <pic:blipFill>
+                    <a:blip r:embed="rId120"/>
+                    <a:stretch>
+                      <a:fillRect/>
+                    </a:stretch>
+                  </pic:blipFill>
+                  <pic:spPr>
+                    <a:xfrm>
+                      <a:off x="0" y="0"/>
+                      <a:ext cx="5792008" cy="1495634"/>
+                    </a:xfrm>
+                    <a:prstGeom prst="rect">
+                      <a:avLst/>
+                    </a:prstGeom>
+                  </pic:spPr>
+                </pic:pic>
+              </a:graphicData>
+            </a:graphic>
+          </wp:inline>
+        </w:drawing>
+      </w:r>
+    </w:p>
+    <w:p>
+      <w:r>
+        <w:drawing>
+          <wp:inline distT="0" distB="0" distL="0" distR="0" wp14:anchorId="0353F62B" wp14:editId="471793E1">
+            <wp:extent cx="3372321" cy="943107"/>
+            <wp:effectExtent l="0" t="0" r="0" b="9525"/>
+            <wp:docPr id="148" name="Imagem 148"/>
+            <wp:cNvGraphicFramePr>
+              <a:graphicFrameLocks xmlns:a="http://schemas.openxmlformats.org/drawingml/2006/main" noChangeAspect="1"/>
+            </wp:cNvGraphicFramePr>
+            <a:graphic xmlns:a="http://schemas.openxmlformats.org/drawingml/2006/main">
+              <a:graphicData uri="http://schemas.openxmlformats.org/drawingml/2006/picture">
+                <pic:pic xmlns:pic="http://schemas.openxmlformats.org/drawingml/2006/picture">
+                  <pic:nvPicPr>
+                    <pic:cNvPr id="1" name=""/>
+                    <pic:cNvPicPr/>
+                  </pic:nvPicPr>
+                  <pic:blipFill>
+                    <a:blip r:embed="rId121"/>
+                    <a:stretch>
+                      <a:fillRect/>
+                    </a:stretch>
+                  </pic:blipFill>
+                  <pic:spPr>
+                    <a:xfrm>
+                      <a:off x="0" y="0"/>
+                      <a:ext cx="3372321" cy="943107"/>
+                    </a:xfrm>
+                    <a:prstGeom prst="rect">
+                      <a:avLst/>
+                    </a:prstGeom>
+                  </pic:spPr>
+                </pic:pic>
+              </a:graphicData>
+            </a:graphic>
+          </wp:inline>
+        </w:drawing>
+      </w:r>
+    </w:p>
+    <w:p>
+      <w:r>
+        <w:t xml:space="preserve">70 </w:t>
+      </w:r>
+      <w:r>
+        <w:t>–</w:t>
+      </w:r>
+      <w:r>
+        <w:t xml:space="preserve"> </w:t>
+      </w:r>
+      <w:r>
+        <w:t xml:space="preserve">Notamos que em nosso caso o </w:t>
+      </w:r>
+      <w:proofErr w:type="spellStart"/>
+      <w:r>
+        <w:t>form</w:t>
+      </w:r>
+      <w:proofErr w:type="spellEnd"/>
+      <w:r>
+        <w:t xml:space="preserve"> inputs estava configurado como display: </w:t>
+      </w:r>
+      <w:proofErr w:type="spellStart"/>
+      <w:r>
+        <w:t>block</w:t>
+      </w:r>
+      <w:proofErr w:type="spellEnd"/>
+      <w:r>
+        <w:t xml:space="preserve">, impedindo que as </w:t>
+      </w:r>
+      <w:proofErr w:type="spellStart"/>
+      <w:r>
+        <w:t>label</w:t>
+      </w:r>
+      <w:proofErr w:type="spellEnd"/>
+      <w:r>
+        <w:t xml:space="preserve"> e os inputs de </w:t>
+      </w:r>
+      <w:r>
+        <w:t xml:space="preserve">ficarem um ao lado do outro, para resolver essa situação mudamos onde antigamente era </w:t>
+      </w:r>
+      <w:proofErr w:type="spellStart"/>
+      <w:r>
+        <w:t>form</w:t>
+      </w:r>
+      <w:proofErr w:type="spellEnd"/>
+      <w:r>
+        <w:t xml:space="preserve"> inputs, trocamos para uma </w:t>
+      </w:r>
+      <w:proofErr w:type="spellStart"/>
+      <w:r>
+        <w:t>class</w:t>
+      </w:r>
+      <w:proofErr w:type="spellEnd"/>
+      <w:r>
+        <w:t xml:space="preserve"> inputs-</w:t>
+      </w:r>
+      <w:proofErr w:type="spellStart"/>
+      <w:r>
+        <w:t>padrao</w:t>
+      </w:r>
+      <w:proofErr w:type="spellEnd"/>
+      <w:r>
+        <w:t xml:space="preserve"> e adicionamos nos inputs os quais queríamos que ficassem um a baixo do outro.</w:t>
+      </w:r>
       <w:bookmarkStart w:id="0" w:name="_GoBack"/>
       <w:bookmarkEnd w:id="0"/>
     </w:p>
+    <w:p/>
+    <w:p/>
     <w:sectPr>
       <w:pgSz w:w="11906" w:h="16838"/>
       <w:pgMar w:top="1417" w:right="1701" w:bottom="1417" w:left="1701" w:header="708" w:footer="708" w:gutter="0"/>
@@ -9178,7 +10565,7 @@
 </file>
 
 <file path=customXml/itemProps4.xml><?xml version="1.0" encoding="utf-8"?>
-<ds:datastoreItem xmlns:ds="http://schemas.openxmlformats.org/officeDocument/2006/customXml" ds:itemID="{71E682D7-9E33-4367-A30C-F1536F2CE156}">
+<ds:datastoreItem xmlns:ds="http://schemas.openxmlformats.org/officeDocument/2006/customXml" ds:itemID="{1A7A5B01-0F21-4BF8-84C2-E94B505A2591}">
   <ds:schemaRefs>
     <ds:schemaRef ds:uri="http://schemas.openxmlformats.org/officeDocument/2006/bibliography"/>
   </ds:schemaRefs>

</xml_diff>

<commit_message>
atualização da aula dia 21/09/2026
</commit_message>
<xml_diff>
--- a/apostila/Projeto Space for me3.docx
+++ b/apostila/Projeto Space for me3.docx
@@ -8065,6 +8065,9 @@
         </mc:AlternateContent>
       </w:r>
       <w:r>
+        <w:rPr>
+          <w:noProof/>
+        </w:rPr>
         <w:drawing>
           <wp:inline distT="0" distB="0" distL="0" distR="0" wp14:anchorId="4E0B6321" wp14:editId="25E6D509">
             <wp:extent cx="2438740" cy="2143424"/>
@@ -8102,6 +8105,9 @@
         </w:drawing>
       </w:r>
       <w:r>
+        <w:rPr>
+          <w:noProof/>
+        </w:rPr>
         <w:drawing>
           <wp:inline distT="0" distB="0" distL="0" distR="0" wp14:anchorId="5A21DFA5" wp14:editId="384308F3">
             <wp:extent cx="3728545" cy="2162007"/>
@@ -8149,6 +8155,9 @@
     </w:p>
     <w:p>
       <w:r>
+        <w:rPr>
+          <w:noProof/>
+        </w:rPr>
         <w:drawing>
           <wp:inline distT="0" distB="0" distL="0" distR="0" wp14:anchorId="6CB1A6BB" wp14:editId="6E132C1C">
             <wp:extent cx="3051643" cy="1438275"/>
@@ -8186,6 +8195,9 @@
         </w:drawing>
       </w:r>
       <w:r>
+        <w:rPr>
+          <w:noProof/>
+        </w:rPr>
         <w:drawing>
           <wp:inline distT="0" distB="0" distL="0" distR="0" wp14:anchorId="43F89EC5" wp14:editId="41FE3DD3">
             <wp:extent cx="3034666" cy="1428750"/>
@@ -8315,6 +8327,9 @@
         </mc:AlternateContent>
       </w:r>
       <w:r>
+        <w:rPr>
+          <w:noProof/>
+        </w:rPr>
         <w:drawing>
           <wp:inline distT="0" distB="0" distL="0" distR="0" wp14:anchorId="61615A8D" wp14:editId="4CD63970">
             <wp:extent cx="5782482" cy="1409897"/>
@@ -8354,6 +8369,9 @@
     </w:p>
     <w:p>
       <w:r>
+        <w:rPr>
+          <w:noProof/>
+        </w:rPr>
         <w:drawing>
           <wp:inline distT="0" distB="0" distL="0" distR="0" wp14:anchorId="2BA4C9D3" wp14:editId="6BDF61C4">
             <wp:extent cx="3848637" cy="3448531"/>
@@ -8621,6 +8639,9 @@
         </mc:AlternateContent>
       </w:r>
       <w:r>
+        <w:rPr>
+          <w:noProof/>
+        </w:rPr>
         <w:drawing>
           <wp:inline distT="0" distB="0" distL="0" distR="0" wp14:anchorId="16BA6AE8" wp14:editId="08A408E5">
             <wp:extent cx="5792008" cy="3124636"/>
@@ -8658,6 +8679,9 @@
         </w:drawing>
       </w:r>
       <w:r>
+        <w:rPr>
+          <w:noProof/>
+        </w:rPr>
         <w:drawing>
           <wp:inline distT="0" distB="0" distL="0" distR="0" wp14:anchorId="1DC0AA0A" wp14:editId="034805F9">
             <wp:extent cx="2362530" cy="1181265"/>
@@ -8782,6 +8806,9 @@
     </w:p>
     <w:p>
       <w:r>
+        <w:rPr>
+          <w:noProof/>
+        </w:rPr>
         <w:drawing>
           <wp:inline distT="0" distB="0" distL="0" distR="0" wp14:anchorId="601F63DD" wp14:editId="2F47053B">
             <wp:extent cx="3496163" cy="552527"/>
@@ -8851,6 +8878,9 @@
     </w:p>
     <w:p>
       <w:r>
+        <w:rPr>
+          <w:noProof/>
+        </w:rPr>
         <w:drawing>
           <wp:inline distT="0" distB="0" distL="0" distR="0" wp14:anchorId="15690ADE" wp14:editId="79D2AF67">
             <wp:extent cx="4115374" cy="1714739"/>
@@ -8903,6 +8933,9 @@
     </w:p>
     <w:p>
       <w:r>
+        <w:rPr>
+          <w:noProof/>
+        </w:rPr>
         <w:drawing>
           <wp:inline distT="0" distB="0" distL="0" distR="0" wp14:anchorId="29D563D4" wp14:editId="7A637E79">
             <wp:extent cx="5010849" cy="295316"/>
@@ -8942,6 +8975,9 @@
     </w:p>
     <w:p>
       <w:r>
+        <w:rPr>
+          <w:noProof/>
+        </w:rPr>
         <w:drawing>
           <wp:inline distT="0" distB="0" distL="0" distR="0" wp14:anchorId="3F0F0A89" wp14:editId="3F140EFF">
             <wp:extent cx="3610479" cy="466790"/>
@@ -9002,6 +9038,9 @@
     </w:p>
     <w:p>
       <w:r>
+        <w:rPr>
+          <w:noProof/>
+        </w:rPr>
         <w:drawing>
           <wp:inline distT="0" distB="0" distL="0" distR="0" wp14:anchorId="463D1471" wp14:editId="30460F4A">
             <wp:extent cx="5792008" cy="1495634"/>
@@ -9041,6 +9080,9 @@
     </w:p>
     <w:p>
       <w:r>
+        <w:rPr>
+          <w:noProof/>
+        </w:rPr>
         <w:drawing>
           <wp:inline distT="0" distB="0" distL="0" distR="0" wp14:anchorId="0353F62B" wp14:editId="471793E1">
             <wp:extent cx="3372321" cy="943107"/>
@@ -9142,9 +9184,1131 @@
       <w:r>
         <w:t xml:space="preserve"> e adicionamos nos inputs os quais queríamos que ficassem um a baixo do outro.</w:t>
       </w:r>
+    </w:p>
+    <w:p>
+      <w:r>
+        <w:drawing>
+          <wp:inline distT="0" distB="0" distL="0" distR="0" wp14:anchorId="22CFE01B" wp14:editId="1BD53A90">
+            <wp:extent cx="2057687" cy="1086002"/>
+            <wp:effectExtent l="0" t="0" r="0" b="0"/>
+            <wp:docPr id="134" name="Imagem 134"/>
+            <wp:cNvGraphicFramePr>
+              <a:graphicFrameLocks xmlns:a="http://schemas.openxmlformats.org/drawingml/2006/main" noChangeAspect="1"/>
+            </wp:cNvGraphicFramePr>
+            <a:graphic xmlns:a="http://schemas.openxmlformats.org/drawingml/2006/main">
+              <a:graphicData uri="http://schemas.openxmlformats.org/drawingml/2006/picture">
+                <pic:pic xmlns:pic="http://schemas.openxmlformats.org/drawingml/2006/picture">
+                  <pic:nvPicPr>
+                    <pic:cNvPr id="1" name=""/>
+                    <pic:cNvPicPr/>
+                  </pic:nvPicPr>
+                  <pic:blipFill>
+                    <a:blip r:embed="rId122"/>
+                    <a:stretch>
+                      <a:fillRect/>
+                    </a:stretch>
+                  </pic:blipFill>
+                  <pic:spPr>
+                    <a:xfrm>
+                      <a:off x="0" y="0"/>
+                      <a:ext cx="2057687" cy="1086002"/>
+                    </a:xfrm>
+                    <a:prstGeom prst="rect">
+                      <a:avLst/>
+                    </a:prstGeom>
+                  </pic:spPr>
+                </pic:pic>
+              </a:graphicData>
+            </a:graphic>
+          </wp:inline>
+        </w:drawing>
+      </w:r>
+      <w:r>
+        <w:drawing>
+          <wp:inline distT="0" distB="0" distL="0" distR="0" wp14:anchorId="797D9BAC" wp14:editId="62CA1097">
+            <wp:extent cx="4639322" cy="1409897"/>
+            <wp:effectExtent l="0" t="0" r="0" b="0"/>
+            <wp:docPr id="149" name="Imagem 149"/>
+            <wp:cNvGraphicFramePr>
+              <a:graphicFrameLocks xmlns:a="http://schemas.openxmlformats.org/drawingml/2006/main" noChangeAspect="1"/>
+            </wp:cNvGraphicFramePr>
+            <a:graphic xmlns:a="http://schemas.openxmlformats.org/drawingml/2006/main">
+              <a:graphicData uri="http://schemas.openxmlformats.org/drawingml/2006/picture">
+                <pic:pic xmlns:pic="http://schemas.openxmlformats.org/drawingml/2006/picture">
+                  <pic:nvPicPr>
+                    <pic:cNvPr id="1" name=""/>
+                    <pic:cNvPicPr/>
+                  </pic:nvPicPr>
+                  <pic:blipFill>
+                    <a:blip r:embed="rId123"/>
+                    <a:stretch>
+                      <a:fillRect/>
+                    </a:stretch>
+                  </pic:blipFill>
+                  <pic:spPr>
+                    <a:xfrm>
+                      <a:off x="0" y="0"/>
+                      <a:ext cx="4639322" cy="1409897"/>
+                    </a:xfrm>
+                    <a:prstGeom prst="rect">
+                      <a:avLst/>
+                    </a:prstGeom>
+                  </pic:spPr>
+                </pic:pic>
+              </a:graphicData>
+            </a:graphic>
+          </wp:inline>
+        </w:drawing>
+      </w:r>
+    </w:p>
+    <w:p>
+      <w:r>
+        <w:t xml:space="preserve">71 – Adicionamos uma </w:t>
+      </w:r>
+      <w:proofErr w:type="spellStart"/>
+      <w:r>
+        <w:t>class</w:t>
+      </w:r>
+      <w:proofErr w:type="spellEnd"/>
+      <w:r>
+        <w:t xml:space="preserve"> na </w:t>
+      </w:r>
+      <w:proofErr w:type="spellStart"/>
+      <w:r>
+        <w:t>label</w:t>
+      </w:r>
+      <w:proofErr w:type="spellEnd"/>
+      <w:r>
+        <w:t xml:space="preserve"> </w:t>
+      </w:r>
+      <w:proofErr w:type="spellStart"/>
+      <w:r>
+        <w:t>checkbox</w:t>
+      </w:r>
+      <w:proofErr w:type="spellEnd"/>
+      <w:r>
+        <w:t xml:space="preserve"> para dar um espaço tanto para cima como para baixo.</w:t>
+      </w:r>
+    </w:p>
+    <w:p>
+      <w:r>
+        <w:rPr>
+          <w:noProof/>
+        </w:rPr>
+        <mc:AlternateContent>
+          <mc:Choice Requires="wps">
+            <w:drawing>
+              <wp:anchor distT="0" distB="0" distL="114300" distR="114300" simplePos="0" relativeHeight="251696128" behindDoc="0" locked="0" layoutInCell="1" allowOverlap="1" wp14:anchorId="681D2F92" wp14:editId="2BC3FF6E">
+                <wp:simplePos x="0" y="0"/>
+                <wp:positionH relativeFrom="column">
+                  <wp:posOffset>942975</wp:posOffset>
+                </wp:positionH>
+                <wp:positionV relativeFrom="paragraph">
+                  <wp:posOffset>335279</wp:posOffset>
+                </wp:positionV>
+                <wp:extent cx="4695825" cy="1019175"/>
+                <wp:effectExtent l="38100" t="0" r="28575" b="85725"/>
+                <wp:wrapNone/>
+                <wp:docPr id="153" name="Conector de Seta Reta 153"/>
+                <wp:cNvGraphicFramePr/>
+                <a:graphic xmlns:a="http://schemas.openxmlformats.org/drawingml/2006/main">
+                  <a:graphicData uri="http://schemas.microsoft.com/office/word/2010/wordprocessingShape">
+                    <wps:wsp>
+                      <wps:cNvCnPr/>
+                      <wps:spPr>
+                        <a:xfrm flipH="1">
+                          <a:off x="0" y="0"/>
+                          <a:ext cx="4695825" cy="1019175"/>
+                        </a:xfrm>
+                        <a:prstGeom prst="straightConnector1">
+                          <a:avLst/>
+                        </a:prstGeom>
+                        <a:ln>
+                          <a:tailEnd type="triangle"/>
+                        </a:ln>
+                      </wps:spPr>
+                      <wps:style>
+                        <a:lnRef idx="1">
+                          <a:schemeClr val="accent2"/>
+                        </a:lnRef>
+                        <a:fillRef idx="0">
+                          <a:schemeClr val="accent2"/>
+                        </a:fillRef>
+                        <a:effectRef idx="0">
+                          <a:schemeClr val="accent2"/>
+                        </a:effectRef>
+                        <a:fontRef idx="minor">
+                          <a:schemeClr val="tx1"/>
+                        </a:fontRef>
+                      </wps:style>
+                      <wps:bodyPr/>
+                    </wps:wsp>
+                  </a:graphicData>
+                </a:graphic>
+              </wp:anchor>
+            </w:drawing>
+          </mc:Choice>
+          <mc:Fallback>
+            <w:pict>
+              <v:shapetype w14:anchorId="5AD87EE9" id="_x0000_t32" coordsize="21600,21600" o:spt="32" o:oned="t" path="m,l21600,21600e" filled="f">
+                <v:path arrowok="t" fillok="f" o:connecttype="none"/>
+                <o:lock v:ext="edit" shapetype="t"/>
+              </v:shapetype>
+              <v:shape id="Conector de Seta Reta 153" o:spid="_x0000_s1026" type="#_x0000_t32" style="position:absolute;margin-left:74.25pt;margin-top:26.4pt;width:369.75pt;height:80.25pt;flip:x;z-index:251696128;visibility:visible;mso-wrap-style:square;mso-wrap-distance-left:9pt;mso-wrap-distance-top:0;mso-wrap-distance-right:9pt;mso-wrap-distance-bottom:0;mso-position-horizontal:absolute;mso-position-horizontal-relative:text;mso-position-vertical:absolute;mso-position-vertical-relative:text" o:gfxdata="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" strokecolor="#ed7d31 [3205]" strokeweight=".5pt">
+                <v:stroke endarrow="block" joinstyle="miter"/>
+              </v:shape>
+            </w:pict>
+          </mc:Fallback>
+        </mc:AlternateContent>
+      </w:r>
+      <w:r>
+        <w:drawing>
+          <wp:inline distT="0" distB="0" distL="0" distR="0" wp14:anchorId="551CC70C" wp14:editId="4C0CEECD">
+            <wp:extent cx="4629796" cy="228632"/>
+            <wp:effectExtent l="0" t="0" r="0" b="0"/>
+            <wp:docPr id="150" name="Imagem 150"/>
+            <wp:cNvGraphicFramePr>
+              <a:graphicFrameLocks xmlns:a="http://schemas.openxmlformats.org/drawingml/2006/main" noChangeAspect="1"/>
+            </wp:cNvGraphicFramePr>
+            <a:graphic xmlns:a="http://schemas.openxmlformats.org/drawingml/2006/main">
+              <a:graphicData uri="http://schemas.openxmlformats.org/drawingml/2006/picture">
+                <pic:pic xmlns:pic="http://schemas.openxmlformats.org/drawingml/2006/picture">
+                  <pic:nvPicPr>
+                    <pic:cNvPr id="1" name=""/>
+                    <pic:cNvPicPr/>
+                  </pic:nvPicPr>
+                  <pic:blipFill>
+                    <a:blip r:embed="rId124"/>
+                    <a:stretch>
+                      <a:fillRect/>
+                    </a:stretch>
+                  </pic:blipFill>
+                  <pic:spPr>
+                    <a:xfrm>
+                      <a:off x="0" y="0"/>
+                      <a:ext cx="4629796" cy="228632"/>
+                    </a:xfrm>
+                    <a:prstGeom prst="rect">
+                      <a:avLst/>
+                    </a:prstGeom>
+                  </pic:spPr>
+                </pic:pic>
+              </a:graphicData>
+            </a:graphic>
+          </wp:inline>
+        </w:drawing>
+      </w:r>
+      <w:r>
+        <w:drawing>
+          <wp:inline distT="0" distB="0" distL="0" distR="0" wp14:anchorId="229DD371" wp14:editId="1BC5616E">
+            <wp:extent cx="1390844" cy="523948"/>
+            <wp:effectExtent l="0" t="0" r="0" b="9525"/>
+            <wp:docPr id="151" name="Imagem 151"/>
+            <wp:cNvGraphicFramePr>
+              <a:graphicFrameLocks xmlns:a="http://schemas.openxmlformats.org/drawingml/2006/main" noChangeAspect="1"/>
+            </wp:cNvGraphicFramePr>
+            <a:graphic xmlns:a="http://schemas.openxmlformats.org/drawingml/2006/main">
+              <a:graphicData uri="http://schemas.openxmlformats.org/drawingml/2006/picture">
+                <pic:pic xmlns:pic="http://schemas.openxmlformats.org/drawingml/2006/picture">
+                  <pic:nvPicPr>
+                    <pic:cNvPr id="1" name=""/>
+                    <pic:cNvPicPr/>
+                  </pic:nvPicPr>
+                  <pic:blipFill>
+                    <a:blip r:embed="rId125"/>
+                    <a:stretch>
+                      <a:fillRect/>
+                    </a:stretch>
+                  </pic:blipFill>
+                  <pic:spPr>
+                    <a:xfrm>
+                      <a:off x="0" y="0"/>
+                      <a:ext cx="1390844" cy="523948"/>
+                    </a:xfrm>
+                    <a:prstGeom prst="rect">
+                      <a:avLst/>
+                    </a:prstGeom>
+                  </pic:spPr>
+                </pic:pic>
+              </a:graphicData>
+            </a:graphic>
+          </wp:inline>
+        </w:drawing>
+      </w:r>
+    </w:p>
+    <w:p>
+      <w:r>
+        <w:drawing>
+          <wp:inline distT="0" distB="0" distL="0" distR="0" wp14:anchorId="0936BD4E" wp14:editId="14091FFF">
+            <wp:extent cx="1790950" cy="1038370"/>
+            <wp:effectExtent l="0" t="0" r="0" b="9525"/>
+            <wp:docPr id="152" name="Imagem 152"/>
+            <wp:cNvGraphicFramePr>
+              <a:graphicFrameLocks xmlns:a="http://schemas.openxmlformats.org/drawingml/2006/main" noChangeAspect="1"/>
+            </wp:cNvGraphicFramePr>
+            <a:graphic xmlns:a="http://schemas.openxmlformats.org/drawingml/2006/main">
+              <a:graphicData uri="http://schemas.openxmlformats.org/drawingml/2006/picture">
+                <pic:pic xmlns:pic="http://schemas.openxmlformats.org/drawingml/2006/picture">
+                  <pic:nvPicPr>
+                    <pic:cNvPr id="1" name=""/>
+                    <pic:cNvPicPr/>
+                  </pic:nvPicPr>
+                  <pic:blipFill>
+                    <a:blip r:embed="rId126"/>
+                    <a:stretch>
+                      <a:fillRect/>
+                    </a:stretch>
+                  </pic:blipFill>
+                  <pic:spPr>
+                    <a:xfrm>
+                      <a:off x="0" y="0"/>
+                      <a:ext cx="1790950" cy="1038370"/>
+                    </a:xfrm>
+                    <a:prstGeom prst="rect">
+                      <a:avLst/>
+                    </a:prstGeom>
+                  </pic:spPr>
+                </pic:pic>
+              </a:graphicData>
+            </a:graphic>
+          </wp:inline>
+        </w:drawing>
+      </w:r>
+    </w:p>
+    <w:p>
+      <w:r>
+        <w:t xml:space="preserve">72 </w:t>
+      </w:r>
+      <w:r>
+        <w:t>–</w:t>
+      </w:r>
+      <w:r>
+        <w:t xml:space="preserve"> </w:t>
+      </w:r>
+      <w:r>
+        <w:t xml:space="preserve">Inserimos um parágrafo fazendo uma pergunta qual a preferência de horário e adicionamos </w:t>
+      </w:r>
+      <w:proofErr w:type="spellStart"/>
+      <w:r>
+        <w:t>select</w:t>
+      </w:r>
+      <w:proofErr w:type="spellEnd"/>
+      <w:r>
+        <w:t xml:space="preserve"> com </w:t>
+      </w:r>
+      <w:proofErr w:type="spellStart"/>
+      <w:r>
+        <w:t>opition</w:t>
+      </w:r>
+      <w:proofErr w:type="spellEnd"/>
+      <w:r>
+        <w:t xml:space="preserve"> no </w:t>
+      </w:r>
+      <w:proofErr w:type="spellStart"/>
+      <w:r>
+        <w:t>html</w:t>
+      </w:r>
+      <w:proofErr w:type="spellEnd"/>
+      <w:r>
+        <w:t xml:space="preserve"> conforme código.</w:t>
+      </w:r>
+    </w:p>
+    <w:p>
+      <w:r>
+        <w:drawing>
+          <wp:inline distT="0" distB="0" distL="0" distR="0" wp14:anchorId="757DD52D" wp14:editId="77680912">
+            <wp:extent cx="2934109" cy="1419423"/>
+            <wp:effectExtent l="0" t="0" r="0" b="9525"/>
+            <wp:docPr id="154" name="Imagem 154"/>
+            <wp:cNvGraphicFramePr>
+              <a:graphicFrameLocks xmlns:a="http://schemas.openxmlformats.org/drawingml/2006/main" noChangeAspect="1"/>
+            </wp:cNvGraphicFramePr>
+            <a:graphic xmlns:a="http://schemas.openxmlformats.org/drawingml/2006/main">
+              <a:graphicData uri="http://schemas.openxmlformats.org/drawingml/2006/picture">
+                <pic:pic xmlns:pic="http://schemas.openxmlformats.org/drawingml/2006/picture">
+                  <pic:nvPicPr>
+                    <pic:cNvPr id="1" name=""/>
+                    <pic:cNvPicPr/>
+                  </pic:nvPicPr>
+                  <pic:blipFill>
+                    <a:blip r:embed="rId127"/>
+                    <a:stretch>
+                      <a:fillRect/>
+                    </a:stretch>
+                  </pic:blipFill>
+                  <pic:spPr>
+                    <a:xfrm>
+                      <a:off x="0" y="0"/>
+                      <a:ext cx="2934109" cy="1419423"/>
+                    </a:xfrm>
+                    <a:prstGeom prst="rect">
+                      <a:avLst/>
+                    </a:prstGeom>
+                  </pic:spPr>
+                </pic:pic>
+              </a:graphicData>
+            </a:graphic>
+          </wp:inline>
+        </w:drawing>
+      </w:r>
+      <w:r>
+        <w:drawing>
+          <wp:inline distT="0" distB="0" distL="0" distR="0" wp14:anchorId="116E28EE" wp14:editId="4A24E3D7">
+            <wp:extent cx="3124636" cy="1305107"/>
+            <wp:effectExtent l="0" t="0" r="0" b="9525"/>
+            <wp:docPr id="155" name="Imagem 155"/>
+            <wp:cNvGraphicFramePr>
+              <a:graphicFrameLocks xmlns:a="http://schemas.openxmlformats.org/drawingml/2006/main" noChangeAspect="1"/>
+            </wp:cNvGraphicFramePr>
+            <a:graphic xmlns:a="http://schemas.openxmlformats.org/drawingml/2006/main">
+              <a:graphicData uri="http://schemas.openxmlformats.org/drawingml/2006/picture">
+                <pic:pic xmlns:pic="http://schemas.openxmlformats.org/drawingml/2006/picture">
+                  <pic:nvPicPr>
+                    <pic:cNvPr id="1" name=""/>
+                    <pic:cNvPicPr/>
+                  </pic:nvPicPr>
+                  <pic:blipFill>
+                    <a:blip r:embed="rId128"/>
+                    <a:stretch>
+                      <a:fillRect/>
+                    </a:stretch>
+                  </pic:blipFill>
+                  <pic:spPr>
+                    <a:xfrm>
+                      <a:off x="0" y="0"/>
+                      <a:ext cx="3124636" cy="1305107"/>
+                    </a:xfrm>
+                    <a:prstGeom prst="rect">
+                      <a:avLst/>
+                    </a:prstGeom>
+                  </pic:spPr>
+                </pic:pic>
+              </a:graphicData>
+            </a:graphic>
+          </wp:inline>
+        </w:drawing>
+      </w:r>
+    </w:p>
+    <w:p>
+      <w:r>
+        <w:t xml:space="preserve">73 – Entramos no site (mobile inputs </w:t>
+      </w:r>
+      <w:proofErr w:type="spellStart"/>
+      <w:r>
+        <w:t>types</w:t>
+      </w:r>
+      <w:proofErr w:type="spellEnd"/>
+      <w:r>
+        <w:t xml:space="preserve">) para verificar os tipos de inputs para dispositivos mobile e alteramos em nosso formulário alguns tipos para ficar compatível com os dispositivos de </w:t>
+      </w:r>
+      <w:proofErr w:type="spellStart"/>
+      <w:r>
+        <w:t>celurares</w:t>
+      </w:r>
+      <w:proofErr w:type="spellEnd"/>
+      <w:r>
+        <w:t>.</w:t>
+      </w:r>
+    </w:p>
+    <w:p>
+      <w:r>
+        <w:rPr>
+          <w:noProof/>
+        </w:rPr>
+        <mc:AlternateContent>
+          <mc:Choice Requires="wps">
+            <w:drawing>
+              <wp:anchor distT="0" distB="0" distL="114300" distR="114300" simplePos="0" relativeHeight="251698176" behindDoc="0" locked="0" layoutInCell="1" allowOverlap="1" wp14:anchorId="111E9C8D" wp14:editId="006F0C99">
+                <wp:simplePos x="0" y="0"/>
+                <wp:positionH relativeFrom="column">
+                  <wp:posOffset>1285875</wp:posOffset>
+                </wp:positionH>
+                <wp:positionV relativeFrom="paragraph">
+                  <wp:posOffset>968375</wp:posOffset>
+                </wp:positionV>
+                <wp:extent cx="895350" cy="200025"/>
+                <wp:effectExtent l="19050" t="57150" r="19050" b="28575"/>
+                <wp:wrapNone/>
+                <wp:docPr id="158" name="Conector de Seta Reta 158"/>
+                <wp:cNvGraphicFramePr/>
+                <a:graphic xmlns:a="http://schemas.openxmlformats.org/drawingml/2006/main">
+                  <a:graphicData uri="http://schemas.microsoft.com/office/word/2010/wordprocessingShape">
+                    <wps:wsp>
+                      <wps:cNvCnPr/>
+                      <wps:spPr>
+                        <a:xfrm flipH="1" flipV="1">
+                          <a:off x="0" y="0"/>
+                          <a:ext cx="895350" cy="200025"/>
+                        </a:xfrm>
+                        <a:prstGeom prst="straightConnector1">
+                          <a:avLst/>
+                        </a:prstGeom>
+                        <a:ln>
+                          <a:tailEnd type="triangle"/>
+                        </a:ln>
+                      </wps:spPr>
+                      <wps:style>
+                        <a:lnRef idx="1">
+                          <a:schemeClr val="accent2"/>
+                        </a:lnRef>
+                        <a:fillRef idx="0">
+                          <a:schemeClr val="accent2"/>
+                        </a:fillRef>
+                        <a:effectRef idx="0">
+                          <a:schemeClr val="accent2"/>
+                        </a:effectRef>
+                        <a:fontRef idx="minor">
+                          <a:schemeClr val="tx1"/>
+                        </a:fontRef>
+                      </wps:style>
+                      <wps:bodyPr/>
+                    </wps:wsp>
+                  </a:graphicData>
+                </a:graphic>
+              </wp:anchor>
+            </w:drawing>
+          </mc:Choice>
+          <mc:Fallback>
+            <w:pict>
+              <v:shape w14:anchorId="101FD639" id="Conector de Seta Reta 158" o:spid="_x0000_s1026" type="#_x0000_t32" style="position:absolute;margin-left:101.25pt;margin-top:76.25pt;width:70.5pt;height:15.75pt;flip:x y;z-index:251698176;visibility:visible;mso-wrap-style:square;mso-wrap-distance-left:9pt;mso-wrap-distance-top:0;mso-wrap-distance-right:9pt;mso-wrap-distance-bottom:0;mso-position-horizontal:absolute;mso-position-horizontal-relative:text;mso-position-vertical:absolute;mso-position-vertical-relative:text" o:gfxdata="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" strokecolor="#ed7d31 [3205]" strokeweight=".5pt">
+                <v:stroke endarrow="block" joinstyle="miter"/>
+              </v:shape>
+            </w:pict>
+          </mc:Fallback>
+        </mc:AlternateContent>
+      </w:r>
+      <w:r>
+        <w:rPr>
+          <w:noProof/>
+        </w:rPr>
+        <mc:AlternateContent>
+          <mc:Choice Requires="wps">
+            <w:drawing>
+              <wp:anchor distT="0" distB="0" distL="114300" distR="114300" simplePos="0" relativeHeight="251697152" behindDoc="0" locked="0" layoutInCell="1" allowOverlap="1" wp14:anchorId="596F335A" wp14:editId="3F0B336D">
+                <wp:simplePos x="0" y="0"/>
+                <wp:positionH relativeFrom="column">
+                  <wp:posOffset>1228725</wp:posOffset>
+                </wp:positionH>
+                <wp:positionV relativeFrom="paragraph">
+                  <wp:posOffset>492125</wp:posOffset>
+                </wp:positionV>
+                <wp:extent cx="1209675" cy="171450"/>
+                <wp:effectExtent l="38100" t="57150" r="28575" b="19050"/>
+                <wp:wrapNone/>
+                <wp:docPr id="157" name="Conector de Seta Reta 157"/>
+                <wp:cNvGraphicFramePr/>
+                <a:graphic xmlns:a="http://schemas.openxmlformats.org/drawingml/2006/main">
+                  <a:graphicData uri="http://schemas.microsoft.com/office/word/2010/wordprocessingShape">
+                    <wps:wsp>
+                      <wps:cNvCnPr/>
+                      <wps:spPr>
+                        <a:xfrm flipH="1" flipV="1">
+                          <a:off x="0" y="0"/>
+                          <a:ext cx="1209675" cy="171450"/>
+                        </a:xfrm>
+                        <a:prstGeom prst="straightConnector1">
+                          <a:avLst/>
+                        </a:prstGeom>
+                        <a:ln>
+                          <a:tailEnd type="triangle"/>
+                        </a:ln>
+                      </wps:spPr>
+                      <wps:style>
+                        <a:lnRef idx="1">
+                          <a:schemeClr val="accent2"/>
+                        </a:lnRef>
+                        <a:fillRef idx="0">
+                          <a:schemeClr val="accent2"/>
+                        </a:fillRef>
+                        <a:effectRef idx="0">
+                          <a:schemeClr val="accent2"/>
+                        </a:effectRef>
+                        <a:fontRef idx="minor">
+                          <a:schemeClr val="tx1"/>
+                        </a:fontRef>
+                      </wps:style>
+                      <wps:bodyPr/>
+                    </wps:wsp>
+                  </a:graphicData>
+                </a:graphic>
+              </wp:anchor>
+            </w:drawing>
+          </mc:Choice>
+          <mc:Fallback>
+            <w:pict>
+              <v:shape w14:anchorId="6B2141BE" id="Conector de Seta Reta 157" o:spid="_x0000_s1026" type="#_x0000_t32" style="position:absolute;margin-left:96.75pt;margin-top:38.75pt;width:95.25pt;height:13.5pt;flip:x y;z-index:251697152;visibility:visible;mso-wrap-style:square;mso-wrap-distance-left:9pt;mso-wrap-distance-top:0;mso-wrap-distance-right:9pt;mso-wrap-distance-bottom:0;mso-position-horizontal:absolute;mso-position-horizontal-relative:text;mso-position-vertical:absolute;mso-position-vertical-relative:text" o:gfxdata="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" strokecolor="#ed7d31 [3205]" strokeweight=".5pt">
+                <v:stroke endarrow="block" joinstyle="miter"/>
+              </v:shape>
+            </w:pict>
+          </mc:Fallback>
+        </mc:AlternateContent>
+      </w:r>
+      <w:r>
+        <w:drawing>
+          <wp:inline distT="0" distB="0" distL="0" distR="0" wp14:anchorId="7740D36A" wp14:editId="0CFB76FB">
+            <wp:extent cx="3715268" cy="1105054"/>
+            <wp:effectExtent l="0" t="0" r="0" b="0"/>
+            <wp:docPr id="156" name="Imagem 156"/>
+            <wp:cNvGraphicFramePr>
+              <a:graphicFrameLocks xmlns:a="http://schemas.openxmlformats.org/drawingml/2006/main" noChangeAspect="1"/>
+            </wp:cNvGraphicFramePr>
+            <a:graphic xmlns:a="http://schemas.openxmlformats.org/drawingml/2006/main">
+              <a:graphicData uri="http://schemas.openxmlformats.org/drawingml/2006/picture">
+                <pic:pic xmlns:pic="http://schemas.openxmlformats.org/drawingml/2006/picture">
+                  <pic:nvPicPr>
+                    <pic:cNvPr id="1" name=""/>
+                    <pic:cNvPicPr/>
+                  </pic:nvPicPr>
+                  <pic:blipFill>
+                    <a:blip r:embed="rId129"/>
+                    <a:stretch>
+                      <a:fillRect/>
+                    </a:stretch>
+                  </pic:blipFill>
+                  <pic:spPr>
+                    <a:xfrm>
+                      <a:off x="0" y="0"/>
+                      <a:ext cx="3715268" cy="1105054"/>
+                    </a:xfrm>
+                    <a:prstGeom prst="rect">
+                      <a:avLst/>
+                    </a:prstGeom>
+                  </pic:spPr>
+                </pic:pic>
+              </a:graphicData>
+            </a:graphic>
+          </wp:inline>
+        </w:drawing>
+      </w:r>
+      <w:r>
+        <w:t xml:space="preserve"> </w:t>
+      </w:r>
+    </w:p>
+    <w:p>
+      <w:r>
+        <w:t xml:space="preserve">74 </w:t>
+      </w:r>
+      <w:r>
+        <w:t>–</w:t>
+      </w:r>
+      <w:r>
+        <w:t xml:space="preserve"> </w:t>
+      </w:r>
+      <w:r>
+        <w:t xml:space="preserve">Quando queremos que alguns campos sejam obrigatórios no formulário, usamos o </w:t>
+      </w:r>
+      <w:proofErr w:type="spellStart"/>
+      <w:r>
+        <w:t>required</w:t>
+      </w:r>
+      <w:proofErr w:type="spellEnd"/>
+      <w:r>
+        <w:t xml:space="preserve"> no input (</w:t>
+      </w:r>
+      <w:proofErr w:type="spellStart"/>
+      <w:r>
+        <w:t>obs</w:t>
+      </w:r>
+      <w:proofErr w:type="spellEnd"/>
+      <w:r>
+        <w:t>: se usamos o tipo de input correto, por exemplo e-mail, se não estiver correto a grafia ele também não enviara)</w:t>
+      </w:r>
+    </w:p>
+    <w:p>
+      <w:r>
+        <w:drawing>
+          <wp:inline distT="0" distB="0" distL="0" distR="0" wp14:anchorId="6946B6E1" wp14:editId="58E2C874">
+            <wp:extent cx="4810796" cy="1590897"/>
+            <wp:effectExtent l="0" t="0" r="8890" b="9525"/>
+            <wp:docPr id="159" name="Imagem 159"/>
+            <wp:cNvGraphicFramePr>
+              <a:graphicFrameLocks xmlns:a="http://schemas.openxmlformats.org/drawingml/2006/main" noChangeAspect="1"/>
+            </wp:cNvGraphicFramePr>
+            <a:graphic xmlns:a="http://schemas.openxmlformats.org/drawingml/2006/main">
+              <a:graphicData uri="http://schemas.openxmlformats.org/drawingml/2006/picture">
+                <pic:pic xmlns:pic="http://schemas.openxmlformats.org/drawingml/2006/picture">
+                  <pic:nvPicPr>
+                    <pic:cNvPr id="1" name=""/>
+                    <pic:cNvPicPr/>
+                  </pic:nvPicPr>
+                  <pic:blipFill>
+                    <a:blip r:embed="rId130"/>
+                    <a:stretch>
+                      <a:fillRect/>
+                    </a:stretch>
+                  </pic:blipFill>
+                  <pic:spPr>
+                    <a:xfrm>
+                      <a:off x="0" y="0"/>
+                      <a:ext cx="4810796" cy="1590897"/>
+                    </a:xfrm>
+                    <a:prstGeom prst="rect">
+                      <a:avLst/>
+                    </a:prstGeom>
+                  </pic:spPr>
+                </pic:pic>
+              </a:graphicData>
+            </a:graphic>
+          </wp:inline>
+        </w:drawing>
+      </w:r>
+    </w:p>
+    <w:p>
+      <w:r>
+        <w:t xml:space="preserve">75 </w:t>
+      </w:r>
+      <w:r>
+        <w:t>–</w:t>
+      </w:r>
+      <w:r>
+        <w:t xml:space="preserve"> </w:t>
+      </w:r>
+      <w:r>
+        <w:t xml:space="preserve">Utilizamos o </w:t>
+      </w:r>
+      <w:proofErr w:type="spellStart"/>
+      <w:r>
+        <w:t>placeholder</w:t>
+      </w:r>
+      <w:proofErr w:type="spellEnd"/>
+      <w:r>
+        <w:t xml:space="preserve"> para deixar exemplo dentro dos inputs como dever ser preenchido.</w:t>
+      </w:r>
+    </w:p>
+    <w:p>
+      <w:r>
+        <w:drawing>
+          <wp:inline distT="0" distB="0" distL="0" distR="0" wp14:anchorId="4ADCE183" wp14:editId="16C43450">
+            <wp:extent cx="6296904" cy="1143160"/>
+            <wp:effectExtent l="0" t="0" r="0" b="0"/>
+            <wp:docPr id="160" name="Imagem 160"/>
+            <wp:cNvGraphicFramePr>
+              <a:graphicFrameLocks xmlns:a="http://schemas.openxmlformats.org/drawingml/2006/main" noChangeAspect="1"/>
+            </wp:cNvGraphicFramePr>
+            <a:graphic xmlns:a="http://schemas.openxmlformats.org/drawingml/2006/main">
+              <a:graphicData uri="http://schemas.openxmlformats.org/drawingml/2006/picture">
+                <pic:pic xmlns:pic="http://schemas.openxmlformats.org/drawingml/2006/picture">
+                  <pic:nvPicPr>
+                    <pic:cNvPr id="1" name=""/>
+                    <pic:cNvPicPr/>
+                  </pic:nvPicPr>
+                  <pic:blipFill>
+                    <a:blip r:embed="rId131"/>
+                    <a:stretch>
+                      <a:fillRect/>
+                    </a:stretch>
+                  </pic:blipFill>
+                  <pic:spPr>
+                    <a:xfrm>
+                      <a:off x="0" y="0"/>
+                      <a:ext cx="6296904" cy="1143160"/>
+                    </a:xfrm>
+                    <a:prstGeom prst="rect">
+                      <a:avLst/>
+                    </a:prstGeom>
+                  </pic:spPr>
+                </pic:pic>
+              </a:graphicData>
+            </a:graphic>
+          </wp:inline>
+        </w:drawing>
+      </w:r>
+    </w:p>
+    <w:p>
+      <w:r>
+        <w:drawing>
+          <wp:inline distT="0" distB="0" distL="0" distR="0" wp14:anchorId="5F1BA740" wp14:editId="42EC1CFD">
+            <wp:extent cx="4105848" cy="1419423"/>
+            <wp:effectExtent l="0" t="0" r="9525" b="9525"/>
+            <wp:docPr id="161" name="Imagem 161"/>
+            <wp:cNvGraphicFramePr>
+              <a:graphicFrameLocks xmlns:a="http://schemas.openxmlformats.org/drawingml/2006/main" noChangeAspect="1"/>
+            </wp:cNvGraphicFramePr>
+            <a:graphic xmlns:a="http://schemas.openxmlformats.org/drawingml/2006/main">
+              <a:graphicData uri="http://schemas.openxmlformats.org/drawingml/2006/picture">
+                <pic:pic xmlns:pic="http://schemas.openxmlformats.org/drawingml/2006/picture">
+                  <pic:nvPicPr>
+                    <pic:cNvPr id="1" name=""/>
+                    <pic:cNvPicPr/>
+                  </pic:nvPicPr>
+                  <pic:blipFill>
+                    <a:blip r:embed="rId132"/>
+                    <a:stretch>
+                      <a:fillRect/>
+                    </a:stretch>
+                  </pic:blipFill>
+                  <pic:spPr>
+                    <a:xfrm>
+                      <a:off x="0" y="0"/>
+                      <a:ext cx="4105848" cy="1419423"/>
+                    </a:xfrm>
+                    <a:prstGeom prst="rect">
+                      <a:avLst/>
+                    </a:prstGeom>
+                  </pic:spPr>
+                </pic:pic>
+              </a:graphicData>
+            </a:graphic>
+          </wp:inline>
+        </w:drawing>
+      </w:r>
+    </w:p>
+    <w:p>
+      <w:r>
+        <w:t xml:space="preserve">76 – Trocamos </w:t>
+      </w:r>
+      <w:r>
+        <w:t xml:space="preserve">as </w:t>
+      </w:r>
+      <w:proofErr w:type="spellStart"/>
+      <w:r>
+        <w:t>div</w:t>
+      </w:r>
+      <w:proofErr w:type="spellEnd"/>
+      <w:r>
+        <w:t xml:space="preserve"> do formulário por </w:t>
+      </w:r>
+      <w:proofErr w:type="spellStart"/>
+      <w:proofErr w:type="gramStart"/>
+      <w:r>
+        <w:t>fieldset</w:t>
+      </w:r>
+      <w:proofErr w:type="spellEnd"/>
+      <w:r>
+        <w:t>(</w:t>
+      </w:r>
+      <w:proofErr w:type="gramEnd"/>
+      <w:r>
+        <w:t xml:space="preserve">conjuntos de campos) e os parágrafos por </w:t>
+      </w:r>
+      <w:proofErr w:type="spellStart"/>
+      <w:r>
+        <w:t>legend</w:t>
+      </w:r>
+      <w:proofErr w:type="spellEnd"/>
+      <w:r>
+        <w:t xml:space="preserve">, sendo uma melhor forma de trabalhar quando estamos tratando de formulário, no </w:t>
+      </w:r>
+      <w:proofErr w:type="spellStart"/>
+      <w:r>
+        <w:t>css</w:t>
+      </w:r>
+      <w:proofErr w:type="spellEnd"/>
+      <w:r>
+        <w:t xml:space="preserve"> as legenda ficaram com as mesmas configurações das </w:t>
+      </w:r>
+      <w:proofErr w:type="spellStart"/>
+      <w:r>
+        <w:t>label</w:t>
+      </w:r>
+      <w:proofErr w:type="spellEnd"/>
+      <w:r>
+        <w:t>.</w:t>
+      </w:r>
+    </w:p>
+    <w:p>
+      <w:r>
+        <w:drawing>
+          <wp:inline distT="0" distB="0" distL="0" distR="0" wp14:anchorId="0C8B99CF" wp14:editId="1DA0A62F">
+            <wp:extent cx="4489295" cy="4324962"/>
+            <wp:effectExtent l="0" t="0" r="6985" b="0"/>
+            <wp:docPr id="162" name="Imagem 162"/>
+            <wp:cNvGraphicFramePr>
+              <a:graphicFrameLocks xmlns:a="http://schemas.openxmlformats.org/drawingml/2006/main" noChangeAspect="1"/>
+            </wp:cNvGraphicFramePr>
+            <a:graphic xmlns:a="http://schemas.openxmlformats.org/drawingml/2006/main">
+              <a:graphicData uri="http://schemas.openxmlformats.org/drawingml/2006/picture">
+                <pic:pic xmlns:pic="http://schemas.openxmlformats.org/drawingml/2006/picture">
+                  <pic:nvPicPr>
+                    <pic:cNvPr id="1" name=""/>
+                    <pic:cNvPicPr/>
+                  </pic:nvPicPr>
+                  <pic:blipFill>
+                    <a:blip r:embed="rId133"/>
+                    <a:stretch>
+                      <a:fillRect/>
+                    </a:stretch>
+                  </pic:blipFill>
+                  <pic:spPr>
+                    <a:xfrm>
+                      <a:off x="0" y="0"/>
+                      <a:ext cx="4507416" cy="4342419"/>
+                    </a:xfrm>
+                    <a:prstGeom prst="rect">
+                      <a:avLst/>
+                    </a:prstGeom>
+                  </pic:spPr>
+                </pic:pic>
+              </a:graphicData>
+            </a:graphic>
+          </wp:inline>
+        </w:drawing>
+      </w:r>
+      <w:r>
+        <w:drawing>
+          <wp:inline distT="0" distB="0" distL="0" distR="0" wp14:anchorId="5A8932F3" wp14:editId="0AF5A3F6">
+            <wp:extent cx="3994001" cy="2390775"/>
+            <wp:effectExtent l="0" t="0" r="6985" b="0"/>
+            <wp:docPr id="163" name="Imagem 163"/>
+            <wp:cNvGraphicFramePr>
+              <a:graphicFrameLocks xmlns:a="http://schemas.openxmlformats.org/drawingml/2006/main" noChangeAspect="1"/>
+            </wp:cNvGraphicFramePr>
+            <a:graphic xmlns:a="http://schemas.openxmlformats.org/drawingml/2006/main">
+              <a:graphicData uri="http://schemas.openxmlformats.org/drawingml/2006/picture">
+                <pic:pic xmlns:pic="http://schemas.openxmlformats.org/drawingml/2006/picture">
+                  <pic:nvPicPr>
+                    <pic:cNvPr id="1" name=""/>
+                    <pic:cNvPicPr/>
+                  </pic:nvPicPr>
+                  <pic:blipFill>
+                    <a:blip r:embed="rId134"/>
+                    <a:stretch>
+                      <a:fillRect/>
+                    </a:stretch>
+                  </pic:blipFill>
+                  <pic:spPr>
+                    <a:xfrm>
+                      <a:off x="0" y="0"/>
+                      <a:ext cx="4014533" cy="2403066"/>
+                    </a:xfrm>
+                    <a:prstGeom prst="rect">
+                      <a:avLst/>
+                    </a:prstGeom>
+                  </pic:spPr>
+                </pic:pic>
+              </a:graphicData>
+            </a:graphic>
+          </wp:inline>
+        </w:drawing>
+      </w:r>
+      <w:r>
+        <w:t xml:space="preserve"> </w:t>
+      </w:r>
+    </w:p>
+    <w:p>
+      <w:r>
+        <w:t xml:space="preserve">77 – No </w:t>
+      </w:r>
+      <w:proofErr w:type="spellStart"/>
+      <w:r>
+        <w:t>html</w:t>
+      </w:r>
+      <w:proofErr w:type="spellEnd"/>
+      <w:r>
+        <w:t xml:space="preserve"> inserimos uma </w:t>
+      </w:r>
+      <w:proofErr w:type="spellStart"/>
+      <w:r>
+        <w:t>class</w:t>
+      </w:r>
+      <w:proofErr w:type="spellEnd"/>
+      <w:r>
+        <w:t xml:space="preserve"> enviar, no botão e no </w:t>
+      </w:r>
+      <w:proofErr w:type="spellStart"/>
+      <w:r>
+        <w:t>css</w:t>
+      </w:r>
+      <w:proofErr w:type="spellEnd"/>
+      <w:r>
+        <w:t>, aumentamos a largura e o espaço interno tanto para cima como para baixo.</w:t>
+      </w:r>
+    </w:p>
+    <w:p>
+      <w:r>
+        <w:drawing>
+          <wp:inline distT="0" distB="0" distL="0" distR="0" wp14:anchorId="1204C758" wp14:editId="166C17FC">
+            <wp:extent cx="4286534" cy="352425"/>
+            <wp:effectExtent l="0" t="0" r="0" b="0"/>
+            <wp:docPr id="165" name="Imagem 165"/>
+            <wp:cNvGraphicFramePr>
+              <a:graphicFrameLocks xmlns:a="http://schemas.openxmlformats.org/drawingml/2006/main" noChangeAspect="1"/>
+            </wp:cNvGraphicFramePr>
+            <a:graphic xmlns:a="http://schemas.openxmlformats.org/drawingml/2006/main">
+              <a:graphicData uri="http://schemas.openxmlformats.org/drawingml/2006/picture">
+                <pic:pic xmlns:pic="http://schemas.openxmlformats.org/drawingml/2006/picture">
+                  <pic:nvPicPr>
+                    <pic:cNvPr id="1" name=""/>
+                    <pic:cNvPicPr/>
+                  </pic:nvPicPr>
+                  <pic:blipFill>
+                    <a:blip r:embed="rId135"/>
+                    <a:stretch>
+                      <a:fillRect/>
+                    </a:stretch>
+                  </pic:blipFill>
+                  <pic:spPr>
+                    <a:xfrm>
+                      <a:off x="0" y="0"/>
+                      <a:ext cx="4420198" cy="363414"/>
+                    </a:xfrm>
+                    <a:prstGeom prst="rect">
+                      <a:avLst/>
+                    </a:prstGeom>
+                  </pic:spPr>
+                </pic:pic>
+              </a:graphicData>
+            </a:graphic>
+          </wp:inline>
+        </w:drawing>
+      </w:r>
+      <w:r>
+        <w:drawing>
+          <wp:inline distT="0" distB="0" distL="0" distR="0" wp14:anchorId="369E3B0B" wp14:editId="3B9FCFF8">
+            <wp:extent cx="1132130" cy="771525"/>
+            <wp:effectExtent l="0" t="0" r="0" b="0"/>
+            <wp:docPr id="166" name="Imagem 166"/>
+            <wp:cNvGraphicFramePr>
+              <a:graphicFrameLocks xmlns:a="http://schemas.openxmlformats.org/drawingml/2006/main" noChangeAspect="1"/>
+            </wp:cNvGraphicFramePr>
+            <a:graphic xmlns:a="http://schemas.openxmlformats.org/drawingml/2006/main">
+              <a:graphicData uri="http://schemas.openxmlformats.org/drawingml/2006/picture">
+                <pic:pic xmlns:pic="http://schemas.openxmlformats.org/drawingml/2006/picture">
+                  <pic:nvPicPr>
+                    <pic:cNvPr id="1" name=""/>
+                    <pic:cNvPicPr/>
+                  </pic:nvPicPr>
+                  <pic:blipFill>
+                    <a:blip r:embed="rId136"/>
+                    <a:stretch>
+                      <a:fillRect/>
+                    </a:stretch>
+                  </pic:blipFill>
+                  <pic:spPr>
+                    <a:xfrm>
+                      <a:off x="0" y="0"/>
+                      <a:ext cx="1171044" cy="798044"/>
+                    </a:xfrm>
+                    <a:prstGeom prst="rect">
+                      <a:avLst/>
+                    </a:prstGeom>
+                  </pic:spPr>
+                </pic:pic>
+              </a:graphicData>
+            </a:graphic>
+          </wp:inline>
+        </w:drawing>
+      </w:r>
+    </w:p>
+    <w:p>
+      <w:r>
+        <w:t>78 – Ainda trabalhando com o botão de enviar, fizemos.</w:t>
+      </w:r>
+    </w:p>
+    <w:p>
+      <w:pPr>
+        <w:pStyle w:val="PargrafodaLista"/>
+        <w:numPr>
+          <w:ilvl w:val="0"/>
+          <w:numId w:val="3"/>
+        </w:numPr>
+      </w:pPr>
+      <w:r>
+        <w:t xml:space="preserve">Colocamos uma cor de fundo </w:t>
+      </w:r>
+    </w:p>
+    <w:p>
+      <w:pPr>
+        <w:pStyle w:val="PargrafodaLista"/>
+        <w:numPr>
+          <w:ilvl w:val="0"/>
+          <w:numId w:val="3"/>
+        </w:numPr>
+      </w:pPr>
+      <w:r>
+        <w:t>Mudamos a cor da letra para branco</w:t>
+      </w:r>
+    </w:p>
+    <w:p>
+      <w:pPr>
+        <w:pStyle w:val="PargrafodaLista"/>
+        <w:numPr>
+          <w:ilvl w:val="0"/>
+          <w:numId w:val="3"/>
+        </w:numPr>
+      </w:pPr>
+      <w:r>
+        <w:t xml:space="preserve">Deixamos o texto mais encorpado e negrito </w:t>
+      </w:r>
+    </w:p>
+    <w:p>
+      <w:pPr>
+        <w:pStyle w:val="PargrafodaLista"/>
+        <w:numPr>
+          <w:ilvl w:val="0"/>
+          <w:numId w:val="3"/>
+        </w:numPr>
+      </w:pPr>
+      <w:r>
+        <w:t xml:space="preserve">Aumentamos o tamanho da fonte </w:t>
+      </w:r>
+    </w:p>
+    <w:p>
+      <w:pPr>
+        <w:pStyle w:val="PargrafodaLista"/>
+        <w:numPr>
+          <w:ilvl w:val="0"/>
+          <w:numId w:val="3"/>
+        </w:numPr>
+      </w:pPr>
+      <w:r>
+        <w:t>Tiramos a borda do botão</w:t>
+      </w:r>
+    </w:p>
+    <w:p>
+      <w:pPr>
+        <w:pStyle w:val="PargrafodaLista"/>
+        <w:numPr>
+          <w:ilvl w:val="0"/>
+          <w:numId w:val="3"/>
+        </w:numPr>
+      </w:pPr>
+      <w:r>
+        <w:t xml:space="preserve">Arredondamos os cantos </w:t>
+      </w:r>
+    </w:p>
+    <w:p>
+      <w:r>
+        <w:drawing>
+          <wp:inline distT="0" distB="0" distL="0" distR="0" wp14:anchorId="29AF612E" wp14:editId="77D0AA9D">
+            <wp:extent cx="2390775" cy="1984794"/>
+            <wp:effectExtent l="0" t="0" r="0" b="0"/>
+            <wp:docPr id="167" name="Imagem 167"/>
+            <wp:cNvGraphicFramePr>
+              <a:graphicFrameLocks xmlns:a="http://schemas.openxmlformats.org/drawingml/2006/main" noChangeAspect="1"/>
+            </wp:cNvGraphicFramePr>
+            <a:graphic xmlns:a="http://schemas.openxmlformats.org/drawingml/2006/main">
+              <a:graphicData uri="http://schemas.openxmlformats.org/drawingml/2006/picture">
+                <pic:pic xmlns:pic="http://schemas.openxmlformats.org/drawingml/2006/picture">
+                  <pic:nvPicPr>
+                    <pic:cNvPr id="1" name=""/>
+                    <pic:cNvPicPr/>
+                  </pic:nvPicPr>
+                  <pic:blipFill>
+                    <a:blip r:embed="rId137"/>
+                    <a:stretch>
+                      <a:fillRect/>
+                    </a:stretch>
+                  </pic:blipFill>
+                  <pic:spPr>
+                    <a:xfrm>
+                      <a:off x="0" y="0"/>
+                      <a:ext cx="2403594" cy="1995436"/>
+                    </a:xfrm>
+                    <a:prstGeom prst="rect">
+                      <a:avLst/>
+                    </a:prstGeom>
+                  </pic:spPr>
+                </pic:pic>
+              </a:graphicData>
+            </a:graphic>
+          </wp:inline>
+        </w:drawing>
+      </w:r>
       <w:bookmarkStart w:id="0" w:name="_GoBack"/>
       <w:bookmarkEnd w:id="0"/>
     </w:p>
+    <w:p/>
     <w:p/>
     <w:p/>
     <w:sectPr>
@@ -10565,7 +11729,7 @@
 </file>
 
 <file path=customXml/itemProps4.xml><?xml version="1.0" encoding="utf-8"?>
-<ds:datastoreItem xmlns:ds="http://schemas.openxmlformats.org/officeDocument/2006/customXml" ds:itemID="{1A7A5B01-0F21-4BF8-84C2-E94B505A2591}">
+<ds:datastoreItem xmlns:ds="http://schemas.openxmlformats.org/officeDocument/2006/customXml" ds:itemID="{362C4458-1C68-42F3-BB9B-807EA2B055E8}">
   <ds:schemaRefs>
     <ds:schemaRef ds:uri="http://schemas.openxmlformats.org/officeDocument/2006/bibliography"/>
   </ds:schemaRefs>

</xml_diff>

<commit_message>
atualização da aula dia 24/09/2026
</commit_message>
<xml_diff>
--- a/apostila/Projeto Space for me3.docx
+++ b/apostila/Projeto Space for me3.docx
@@ -14009,6 +14009,7 @@
       <w:r>
         <w:rPr>
           <w:i/>
+          <w:noProof/>
         </w:rPr>
         <w:drawing>
           <wp:inline distT="0" distB="0" distL="0" distR="0" wp14:anchorId="3C4730E1" wp14:editId="122AFC69">
@@ -14131,6 +14132,7 @@
       <w:r>
         <w:rPr>
           <w:i/>
+          <w:noProof/>
         </w:rPr>
         <w:drawing>
           <wp:inline distT="0" distB="0" distL="0" distR="0" wp14:anchorId="48785655" wp14:editId="4B94C668">
@@ -14233,6 +14235,7 @@
       <w:r>
         <w:rPr>
           <w:i/>
+          <w:noProof/>
         </w:rPr>
         <w:drawing>
           <wp:inline distT="0" distB="0" distL="0" distR="0" wp14:anchorId="475DFE07" wp14:editId="7BE7384B">
@@ -14334,6 +14337,7 @@
       <w:r>
         <w:rPr>
           <w:i/>
+          <w:noProof/>
         </w:rPr>
         <w:drawing>
           <wp:inline distT="0" distB="0" distL="0" distR="0" wp14:anchorId="46F40216" wp14:editId="1A00D21F">
@@ -14490,6 +14494,7 @@
       <w:r>
         <w:rPr>
           <w:i/>
+          <w:noProof/>
         </w:rPr>
         <w:drawing>
           <wp:inline distT="0" distB="0" distL="0" distR="0" wp14:anchorId="4A0C3A9E" wp14:editId="5231AB86">
@@ -14530,6 +14535,7 @@
       <w:r>
         <w:rPr>
           <w:i/>
+          <w:noProof/>
         </w:rPr>
         <w:drawing>
           <wp:inline distT="0" distB="0" distL="0" distR="0" wp14:anchorId="322A917D" wp14:editId="261C3EE1">
@@ -14567,10 +14573,1111 @@
           </wp:inline>
         </w:drawing>
       </w:r>
+    </w:p>
+    <w:p>
+      <w:pPr>
+        <w:rPr>
+          <w:i/>
+        </w:rPr>
+      </w:pPr>
+      <w:r>
+        <w:rPr>
+          <w:i/>
+        </w:rPr>
+        <w:t xml:space="preserve">84 </w:t>
+      </w:r>
+      <w:r>
+        <w:rPr>
+          <w:i/>
+        </w:rPr>
+        <w:t>–</w:t>
+      </w:r>
+      <w:r>
+        <w:rPr>
+          <w:i/>
+        </w:rPr>
+        <w:t xml:space="preserve"> </w:t>
+      </w:r>
+      <w:r>
+        <w:rPr>
+          <w:i/>
+        </w:rPr>
+        <w:t xml:space="preserve">Aumentamos a largura da imagem do banner para ocupar 100% de espaço na página, demos uma largura para o </w:t>
+      </w:r>
+      <w:proofErr w:type="spellStart"/>
+      <w:r>
+        <w:rPr>
+          <w:i/>
+        </w:rPr>
+        <w:t>main</w:t>
+      </w:r>
+      <w:proofErr w:type="spellEnd"/>
+      <w:r>
+        <w:rPr>
+          <w:i/>
+        </w:rPr>
+        <w:t xml:space="preserve"> e centralizamos o conteúdo dentro dele.</w:t>
+      </w:r>
+    </w:p>
+    <w:p>
+      <w:pPr>
+        <w:rPr>
+          <w:i/>
+        </w:rPr>
+      </w:pPr>
+      <w:r>
+        <w:rPr>
+          <w:i/>
+        </w:rPr>
+        <w:drawing>
+          <wp:inline distT="0" distB="0" distL="0" distR="0" wp14:anchorId="09C6FC73" wp14:editId="31CF7543">
+            <wp:extent cx="1381318" cy="1133633"/>
+            <wp:effectExtent l="0" t="0" r="9525" b="9525"/>
+            <wp:docPr id="173" name="Imagem 173"/>
+            <wp:cNvGraphicFramePr>
+              <a:graphicFrameLocks xmlns:a="http://schemas.openxmlformats.org/drawingml/2006/main" noChangeAspect="1"/>
+            </wp:cNvGraphicFramePr>
+            <a:graphic xmlns:a="http://schemas.openxmlformats.org/drawingml/2006/main">
+              <a:graphicData uri="http://schemas.openxmlformats.org/drawingml/2006/picture">
+                <pic:pic xmlns:pic="http://schemas.openxmlformats.org/drawingml/2006/picture">
+                  <pic:nvPicPr>
+                    <pic:cNvPr id="1" name=""/>
+                    <pic:cNvPicPr/>
+                  </pic:nvPicPr>
+                  <pic:blipFill>
+                    <a:blip r:embed="rId144"/>
+                    <a:stretch>
+                      <a:fillRect/>
+                    </a:stretch>
+                  </pic:blipFill>
+                  <pic:spPr>
+                    <a:xfrm>
+                      <a:off x="0" y="0"/>
+                      <a:ext cx="1381318" cy="1133633"/>
+                    </a:xfrm>
+                    <a:prstGeom prst="rect">
+                      <a:avLst/>
+                    </a:prstGeom>
+                  </pic:spPr>
+                </pic:pic>
+              </a:graphicData>
+            </a:graphic>
+          </wp:inline>
+        </w:drawing>
+      </w:r>
+    </w:p>
+    <w:p>
+      <w:pPr>
+        <w:rPr>
+          <w:i/>
+        </w:rPr>
+      </w:pPr>
+      <w:r>
+        <w:rPr>
+          <w:i/>
+        </w:rPr>
+        <w:t xml:space="preserve">85 – Na página do index.html trocamos as </w:t>
+      </w:r>
+      <w:proofErr w:type="spellStart"/>
+      <w:r>
+        <w:rPr>
+          <w:i/>
+        </w:rPr>
+        <w:t>div</w:t>
+      </w:r>
+      <w:proofErr w:type="spellEnd"/>
+      <w:r>
+        <w:rPr>
+          <w:i/>
+        </w:rPr>
+        <w:t xml:space="preserve"> por </w:t>
+      </w:r>
+      <w:proofErr w:type="spellStart"/>
+      <w:r>
+        <w:rPr>
+          <w:i/>
+        </w:rPr>
+        <w:t>section</w:t>
+      </w:r>
+      <w:proofErr w:type="spellEnd"/>
+      <w:r>
+        <w:rPr>
+          <w:i/>
+        </w:rPr>
+        <w:t xml:space="preserve">, a diferença entre </w:t>
+      </w:r>
+      <w:proofErr w:type="spellStart"/>
+      <w:r>
+        <w:rPr>
+          <w:i/>
+        </w:rPr>
+        <w:t>div</w:t>
+      </w:r>
+      <w:proofErr w:type="spellEnd"/>
+      <w:r>
+        <w:rPr>
+          <w:i/>
+        </w:rPr>
+        <w:t xml:space="preserve"> e </w:t>
+      </w:r>
+      <w:proofErr w:type="spellStart"/>
+      <w:r>
+        <w:rPr>
+          <w:i/>
+        </w:rPr>
+        <w:t>section</w:t>
+      </w:r>
+      <w:proofErr w:type="spellEnd"/>
+      <w:r>
+        <w:rPr>
+          <w:i/>
+        </w:rPr>
+        <w:t xml:space="preserve"> e que a </w:t>
+      </w:r>
+      <w:proofErr w:type="spellStart"/>
+      <w:r>
+        <w:rPr>
+          <w:i/>
+        </w:rPr>
+        <w:t>div</w:t>
+      </w:r>
+      <w:proofErr w:type="spellEnd"/>
+      <w:r>
+        <w:rPr>
+          <w:i/>
+        </w:rPr>
+        <w:t xml:space="preserve"> geralmente e usada para conteúdo visual dentro dela, não necessariamente são correspondentes ao mesmo assunto.</w:t>
+      </w:r>
+    </w:p>
+    <w:p>
+      <w:pPr>
+        <w:rPr>
+          <w:i/>
+        </w:rPr>
+      </w:pPr>
+      <w:r>
+        <w:rPr>
+          <w:i/>
+        </w:rPr>
+        <w:t xml:space="preserve">Ao contrário da </w:t>
+      </w:r>
+      <w:proofErr w:type="spellStart"/>
+      <w:r>
+        <w:rPr>
+          <w:i/>
+        </w:rPr>
+        <w:t>div</w:t>
+      </w:r>
+      <w:proofErr w:type="spellEnd"/>
+      <w:r>
+        <w:rPr>
+          <w:i/>
+        </w:rPr>
+        <w:t xml:space="preserve">, a </w:t>
+      </w:r>
+      <w:proofErr w:type="spellStart"/>
+      <w:r>
+        <w:rPr>
+          <w:i/>
+        </w:rPr>
+        <w:t>section</w:t>
+      </w:r>
+      <w:proofErr w:type="spellEnd"/>
+      <w:r>
+        <w:rPr>
+          <w:i/>
+        </w:rPr>
+        <w:t xml:space="preserve"> cria uma divisão na página em que o conteúdo interno está relacionado a um único tema, ou seja, o mesmo assunto por tal motivo trocamos </w:t>
+      </w:r>
+      <w:proofErr w:type="spellStart"/>
+      <w:r>
+        <w:rPr>
+          <w:i/>
+        </w:rPr>
+        <w:t>div</w:t>
+      </w:r>
+      <w:proofErr w:type="spellEnd"/>
+      <w:r>
+        <w:rPr>
+          <w:i/>
+        </w:rPr>
+        <w:t xml:space="preserve"> principal por </w:t>
+      </w:r>
+      <w:proofErr w:type="spellStart"/>
+      <w:r>
+        <w:rPr>
+          <w:i/>
+        </w:rPr>
+        <w:t>section</w:t>
+      </w:r>
+      <w:proofErr w:type="spellEnd"/>
+      <w:r>
+        <w:rPr>
+          <w:i/>
+        </w:rPr>
+        <w:t xml:space="preserve"> e a </w:t>
+      </w:r>
+      <w:proofErr w:type="spellStart"/>
+      <w:r>
+        <w:rPr>
+          <w:i/>
+        </w:rPr>
+        <w:t>div</w:t>
+      </w:r>
+      <w:proofErr w:type="spellEnd"/>
+      <w:r>
+        <w:rPr>
+          <w:i/>
+        </w:rPr>
+        <w:t xml:space="preserve"> benefícios.</w:t>
+      </w:r>
+    </w:p>
+    <w:p>
+      <w:pPr>
+        <w:rPr>
+          <w:i/>
+        </w:rPr>
+      </w:pPr>
+      <w:r>
+        <w:rPr>
+          <w:i/>
+        </w:rPr>
+        <w:drawing>
+          <wp:inline distT="0" distB="0" distL="0" distR="0" wp14:anchorId="062330EC" wp14:editId="0F1888A2">
+            <wp:extent cx="1752845" cy="171474"/>
+            <wp:effectExtent l="0" t="0" r="0" b="0"/>
+            <wp:docPr id="174" name="Imagem 174"/>
+            <wp:cNvGraphicFramePr>
+              <a:graphicFrameLocks xmlns:a="http://schemas.openxmlformats.org/drawingml/2006/main" noChangeAspect="1"/>
+            </wp:cNvGraphicFramePr>
+            <a:graphic xmlns:a="http://schemas.openxmlformats.org/drawingml/2006/main">
+              <a:graphicData uri="http://schemas.openxmlformats.org/drawingml/2006/picture">
+                <pic:pic xmlns:pic="http://schemas.openxmlformats.org/drawingml/2006/picture">
+                  <pic:nvPicPr>
+                    <pic:cNvPr id="1" name=""/>
+                    <pic:cNvPicPr/>
+                  </pic:nvPicPr>
+                  <pic:blipFill>
+                    <a:blip r:embed="rId145"/>
+                    <a:stretch>
+                      <a:fillRect/>
+                    </a:stretch>
+                  </pic:blipFill>
+                  <pic:spPr>
+                    <a:xfrm>
+                      <a:off x="0" y="0"/>
+                      <a:ext cx="1752845" cy="171474"/>
+                    </a:xfrm>
+                    <a:prstGeom prst="rect">
+                      <a:avLst/>
+                    </a:prstGeom>
+                  </pic:spPr>
+                </pic:pic>
+              </a:graphicData>
+            </a:graphic>
+          </wp:inline>
+        </w:drawing>
+      </w:r>
+      <w:r>
+        <w:rPr>
+          <w:i/>
+        </w:rPr>
+        <w:drawing>
+          <wp:inline distT="0" distB="0" distL="0" distR="0" wp14:anchorId="7B2C755E" wp14:editId="739F8F41">
+            <wp:extent cx="1800476" cy="247685"/>
+            <wp:effectExtent l="0" t="0" r="0" b="0"/>
+            <wp:docPr id="175" name="Imagem 175"/>
+            <wp:cNvGraphicFramePr>
+              <a:graphicFrameLocks xmlns:a="http://schemas.openxmlformats.org/drawingml/2006/main" noChangeAspect="1"/>
+            </wp:cNvGraphicFramePr>
+            <a:graphic xmlns:a="http://schemas.openxmlformats.org/drawingml/2006/main">
+              <a:graphicData uri="http://schemas.openxmlformats.org/drawingml/2006/picture">
+                <pic:pic xmlns:pic="http://schemas.openxmlformats.org/drawingml/2006/picture">
+                  <pic:nvPicPr>
+                    <pic:cNvPr id="1" name=""/>
+                    <pic:cNvPicPr/>
+                  </pic:nvPicPr>
+                  <pic:blipFill>
+                    <a:blip r:embed="rId146"/>
+                    <a:stretch>
+                      <a:fillRect/>
+                    </a:stretch>
+                  </pic:blipFill>
+                  <pic:spPr>
+                    <a:xfrm>
+                      <a:off x="0" y="0"/>
+                      <a:ext cx="1800476" cy="247685"/>
+                    </a:xfrm>
+                    <a:prstGeom prst="rect">
+                      <a:avLst/>
+                    </a:prstGeom>
+                  </pic:spPr>
+                </pic:pic>
+              </a:graphicData>
+            </a:graphic>
+          </wp:inline>
+        </w:drawing>
+      </w:r>
+    </w:p>
+    <w:p>
+      <w:pPr>
+        <w:rPr>
+          <w:i/>
+        </w:rPr>
+      </w:pPr>
+      <w:r>
+        <w:rPr>
+          <w:i/>
+        </w:rPr>
+        <w:t xml:space="preserve">86 – </w:t>
+      </w:r>
+      <w:r>
+        <w:rPr>
+          <w:i/>
+        </w:rPr>
+        <w:t xml:space="preserve">Adicionamos a </w:t>
+      </w:r>
+      <w:proofErr w:type="spellStart"/>
+      <w:r>
+        <w:rPr>
+          <w:i/>
+        </w:rPr>
+        <w:t>class</w:t>
+      </w:r>
+      <w:proofErr w:type="spellEnd"/>
+      <w:r>
+        <w:rPr>
+          <w:i/>
+        </w:rPr>
+        <w:t xml:space="preserve"> título-principal, no h2 e h3 da nossa página centralizando os subtítulos e aumentando o tamanho da fonte utilizando a medida (em) que significa por exemplo: 1em e igual a medida padrão do navegador, 2em e o dobro da medida padrão, e assim por diante ao utilizarmos.</w:t>
+      </w:r>
+    </w:p>
+    <w:p>
+      <w:pPr>
+        <w:rPr>
+          <w:i/>
+        </w:rPr>
+      </w:pPr>
+      <w:r>
+        <w:rPr>
+          <w:i/>
+        </w:rPr>
+        <w:t xml:space="preserve">E para finalizar colocamos um espaço externo para baixo, de 1em aproximadamente 16px com </w:t>
+      </w:r>
+      <w:proofErr w:type="spellStart"/>
+      <w:r>
+        <w:rPr>
+          <w:i/>
+        </w:rPr>
+        <w:t>margin</w:t>
+      </w:r>
+      <w:proofErr w:type="spellEnd"/>
+      <w:r>
+        <w:rPr>
+          <w:i/>
+        </w:rPr>
+        <w:t xml:space="preserve">: 0 0 1em; </w:t>
+      </w:r>
+    </w:p>
+    <w:p>
+      <w:pPr>
+        <w:rPr>
+          <w:i/>
+        </w:rPr>
+      </w:pPr>
+      <w:r>
+        <w:rPr>
+          <w:i/>
+        </w:rPr>
+        <w:drawing>
+          <wp:inline distT="0" distB="0" distL="0" distR="0" wp14:anchorId="790D24ED" wp14:editId="084E936F">
+            <wp:extent cx="1333686" cy="828791"/>
+            <wp:effectExtent l="0" t="0" r="0" b="9525"/>
+            <wp:docPr id="176" name="Imagem 176"/>
+            <wp:cNvGraphicFramePr>
+              <a:graphicFrameLocks xmlns:a="http://schemas.openxmlformats.org/drawingml/2006/main" noChangeAspect="1"/>
+            </wp:cNvGraphicFramePr>
+            <a:graphic xmlns:a="http://schemas.openxmlformats.org/drawingml/2006/main">
+              <a:graphicData uri="http://schemas.openxmlformats.org/drawingml/2006/picture">
+                <pic:pic xmlns:pic="http://schemas.openxmlformats.org/drawingml/2006/picture">
+                  <pic:nvPicPr>
+                    <pic:cNvPr id="1" name=""/>
+                    <pic:cNvPicPr/>
+                  </pic:nvPicPr>
+                  <pic:blipFill>
+                    <a:blip r:embed="rId147"/>
+                    <a:stretch>
+                      <a:fillRect/>
+                    </a:stretch>
+                  </pic:blipFill>
+                  <pic:spPr>
+                    <a:xfrm>
+                      <a:off x="0" y="0"/>
+                      <a:ext cx="1333686" cy="828791"/>
+                    </a:xfrm>
+                    <a:prstGeom prst="rect">
+                      <a:avLst/>
+                    </a:prstGeom>
+                  </pic:spPr>
+                </pic:pic>
+              </a:graphicData>
+            </a:graphic>
+          </wp:inline>
+        </w:drawing>
+      </w:r>
+    </w:p>
+    <w:p>
+      <w:pPr>
+        <w:rPr>
+          <w:i/>
+        </w:rPr>
+      </w:pPr>
+      <w:r>
+        <w:rPr>
+          <w:i/>
+        </w:rPr>
+        <w:t xml:space="preserve">87 – Para colocar um espaço entre os parágrafos da nossa </w:t>
+      </w:r>
+      <w:proofErr w:type="spellStart"/>
+      <w:r>
+        <w:rPr>
+          <w:i/>
+        </w:rPr>
+        <w:t>section</w:t>
+      </w:r>
+      <w:proofErr w:type="spellEnd"/>
+      <w:r>
+        <w:rPr>
+          <w:i/>
+        </w:rPr>
+        <w:t xml:space="preserve"> principal, utilizamos o seguinte código.</w:t>
+      </w:r>
+    </w:p>
+    <w:p>
+      <w:pPr>
+        <w:rPr>
+          <w:i/>
+        </w:rPr>
+      </w:pPr>
+      <w:r>
+        <w:rPr>
+          <w:i/>
+        </w:rPr>
+        <w:drawing>
+          <wp:inline distT="0" distB="0" distL="0" distR="0" wp14:anchorId="24DB695F" wp14:editId="106617B0">
+            <wp:extent cx="1448002" cy="866896"/>
+            <wp:effectExtent l="0" t="0" r="0" b="9525"/>
+            <wp:docPr id="177" name="Imagem 177"/>
+            <wp:cNvGraphicFramePr>
+              <a:graphicFrameLocks xmlns:a="http://schemas.openxmlformats.org/drawingml/2006/main" noChangeAspect="1"/>
+            </wp:cNvGraphicFramePr>
+            <a:graphic xmlns:a="http://schemas.openxmlformats.org/drawingml/2006/main">
+              <a:graphicData uri="http://schemas.openxmlformats.org/drawingml/2006/picture">
+                <pic:pic xmlns:pic="http://schemas.openxmlformats.org/drawingml/2006/picture">
+                  <pic:nvPicPr>
+                    <pic:cNvPr id="1" name=""/>
+                    <pic:cNvPicPr/>
+                  </pic:nvPicPr>
+                  <pic:blipFill>
+                    <a:blip r:embed="rId148"/>
+                    <a:stretch>
+                      <a:fillRect/>
+                    </a:stretch>
+                  </pic:blipFill>
+                  <pic:spPr>
+                    <a:xfrm>
+                      <a:off x="0" y="0"/>
+                      <a:ext cx="1448002" cy="866896"/>
+                    </a:xfrm>
+                    <a:prstGeom prst="rect">
+                      <a:avLst/>
+                    </a:prstGeom>
+                  </pic:spPr>
+                </pic:pic>
+              </a:graphicData>
+            </a:graphic>
+          </wp:inline>
+        </w:drawing>
+      </w:r>
+    </w:p>
+    <w:p>
+      <w:pPr>
+        <w:rPr>
+          <w:i/>
+        </w:rPr>
+      </w:pPr>
+      <w:r>
+        <w:rPr>
+          <w:i/>
+        </w:rPr>
+        <w:t>88 – Utilizando o CSS como referencia para aplicar as propriedades usamos os seguintes códigos:</w:t>
+      </w:r>
+    </w:p>
+    <w:p>
+      <w:pPr>
+        <w:pStyle w:val="PargrafodaLista"/>
+        <w:numPr>
+          <w:ilvl w:val="0"/>
+          <w:numId w:val="3"/>
+        </w:numPr>
+        <w:rPr>
+          <w:i/>
+        </w:rPr>
+      </w:pPr>
+      <w:r>
+        <w:rPr>
+          <w:i/>
+        </w:rPr>
+        <w:t xml:space="preserve">Encorpamos o texto deixando em </w:t>
+      </w:r>
+      <w:r>
+        <w:rPr>
+          <w:i/>
+        </w:rPr>
+        <w:t>negrito (. principal Strong)</w:t>
+      </w:r>
+    </w:p>
+    <w:p>
+      <w:pPr>
+        <w:pStyle w:val="PargrafodaLista"/>
+        <w:numPr>
+          <w:ilvl w:val="0"/>
+          <w:numId w:val="3"/>
+        </w:numPr>
+        <w:rPr>
+          <w:i/>
+        </w:rPr>
+      </w:pPr>
+      <w:r>
+        <w:rPr>
+          <w:i/>
+        </w:rPr>
+        <w:t xml:space="preserve">Deixamos o </w:t>
+      </w:r>
+      <w:proofErr w:type="spellStart"/>
+      <w:r>
+        <w:rPr>
+          <w:i/>
+        </w:rPr>
+        <w:t>text</w:t>
+      </w:r>
+      <w:proofErr w:type="spellEnd"/>
+      <w:r>
+        <w:rPr>
+          <w:i/>
+        </w:rPr>
+        <w:t xml:space="preserve"> em </w:t>
+      </w:r>
+      <w:proofErr w:type="spellStart"/>
+      <w:r>
+        <w:rPr>
+          <w:i/>
+        </w:rPr>
+        <w:t>italic</w:t>
+      </w:r>
+      <w:proofErr w:type="spellEnd"/>
+      <w:r>
+        <w:rPr>
+          <w:i/>
+        </w:rPr>
+        <w:t xml:space="preserve"> (. principal em)</w:t>
+      </w:r>
+    </w:p>
+    <w:p>
+      <w:pPr>
+        <w:pStyle w:val="PargrafodaLista"/>
+        <w:rPr>
+          <w:i/>
+        </w:rPr>
+      </w:pPr>
+      <w:r>
+        <w:rPr>
+          <w:i/>
+          <w:noProof/>
+        </w:rPr>
+        <mc:AlternateContent>
+          <mc:Choice Requires="wps">
+            <w:drawing>
+              <wp:anchor distT="0" distB="0" distL="114300" distR="114300" simplePos="0" relativeHeight="251699200" behindDoc="0" locked="0" layoutInCell="1" allowOverlap="1" wp14:anchorId="3C436C43" wp14:editId="05C3EDE4">
+                <wp:simplePos x="0" y="0"/>
+                <wp:positionH relativeFrom="column">
+                  <wp:posOffset>2114550</wp:posOffset>
+                </wp:positionH>
+                <wp:positionV relativeFrom="paragraph">
+                  <wp:posOffset>321945</wp:posOffset>
+                </wp:positionV>
+                <wp:extent cx="838200" cy="276225"/>
+                <wp:effectExtent l="0" t="0" r="95250" b="66675"/>
+                <wp:wrapNone/>
+                <wp:docPr id="180" name="Conector de Seta Reta 180"/>
+                <wp:cNvGraphicFramePr/>
+                <a:graphic xmlns:a="http://schemas.openxmlformats.org/drawingml/2006/main">
+                  <a:graphicData uri="http://schemas.microsoft.com/office/word/2010/wordprocessingShape">
+                    <wps:wsp>
+                      <wps:cNvCnPr/>
+                      <wps:spPr>
+                        <a:xfrm>
+                          <a:off x="0" y="0"/>
+                          <a:ext cx="838200" cy="276225"/>
+                        </a:xfrm>
+                        <a:prstGeom prst="straightConnector1">
+                          <a:avLst/>
+                        </a:prstGeom>
+                        <a:ln>
+                          <a:tailEnd type="triangle"/>
+                        </a:ln>
+                      </wps:spPr>
+                      <wps:style>
+                        <a:lnRef idx="1">
+                          <a:schemeClr val="accent2"/>
+                        </a:lnRef>
+                        <a:fillRef idx="0">
+                          <a:schemeClr val="accent2"/>
+                        </a:fillRef>
+                        <a:effectRef idx="0">
+                          <a:schemeClr val="accent2"/>
+                        </a:effectRef>
+                        <a:fontRef idx="minor">
+                          <a:schemeClr val="tx1"/>
+                        </a:fontRef>
+                      </wps:style>
+                      <wps:bodyPr/>
+                    </wps:wsp>
+                  </a:graphicData>
+                </a:graphic>
+              </wp:anchor>
+            </w:drawing>
+          </mc:Choice>
+          <mc:Fallback>
+            <w:pict>
+              <v:shapetype w14:anchorId="77A815CA" id="_x0000_t32" coordsize="21600,21600" o:spt="32" o:oned="t" path="m,l21600,21600e" filled="f">
+                <v:path arrowok="t" fillok="f" o:connecttype="none"/>
+                <o:lock v:ext="edit" shapetype="t"/>
+              </v:shapetype>
+              <v:shape id="Conector de Seta Reta 180" o:spid="_x0000_s1026" type="#_x0000_t32" style="position:absolute;margin-left:166.5pt;margin-top:25.35pt;width:66pt;height:21.75pt;z-index:251699200;visibility:visible;mso-wrap-style:square;mso-wrap-distance-left:9pt;mso-wrap-distance-top:0;mso-wrap-distance-right:9pt;mso-wrap-distance-bottom:0;mso-position-horizontal:absolute;mso-position-horizontal-relative:text;mso-position-vertical:absolute;mso-position-vertical-relative:text" o:gfxdata="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" strokecolor="#ed7d31 [3205]" strokeweight=".5pt">
+                <v:stroke endarrow="block" joinstyle="miter"/>
+              </v:shape>
+            </w:pict>
+          </mc:Fallback>
+        </mc:AlternateContent>
+      </w:r>
+      <w:r>
+        <w:rPr>
+          <w:i/>
+        </w:rPr>
+        <w:drawing>
+          <wp:inline distT="0" distB="0" distL="0" distR="0" wp14:anchorId="36B5694C" wp14:editId="6895697D">
+            <wp:extent cx="1676634" cy="1209844"/>
+            <wp:effectExtent l="0" t="0" r="0" b="9525"/>
+            <wp:docPr id="178" name="Imagem 178"/>
+            <wp:cNvGraphicFramePr>
+              <a:graphicFrameLocks xmlns:a="http://schemas.openxmlformats.org/drawingml/2006/main" noChangeAspect="1"/>
+            </wp:cNvGraphicFramePr>
+            <a:graphic xmlns:a="http://schemas.openxmlformats.org/drawingml/2006/main">
+              <a:graphicData uri="http://schemas.openxmlformats.org/drawingml/2006/picture">
+                <pic:pic xmlns:pic="http://schemas.openxmlformats.org/drawingml/2006/picture">
+                  <pic:nvPicPr>
+                    <pic:cNvPr id="1" name=""/>
+                    <pic:cNvPicPr/>
+                  </pic:nvPicPr>
+                  <pic:blipFill>
+                    <a:blip r:embed="rId149"/>
+                    <a:stretch>
+                      <a:fillRect/>
+                    </a:stretch>
+                  </pic:blipFill>
+                  <pic:spPr>
+                    <a:xfrm>
+                      <a:off x="0" y="0"/>
+                      <a:ext cx="1676634" cy="1209844"/>
+                    </a:xfrm>
+                    <a:prstGeom prst="rect">
+                      <a:avLst/>
+                    </a:prstGeom>
+                  </pic:spPr>
+                </pic:pic>
+              </a:graphicData>
+            </a:graphic>
+          </wp:inline>
+        </w:drawing>
+      </w:r>
+      <w:r>
+        <w:rPr>
+          <w:i/>
+        </w:rPr>
+        <w:drawing>
+          <wp:inline distT="0" distB="0" distL="0" distR="0" wp14:anchorId="63199F1C" wp14:editId="64E2217E">
+            <wp:extent cx="3810000" cy="1468625"/>
+            <wp:effectExtent l="0" t="0" r="0" b="0"/>
+            <wp:docPr id="179" name="Imagem 179"/>
+            <wp:cNvGraphicFramePr>
+              <a:graphicFrameLocks xmlns:a="http://schemas.openxmlformats.org/drawingml/2006/main" noChangeAspect="1"/>
+            </wp:cNvGraphicFramePr>
+            <a:graphic xmlns:a="http://schemas.openxmlformats.org/drawingml/2006/main">
+              <a:graphicData uri="http://schemas.openxmlformats.org/drawingml/2006/picture">
+                <pic:pic xmlns:pic="http://schemas.openxmlformats.org/drawingml/2006/picture">
+                  <pic:nvPicPr>
+                    <pic:cNvPr id="1" name=""/>
+                    <pic:cNvPicPr/>
+                  </pic:nvPicPr>
+                  <pic:blipFill>
+                    <a:blip r:embed="rId150"/>
+                    <a:stretch>
+                      <a:fillRect/>
+                    </a:stretch>
+                  </pic:blipFill>
+                  <pic:spPr>
+                    <a:xfrm>
+                      <a:off x="0" y="0"/>
+                      <a:ext cx="3836977" cy="1479024"/>
+                    </a:xfrm>
+                    <a:prstGeom prst="rect">
+                      <a:avLst/>
+                    </a:prstGeom>
+                  </pic:spPr>
+                </pic:pic>
+              </a:graphicData>
+            </a:graphic>
+          </wp:inline>
+        </w:drawing>
+      </w:r>
+    </w:p>
+    <w:p>
+      <w:pPr>
+        <w:pStyle w:val="PargrafodaLista"/>
+        <w:rPr>
+          <w:i/>
+        </w:rPr>
+      </w:pPr>
+    </w:p>
+    <w:p>
+      <w:pPr>
+        <w:pStyle w:val="PargrafodaLista"/>
+        <w:rPr>
+          <w:i/>
+        </w:rPr>
+      </w:pPr>
+      <w:r>
+        <w:rPr>
+          <w:i/>
+        </w:rPr>
+        <w:drawing>
+          <wp:inline distT="0" distB="0" distL="0" distR="0" wp14:anchorId="3B805E62" wp14:editId="46B19C55">
+            <wp:extent cx="3724795" cy="190527"/>
+            <wp:effectExtent l="0" t="0" r="0" b="0"/>
+            <wp:docPr id="181" name="Imagem 181"/>
+            <wp:cNvGraphicFramePr>
+              <a:graphicFrameLocks xmlns:a="http://schemas.openxmlformats.org/drawingml/2006/main" noChangeAspect="1"/>
+            </wp:cNvGraphicFramePr>
+            <a:graphic xmlns:a="http://schemas.openxmlformats.org/drawingml/2006/main">
+              <a:graphicData uri="http://schemas.openxmlformats.org/drawingml/2006/picture">
+                <pic:pic xmlns:pic="http://schemas.openxmlformats.org/drawingml/2006/picture">
+                  <pic:nvPicPr>
+                    <pic:cNvPr id="1" name=""/>
+                    <pic:cNvPicPr/>
+                  </pic:nvPicPr>
+                  <pic:blipFill>
+                    <a:blip r:embed="rId151"/>
+                    <a:stretch>
+                      <a:fillRect/>
+                    </a:stretch>
+                  </pic:blipFill>
+                  <pic:spPr>
+                    <a:xfrm>
+                      <a:off x="0" y="0"/>
+                      <a:ext cx="3724795" cy="190527"/>
+                    </a:xfrm>
+                    <a:prstGeom prst="rect">
+                      <a:avLst/>
+                    </a:prstGeom>
+                  </pic:spPr>
+                </pic:pic>
+              </a:graphicData>
+            </a:graphic>
+          </wp:inline>
+        </w:drawing>
+      </w:r>
+    </w:p>
+    <w:p>
+      <w:pPr>
+        <w:rPr>
+          <w:i/>
+        </w:rPr>
+      </w:pPr>
+      <w:r>
+        <w:rPr>
+          <w:i/>
+        </w:rPr>
+        <w:t>89 – Diminuímos o tamanho da imagem benefícios utilizando o seguinte comando:</w:t>
+      </w:r>
+    </w:p>
+    <w:p>
+      <w:pPr>
+        <w:rPr>
+          <w:i/>
+        </w:rPr>
+      </w:pPr>
+      <w:r>
+        <w:rPr>
+          <w:i/>
+        </w:rPr>
+        <w:drawing>
+          <wp:inline distT="0" distB="0" distL="0" distR="0" wp14:anchorId="69E5A422" wp14:editId="29D6A48A">
+            <wp:extent cx="1581371" cy="790685"/>
+            <wp:effectExtent l="0" t="0" r="0" b="9525"/>
+            <wp:docPr id="182" name="Imagem 182"/>
+            <wp:cNvGraphicFramePr>
+              <a:graphicFrameLocks xmlns:a="http://schemas.openxmlformats.org/drawingml/2006/main" noChangeAspect="1"/>
+            </wp:cNvGraphicFramePr>
+            <a:graphic xmlns:a="http://schemas.openxmlformats.org/drawingml/2006/main">
+              <a:graphicData uri="http://schemas.openxmlformats.org/drawingml/2006/picture">
+                <pic:pic xmlns:pic="http://schemas.openxmlformats.org/drawingml/2006/picture">
+                  <pic:nvPicPr>
+                    <pic:cNvPr id="1" name=""/>
+                    <pic:cNvPicPr/>
+                  </pic:nvPicPr>
+                  <pic:blipFill>
+                    <a:blip r:embed="rId152"/>
+                    <a:stretch>
+                      <a:fillRect/>
+                    </a:stretch>
+                  </pic:blipFill>
+                  <pic:spPr>
+                    <a:xfrm>
+                      <a:off x="0" y="0"/>
+                      <a:ext cx="1581371" cy="790685"/>
+                    </a:xfrm>
+                    <a:prstGeom prst="rect">
+                      <a:avLst/>
+                    </a:prstGeom>
+                  </pic:spPr>
+                </pic:pic>
+              </a:graphicData>
+            </a:graphic>
+          </wp:inline>
+        </w:drawing>
+      </w:r>
+      <w:r>
+        <w:rPr>
+          <w:i/>
+        </w:rPr>
+        <w:t xml:space="preserve">  </w:t>
+      </w:r>
+    </w:p>
+    <w:p>
+      <w:pPr>
+        <w:rPr>
+          <w:i/>
+        </w:rPr>
+      </w:pPr>
+      <w:r>
+        <w:rPr>
+          <w:i/>
+          <w:noProof/>
+        </w:rPr>
+        <mc:AlternateContent>
+          <mc:Choice Requires="wps">
+            <w:drawing>
+              <wp:anchor distT="0" distB="0" distL="114300" distR="114300" simplePos="0" relativeHeight="251700224" behindDoc="0" locked="0" layoutInCell="1" allowOverlap="1" wp14:anchorId="7ED95007" wp14:editId="39BDB7D0">
+                <wp:simplePos x="0" y="0"/>
+                <wp:positionH relativeFrom="column">
+                  <wp:posOffset>4705350</wp:posOffset>
+                </wp:positionH>
+                <wp:positionV relativeFrom="paragraph">
+                  <wp:posOffset>152400</wp:posOffset>
+                </wp:positionV>
+                <wp:extent cx="1171575" cy="361950"/>
+                <wp:effectExtent l="38100" t="0" r="28575" b="76200"/>
+                <wp:wrapNone/>
+                <wp:docPr id="184" name="Conector de Seta Reta 184"/>
+                <wp:cNvGraphicFramePr/>
+                <a:graphic xmlns:a="http://schemas.openxmlformats.org/drawingml/2006/main">
+                  <a:graphicData uri="http://schemas.microsoft.com/office/word/2010/wordprocessingShape">
+                    <wps:wsp>
+                      <wps:cNvCnPr/>
+                      <wps:spPr>
+                        <a:xfrm flipH="1">
+                          <a:off x="0" y="0"/>
+                          <a:ext cx="1171575" cy="361950"/>
+                        </a:xfrm>
+                        <a:prstGeom prst="straightConnector1">
+                          <a:avLst/>
+                        </a:prstGeom>
+                        <a:ln>
+                          <a:tailEnd type="triangle"/>
+                        </a:ln>
+                      </wps:spPr>
+                      <wps:style>
+                        <a:lnRef idx="1">
+                          <a:schemeClr val="accent1"/>
+                        </a:lnRef>
+                        <a:fillRef idx="0">
+                          <a:schemeClr val="accent1"/>
+                        </a:fillRef>
+                        <a:effectRef idx="0">
+                          <a:schemeClr val="accent1"/>
+                        </a:effectRef>
+                        <a:fontRef idx="minor">
+                          <a:schemeClr val="tx1"/>
+                        </a:fontRef>
+                      </wps:style>
+                      <wps:bodyPr/>
+                    </wps:wsp>
+                  </a:graphicData>
+                </a:graphic>
+              </wp:anchor>
+            </w:drawing>
+          </mc:Choice>
+          <mc:Fallback>
+            <w:pict>
+              <v:shape w14:anchorId="63775082" id="Conector de Seta Reta 184" o:spid="_x0000_s1026" type="#_x0000_t32" style="position:absolute;margin-left:370.5pt;margin-top:12pt;width:92.25pt;height:28.5pt;flip:x;z-index:251700224;visibility:visible;mso-wrap-style:square;mso-wrap-distance-left:9pt;mso-wrap-distance-top:0;mso-wrap-distance-right:9pt;mso-wrap-distance-bottom:0;mso-position-horizontal:absolute;mso-position-horizontal-relative:text;mso-position-vertical:absolute;mso-position-vertical-relative:text" o:gfxdata="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" strokecolor="#4472c4 [3204]" strokeweight=".5pt">
+                <v:stroke endarrow="block" joinstyle="miter"/>
+              </v:shape>
+            </w:pict>
+          </mc:Fallback>
+        </mc:AlternateContent>
+      </w:r>
+      <w:r>
+        <w:rPr>
+          <w:i/>
+        </w:rPr>
+        <w:t xml:space="preserve">90 </w:t>
+      </w:r>
+      <w:r>
+        <w:rPr>
+          <w:i/>
+        </w:rPr>
+        <w:t>–</w:t>
+      </w:r>
+      <w:r>
+        <w:rPr>
+          <w:i/>
+        </w:rPr>
+        <w:t xml:space="preserve"> </w:t>
+      </w:r>
+      <w:r>
+        <w:rPr>
+          <w:i/>
+        </w:rPr>
+        <w:t xml:space="preserve">Inserimos uma imagem na </w:t>
+      </w:r>
+      <w:proofErr w:type="spellStart"/>
+      <w:r>
+        <w:rPr>
+          <w:i/>
+        </w:rPr>
+        <w:t>section</w:t>
+      </w:r>
+      <w:proofErr w:type="spellEnd"/>
+      <w:r>
+        <w:rPr>
+          <w:i/>
+        </w:rPr>
+        <w:t xml:space="preserve"> principal logo a baixo do h2 e diminuímos o tamanho dela</w:t>
+      </w:r>
+      <w:r>
+        <w:rPr>
+          <w:i/>
+        </w:rPr>
+        <w:t>.</w:t>
+      </w:r>
+    </w:p>
+    <w:p>
+      <w:pPr>
+        <w:rPr>
+          <w:i/>
+        </w:rPr>
+      </w:pPr>
+      <w:r>
+        <w:rPr>
+          <w:i/>
+        </w:rPr>
+        <w:drawing>
+          <wp:inline distT="0" distB="0" distL="0" distR="0" wp14:anchorId="13103274" wp14:editId="6F6C4E73">
+            <wp:extent cx="5268060" cy="504895"/>
+            <wp:effectExtent l="0" t="0" r="8890" b="9525"/>
+            <wp:docPr id="183" name="Imagem 183"/>
+            <wp:cNvGraphicFramePr>
+              <a:graphicFrameLocks xmlns:a="http://schemas.openxmlformats.org/drawingml/2006/main" noChangeAspect="1"/>
+            </wp:cNvGraphicFramePr>
+            <a:graphic xmlns:a="http://schemas.openxmlformats.org/drawingml/2006/main">
+              <a:graphicData uri="http://schemas.openxmlformats.org/drawingml/2006/picture">
+                <pic:pic xmlns:pic="http://schemas.openxmlformats.org/drawingml/2006/picture">
+                  <pic:nvPicPr>
+                    <pic:cNvPr id="1" name=""/>
+                    <pic:cNvPicPr/>
+                  </pic:nvPicPr>
+                  <pic:blipFill>
+                    <a:blip r:embed="rId153"/>
+                    <a:stretch>
+                      <a:fillRect/>
+                    </a:stretch>
+                  </pic:blipFill>
+                  <pic:spPr>
+                    <a:xfrm>
+                      <a:off x="0" y="0"/>
+                      <a:ext cx="5268060" cy="504895"/>
+                    </a:xfrm>
+                    <a:prstGeom prst="rect">
+                      <a:avLst/>
+                    </a:prstGeom>
+                  </pic:spPr>
+                </pic:pic>
+              </a:graphicData>
+            </a:graphic>
+          </wp:inline>
+        </w:drawing>
+      </w:r>
+    </w:p>
+    <w:p>
+      <w:pPr>
+        <w:rPr>
+          <w:i/>
+        </w:rPr>
+      </w:pPr>
+      <w:r>
+        <w:rPr>
+          <w:i/>
+        </w:rPr>
+        <w:drawing>
+          <wp:inline distT="0" distB="0" distL="0" distR="0" wp14:anchorId="0A506B2E" wp14:editId="4A2C8041">
+            <wp:extent cx="1505160" cy="752580"/>
+            <wp:effectExtent l="0" t="0" r="0" b="9525"/>
+            <wp:docPr id="185" name="Imagem 185"/>
+            <wp:cNvGraphicFramePr>
+              <a:graphicFrameLocks xmlns:a="http://schemas.openxmlformats.org/drawingml/2006/main" noChangeAspect="1"/>
+            </wp:cNvGraphicFramePr>
+            <a:graphic xmlns:a="http://schemas.openxmlformats.org/drawingml/2006/main">
+              <a:graphicData uri="http://schemas.openxmlformats.org/drawingml/2006/picture">
+                <pic:pic xmlns:pic="http://schemas.openxmlformats.org/drawingml/2006/picture">
+                  <pic:nvPicPr>
+                    <pic:cNvPr id="1" name=""/>
+                    <pic:cNvPicPr/>
+                  </pic:nvPicPr>
+                  <pic:blipFill>
+                    <a:blip r:embed="rId154"/>
+                    <a:stretch>
+                      <a:fillRect/>
+                    </a:stretch>
+                  </pic:blipFill>
+                  <pic:spPr>
+                    <a:xfrm>
+                      <a:off x="0" y="0"/>
+                      <a:ext cx="1505160" cy="752580"/>
+                    </a:xfrm>
+                    <a:prstGeom prst="rect">
+                      <a:avLst/>
+                    </a:prstGeom>
+                  </pic:spPr>
+                </pic:pic>
+              </a:graphicData>
+            </a:graphic>
+          </wp:inline>
+        </w:drawing>
+      </w:r>
       <w:bookmarkStart w:id="0" w:name="_GoBack"/>
       <w:bookmarkEnd w:id="0"/>
     </w:p>
-    <w:p/>
     <w:sectPr>
       <w:pgSz w:w="11906" w:h="16838"/>
       <w:pgMar w:top="1417" w:right="1701" w:bottom="1417" w:left="1701" w:header="708" w:footer="708" w:gutter="0"/>
@@ -15989,7 +17096,7 @@
 </file>
 
 <file path=customXml/itemProps4.xml><?xml version="1.0" encoding="utf-8"?>
-<ds:datastoreItem xmlns:ds="http://schemas.openxmlformats.org/officeDocument/2006/customXml" ds:itemID="{DE867857-C70D-4815-876D-0F1EAE53DC62}">
+<ds:datastoreItem xmlns:ds="http://schemas.openxmlformats.org/officeDocument/2006/customXml" ds:itemID="{7CDF0EEF-27AF-4352-9F1A-A855C075FFCD}">
   <ds:schemaRefs>
     <ds:schemaRef ds:uri="http://schemas.openxmlformats.org/officeDocument/2006/bibliography"/>
   </ds:schemaRefs>

</xml_diff>

<commit_message>
atualização da aula dia 28/09/2026
</commit_message>
<xml_diff>
--- a/apostila/Projeto Space for me3.docx
+++ b/apostila/Projeto Space for me3.docx
@@ -14628,6 +14628,7 @@
       <w:r>
         <w:rPr>
           <w:i/>
+          <w:noProof/>
         </w:rPr>
         <w:drawing>
           <wp:inline distT="0" distB="0" distL="0" distR="0" wp14:anchorId="09C6FC73" wp14:editId="31CF7543">
@@ -14841,6 +14842,7 @@
       <w:r>
         <w:rPr>
           <w:i/>
+          <w:noProof/>
         </w:rPr>
         <w:drawing>
           <wp:inline distT="0" distB="0" distL="0" distR="0" wp14:anchorId="062330EC" wp14:editId="0F1888A2">
@@ -14881,6 +14883,7 @@
       <w:r>
         <w:rPr>
           <w:i/>
+          <w:noProof/>
         </w:rPr>
         <w:drawing>
           <wp:inline distT="0" distB="0" distL="0" distR="0" wp14:anchorId="7B2C755E" wp14:editId="739F8F41">
@@ -14988,6 +14991,7 @@
       <w:r>
         <w:rPr>
           <w:i/>
+          <w:noProof/>
         </w:rPr>
         <w:drawing>
           <wp:inline distT="0" distB="0" distL="0" distR="0" wp14:anchorId="790D24ED" wp14:editId="084E936F">
@@ -15062,6 +15066,7 @@
       <w:r>
         <w:rPr>
           <w:i/>
+          <w:noProof/>
         </w:rPr>
         <w:drawing>
           <wp:inline distT="0" distB="0" distL="0" distR="0" wp14:anchorId="24DB695F" wp14:editId="106617B0">
@@ -15264,6 +15269,7 @@
       <w:r>
         <w:rPr>
           <w:i/>
+          <w:noProof/>
         </w:rPr>
         <w:drawing>
           <wp:inline distT="0" distB="0" distL="0" distR="0" wp14:anchorId="36B5694C" wp14:editId="6895697D">
@@ -15304,6 +15310,7 @@
       <w:r>
         <w:rPr>
           <w:i/>
+          <w:noProof/>
         </w:rPr>
         <w:drawing>
           <wp:inline distT="0" distB="0" distL="0" distR="0" wp14:anchorId="63199F1C" wp14:editId="64E2217E">
@@ -15360,6 +15367,7 @@
       <w:r>
         <w:rPr>
           <w:i/>
+          <w:noProof/>
         </w:rPr>
         <w:drawing>
           <wp:inline distT="0" distB="0" distL="0" distR="0" wp14:anchorId="3B805E62" wp14:editId="46B19C55">
@@ -15420,6 +15428,7 @@
       <w:r>
         <w:rPr>
           <w:i/>
+          <w:noProof/>
         </w:rPr>
         <w:drawing>
           <wp:inline distT="0" distB="0" distL="0" distR="0" wp14:anchorId="69E5A422" wp14:editId="29D6A48A">
@@ -15591,6 +15600,7 @@
       <w:r>
         <w:rPr>
           <w:i/>
+          <w:noProof/>
         </w:rPr>
         <w:drawing>
           <wp:inline distT="0" distB="0" distL="0" distR="0" wp14:anchorId="13103274" wp14:editId="6F6C4E73">
@@ -15638,6 +15648,7 @@
       <w:r>
         <w:rPr>
           <w:i/>
+          <w:noProof/>
         </w:rPr>
         <w:drawing>
           <wp:inline distT="0" distB="0" distL="0" distR="0" wp14:anchorId="0A506B2E" wp14:editId="4A2C8041">
@@ -15664,6 +15675,752 @@
                     <a:xfrm>
                       <a:off x="0" y="0"/>
                       <a:ext cx="1505160" cy="752580"/>
+                    </a:xfrm>
+                    <a:prstGeom prst="rect">
+                      <a:avLst/>
+                    </a:prstGeom>
+                  </pic:spPr>
+                </pic:pic>
+              </a:graphicData>
+            </a:graphic>
+          </wp:inline>
+        </w:drawing>
+      </w:r>
+    </w:p>
+    <w:p>
+      <w:pPr>
+        <w:rPr>
+          <w:i/>
+        </w:rPr>
+      </w:pPr>
+      <w:r>
+        <w:rPr>
+          <w:i/>
+        </w:rPr>
+        <w:t xml:space="preserve">91- Para </w:t>
+      </w:r>
+      <w:proofErr w:type="spellStart"/>
+      <w:r>
+        <w:rPr>
+          <w:i/>
+        </w:rPr>
+        <w:t>clocar</w:t>
+      </w:r>
+      <w:proofErr w:type="spellEnd"/>
+      <w:r>
+        <w:rPr>
+          <w:i/>
+        </w:rPr>
+        <w:t xml:space="preserve"> o texto ao lado da imagem, utilizamos uma técnica de flutuação chamada </w:t>
+      </w:r>
+      <w:proofErr w:type="spellStart"/>
+      <w:r>
+        <w:rPr>
+          <w:i/>
+        </w:rPr>
+        <w:t>float</w:t>
+      </w:r>
+      <w:proofErr w:type="spellEnd"/>
+      <w:r>
+        <w:rPr>
+          <w:i/>
+        </w:rPr>
+        <w:t xml:space="preserve">, quando utilizamos esse recurso, o elemento descola da página o que </w:t>
+      </w:r>
+      <w:proofErr w:type="gramStart"/>
+      <w:r>
+        <w:rPr>
+          <w:i/>
+        </w:rPr>
+        <w:t>esta</w:t>
+      </w:r>
+      <w:proofErr w:type="gramEnd"/>
+      <w:r>
+        <w:rPr>
+          <w:i/>
+        </w:rPr>
+        <w:t xml:space="preserve"> em baixo para cima, se atentando a sua sombra, continua ocupando virtualmente o espaço.</w:t>
+      </w:r>
+    </w:p>
+    <w:p>
+      <w:pPr>
+        <w:rPr>
+          <w:i/>
+        </w:rPr>
+      </w:pPr>
+      <w:r>
+        <w:rPr>
+          <w:i/>
+        </w:rPr>
+        <w:drawing>
+          <wp:inline distT="0" distB="0" distL="0" distR="0" wp14:anchorId="7E194DD5" wp14:editId="2BCBF0F2">
+            <wp:extent cx="1076475" cy="771633"/>
+            <wp:effectExtent l="0" t="0" r="0" b="9525"/>
+            <wp:docPr id="186" name="Imagem 186"/>
+            <wp:cNvGraphicFramePr>
+              <a:graphicFrameLocks xmlns:a="http://schemas.openxmlformats.org/drawingml/2006/main" noChangeAspect="1"/>
+            </wp:cNvGraphicFramePr>
+            <a:graphic xmlns:a="http://schemas.openxmlformats.org/drawingml/2006/main">
+              <a:graphicData uri="http://schemas.openxmlformats.org/drawingml/2006/picture">
+                <pic:pic xmlns:pic="http://schemas.openxmlformats.org/drawingml/2006/picture">
+                  <pic:nvPicPr>
+                    <pic:cNvPr id="1" name=""/>
+                    <pic:cNvPicPr/>
+                  </pic:nvPicPr>
+                  <pic:blipFill>
+                    <a:blip r:embed="rId155"/>
+                    <a:stretch>
+                      <a:fillRect/>
+                    </a:stretch>
+                  </pic:blipFill>
+                  <pic:spPr>
+                    <a:xfrm>
+                      <a:off x="0" y="0"/>
+                      <a:ext cx="1076475" cy="771633"/>
+                    </a:xfrm>
+                    <a:prstGeom prst="rect">
+                      <a:avLst/>
+                    </a:prstGeom>
+                  </pic:spPr>
+                </pic:pic>
+              </a:graphicData>
+            </a:graphic>
+          </wp:inline>
+        </w:drawing>
+      </w:r>
+      <w:r>
+        <w:rPr>
+          <w:i/>
+        </w:rPr>
+        <w:drawing>
+          <wp:inline distT="0" distB="0" distL="0" distR="0" wp14:anchorId="2DF4BFD4" wp14:editId="0C06F606">
+            <wp:extent cx="5981700" cy="1390725"/>
+            <wp:effectExtent l="0" t="0" r="0" b="0"/>
+            <wp:docPr id="187" name="Imagem 187"/>
+            <wp:cNvGraphicFramePr>
+              <a:graphicFrameLocks xmlns:a="http://schemas.openxmlformats.org/drawingml/2006/main" noChangeAspect="1"/>
+            </wp:cNvGraphicFramePr>
+            <a:graphic xmlns:a="http://schemas.openxmlformats.org/drawingml/2006/main">
+              <a:graphicData uri="http://schemas.openxmlformats.org/drawingml/2006/picture">
+                <pic:pic xmlns:pic="http://schemas.openxmlformats.org/drawingml/2006/picture">
+                  <pic:nvPicPr>
+                    <pic:cNvPr id="1" name=""/>
+                    <pic:cNvPicPr/>
+                  </pic:nvPicPr>
+                  <pic:blipFill>
+                    <a:blip r:embed="rId156"/>
+                    <a:stretch>
+                      <a:fillRect/>
+                    </a:stretch>
+                  </pic:blipFill>
+                  <pic:spPr>
+                    <a:xfrm>
+                      <a:off x="0" y="0"/>
+                      <a:ext cx="6029914" cy="1401935"/>
+                    </a:xfrm>
+                    <a:prstGeom prst="rect">
+                      <a:avLst/>
+                    </a:prstGeom>
+                  </pic:spPr>
+                </pic:pic>
+              </a:graphicData>
+            </a:graphic>
+          </wp:inline>
+        </w:drawing>
+      </w:r>
+    </w:p>
+    <w:p>
+      <w:pPr>
+        <w:rPr>
+          <w:i/>
+        </w:rPr>
+      </w:pPr>
+      <w:r>
+        <w:rPr>
+          <w:i/>
+        </w:rPr>
+        <w:t xml:space="preserve">92 – Observamos que ao </w:t>
+      </w:r>
+      <w:r>
+        <w:rPr>
+          <w:i/>
+        </w:rPr>
+        <w:t xml:space="preserve">utilizar o </w:t>
+      </w:r>
+      <w:proofErr w:type="spellStart"/>
+      <w:r>
+        <w:rPr>
+          <w:i/>
+        </w:rPr>
+        <w:t>float</w:t>
+      </w:r>
+      <w:proofErr w:type="spellEnd"/>
+      <w:r>
+        <w:rPr>
+          <w:i/>
+        </w:rPr>
+        <w:t xml:space="preserve"> o elemento a baixo subiu para voltar ao estado anterior utilizamos o </w:t>
+      </w:r>
+      <w:proofErr w:type="spellStart"/>
+      <w:proofErr w:type="gramStart"/>
+      <w:r>
+        <w:rPr>
+          <w:i/>
+        </w:rPr>
+        <w:t>clear;left</w:t>
+      </w:r>
+      <w:proofErr w:type="spellEnd"/>
+      <w:proofErr w:type="gramEnd"/>
+      <w:r>
+        <w:rPr>
+          <w:i/>
+        </w:rPr>
+        <w:t>.</w:t>
+      </w:r>
+    </w:p>
+    <w:p>
+      <w:pPr>
+        <w:rPr>
+          <w:i/>
+        </w:rPr>
+      </w:pPr>
+      <w:r>
+        <w:rPr>
+          <w:i/>
+          <w:noProof/>
+        </w:rPr>
+        <mc:AlternateContent>
+          <mc:Choice Requires="wps">
+            <w:drawing>
+              <wp:anchor distT="0" distB="0" distL="114300" distR="114300" simplePos="0" relativeHeight="251701248" behindDoc="0" locked="0" layoutInCell="1" allowOverlap="1" wp14:anchorId="1518DC04" wp14:editId="2A0C5785">
+                <wp:simplePos x="0" y="0"/>
+                <wp:positionH relativeFrom="column">
+                  <wp:posOffset>1104900</wp:posOffset>
+                </wp:positionH>
+                <wp:positionV relativeFrom="paragraph">
+                  <wp:posOffset>380999</wp:posOffset>
+                </wp:positionV>
+                <wp:extent cx="1219200" cy="542925"/>
+                <wp:effectExtent l="38100" t="0" r="19050" b="66675"/>
+                <wp:wrapNone/>
+                <wp:docPr id="189" name="Conector de Seta Reta 189"/>
+                <wp:cNvGraphicFramePr/>
+                <a:graphic xmlns:a="http://schemas.openxmlformats.org/drawingml/2006/main">
+                  <a:graphicData uri="http://schemas.microsoft.com/office/word/2010/wordprocessingShape">
+                    <wps:wsp>
+                      <wps:cNvCnPr/>
+                      <wps:spPr>
+                        <a:xfrm flipH="1">
+                          <a:off x="0" y="0"/>
+                          <a:ext cx="1219200" cy="542925"/>
+                        </a:xfrm>
+                        <a:prstGeom prst="straightConnector1">
+                          <a:avLst/>
+                        </a:prstGeom>
+                        <a:ln>
+                          <a:tailEnd type="triangle"/>
+                        </a:ln>
+                      </wps:spPr>
+                      <wps:style>
+                        <a:lnRef idx="1">
+                          <a:schemeClr val="accent1"/>
+                        </a:lnRef>
+                        <a:fillRef idx="0">
+                          <a:schemeClr val="accent1"/>
+                        </a:fillRef>
+                        <a:effectRef idx="0">
+                          <a:schemeClr val="accent1"/>
+                        </a:effectRef>
+                        <a:fontRef idx="minor">
+                          <a:schemeClr val="tx1"/>
+                        </a:fontRef>
+                      </wps:style>
+                      <wps:bodyPr/>
+                    </wps:wsp>
+                  </a:graphicData>
+                </a:graphic>
+                <wp14:sizeRelH relativeFrom="margin">
+                  <wp14:pctWidth>0</wp14:pctWidth>
+                </wp14:sizeRelH>
+                <wp14:sizeRelV relativeFrom="margin">
+                  <wp14:pctHeight>0</wp14:pctHeight>
+                </wp14:sizeRelV>
+              </wp:anchor>
+            </w:drawing>
+          </mc:Choice>
+          <mc:Fallback>
+            <w:pict>
+              <v:shapetype w14:anchorId="1C8539FE" id="_x0000_t32" coordsize="21600,21600" o:spt="32" o:oned="t" path="m,l21600,21600e" filled="f">
+                <v:path arrowok="t" fillok="f" o:connecttype="none"/>
+                <o:lock v:ext="edit" shapetype="t"/>
+              </v:shapetype>
+              <v:shape id="Conector de Seta Reta 189" o:spid="_x0000_s1026" type="#_x0000_t32" style="position:absolute;margin-left:87pt;margin-top:30pt;width:96pt;height:42.75pt;flip:x;z-index:251701248;visibility:visible;mso-wrap-style:square;mso-width-percent:0;mso-height-percent:0;mso-wrap-distance-left:9pt;mso-wrap-distance-top:0;mso-wrap-distance-right:9pt;mso-wrap-distance-bottom:0;mso-position-horizontal:absolute;mso-position-horizontal-relative:text;mso-position-vertical:absolute;mso-position-vertical-relative:text;mso-width-percent:0;mso-height-percent:0;mso-width-relative:margin;mso-height-relative:margin" o:gfxdata="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" strokecolor="#4472c4 [3204]" strokeweight=".5pt">
+                <v:stroke endarrow="block" joinstyle="miter"/>
+              </v:shape>
+            </w:pict>
+          </mc:Fallback>
+        </mc:AlternateContent>
+      </w:r>
+      <w:r>
+        <w:rPr>
+          <w:i/>
+        </w:rPr>
+        <w:drawing>
+          <wp:inline distT="0" distB="0" distL="0" distR="0" wp14:anchorId="130ABF8A" wp14:editId="1E62D3E5">
+            <wp:extent cx="1676634" cy="1267002"/>
+            <wp:effectExtent l="0" t="0" r="0" b="9525"/>
+            <wp:docPr id="188" name="Imagem 188"/>
+            <wp:cNvGraphicFramePr>
+              <a:graphicFrameLocks xmlns:a="http://schemas.openxmlformats.org/drawingml/2006/main" noChangeAspect="1"/>
+            </wp:cNvGraphicFramePr>
+            <a:graphic xmlns:a="http://schemas.openxmlformats.org/drawingml/2006/main">
+              <a:graphicData uri="http://schemas.openxmlformats.org/drawingml/2006/picture">
+                <pic:pic xmlns:pic="http://schemas.openxmlformats.org/drawingml/2006/picture">
+                  <pic:nvPicPr>
+                    <pic:cNvPr id="1" name=""/>
+                    <pic:cNvPicPr/>
+                  </pic:nvPicPr>
+                  <pic:blipFill>
+                    <a:blip r:embed="rId157"/>
+                    <a:stretch>
+                      <a:fillRect/>
+                    </a:stretch>
+                  </pic:blipFill>
+                  <pic:spPr>
+                    <a:xfrm>
+                      <a:off x="0" y="0"/>
+                      <a:ext cx="1676634" cy="1267002"/>
+                    </a:xfrm>
+                    <a:prstGeom prst="rect">
+                      <a:avLst/>
+                    </a:prstGeom>
+                  </pic:spPr>
+                </pic:pic>
+              </a:graphicData>
+            </a:graphic>
+          </wp:inline>
+        </w:drawing>
+      </w:r>
+    </w:p>
+    <w:p>
+      <w:pPr>
+        <w:rPr>
+          <w:i/>
+        </w:rPr>
+      </w:pPr>
+      <w:r>
+        <w:rPr>
+          <w:i/>
+        </w:rPr>
+        <w:t>93 – O texto estava muito colado com a imagem inserimos uma distancia externa de 20px para direita e 20px para baixo.</w:t>
+      </w:r>
+    </w:p>
+    <w:p>
+      <w:pPr>
+        <w:rPr>
+          <w:i/>
+        </w:rPr>
+      </w:pPr>
+      <w:r>
+        <w:rPr>
+          <w:i/>
+        </w:rPr>
+        <w:drawing>
+          <wp:inline distT="0" distB="0" distL="0" distR="0" wp14:anchorId="1573ED13" wp14:editId="1B5AB8C9">
+            <wp:extent cx="7563906" cy="1695687"/>
+            <wp:effectExtent l="0" t="0" r="0" b="0"/>
+            <wp:docPr id="190" name="Imagem 190"/>
+            <wp:cNvGraphicFramePr>
+              <a:graphicFrameLocks xmlns:a="http://schemas.openxmlformats.org/drawingml/2006/main" noChangeAspect="1"/>
+            </wp:cNvGraphicFramePr>
+            <a:graphic xmlns:a="http://schemas.openxmlformats.org/drawingml/2006/main">
+              <a:graphicData uri="http://schemas.openxmlformats.org/drawingml/2006/picture">
+                <pic:pic xmlns:pic="http://schemas.openxmlformats.org/drawingml/2006/picture">
+                  <pic:nvPicPr>
+                    <pic:cNvPr id="1" name=""/>
+                    <pic:cNvPicPr/>
+                  </pic:nvPicPr>
+                  <pic:blipFill>
+                    <a:blip r:embed="rId158"/>
+                    <a:stretch>
+                      <a:fillRect/>
+                    </a:stretch>
+                  </pic:blipFill>
+                  <pic:spPr>
+                    <a:xfrm>
+                      <a:off x="0" y="0"/>
+                      <a:ext cx="7563906" cy="1695687"/>
+                    </a:xfrm>
+                    <a:prstGeom prst="rect">
+                      <a:avLst/>
+                    </a:prstGeom>
+                  </pic:spPr>
+                </pic:pic>
+              </a:graphicData>
+            </a:graphic>
+          </wp:inline>
+        </w:drawing>
+      </w:r>
+    </w:p>
+    <w:p>
+      <w:pPr>
+        <w:rPr>
+          <w:i/>
+        </w:rPr>
+      </w:pPr>
+      <w:r>
+        <w:rPr>
+          <w:i/>
+        </w:rPr>
+        <w:drawing>
+          <wp:inline distT="0" distB="0" distL="0" distR="0" wp14:anchorId="3F71DD5A" wp14:editId="69DAAD4A">
+            <wp:extent cx="2247900" cy="1161996"/>
+            <wp:effectExtent l="0" t="0" r="0" b="635"/>
+            <wp:docPr id="191" name="Imagem 191"/>
+            <wp:cNvGraphicFramePr>
+              <a:graphicFrameLocks xmlns:a="http://schemas.openxmlformats.org/drawingml/2006/main" noChangeAspect="1"/>
+            </wp:cNvGraphicFramePr>
+            <a:graphic xmlns:a="http://schemas.openxmlformats.org/drawingml/2006/main">
+              <a:graphicData uri="http://schemas.openxmlformats.org/drawingml/2006/picture">
+                <pic:pic xmlns:pic="http://schemas.openxmlformats.org/drawingml/2006/picture">
+                  <pic:nvPicPr>
+                    <pic:cNvPr id="1" name=""/>
+                    <pic:cNvPicPr/>
+                  </pic:nvPicPr>
+                  <pic:blipFill>
+                    <a:blip r:embed="rId159"/>
+                    <a:stretch>
+                      <a:fillRect/>
+                    </a:stretch>
+                  </pic:blipFill>
+                  <pic:spPr>
+                    <a:xfrm>
+                      <a:off x="0" y="0"/>
+                      <a:ext cx="2295540" cy="1186622"/>
+                    </a:xfrm>
+                    <a:prstGeom prst="rect">
+                      <a:avLst/>
+                    </a:prstGeom>
+                  </pic:spPr>
+                </pic:pic>
+              </a:graphicData>
+            </a:graphic>
+          </wp:inline>
+        </w:drawing>
+      </w:r>
+    </w:p>
+    <w:p>
+      <w:pPr>
+        <w:rPr>
+          <w:i/>
+        </w:rPr>
+      </w:pPr>
+      <w:r>
+        <w:rPr>
+          <w:i/>
+        </w:rPr>
+        <w:t xml:space="preserve">94 </w:t>
+      </w:r>
+      <w:r>
+        <w:rPr>
+          <w:i/>
+        </w:rPr>
+        <w:t>–</w:t>
+      </w:r>
+      <w:r>
+        <w:rPr>
+          <w:i/>
+        </w:rPr>
+        <w:t xml:space="preserve"> </w:t>
+      </w:r>
+      <w:r>
+        <w:rPr>
+          <w:i/>
+        </w:rPr>
+        <w:t xml:space="preserve">Trabalhando com fontes da internet vamos escolher uma fonte para nosso site que seja preparado pela internet </w:t>
+      </w:r>
+    </w:p>
+    <w:p>
+      <w:pPr>
+        <w:rPr>
+          <w:i/>
+        </w:rPr>
+      </w:pPr>
+      <w:r>
+        <w:rPr>
+          <w:i/>
+        </w:rPr>
+        <w:t>Qual a diferença ser preparada ou não para internet é que a fonte independente do navegador vai se comporta da mesma forma.</w:t>
+      </w:r>
+    </w:p>
+    <w:p>
+      <w:pPr>
+        <w:rPr>
+          <w:i/>
+        </w:rPr>
+      </w:pPr>
+      <w:r>
+        <w:rPr>
+          <w:i/>
+        </w:rPr>
+        <w:t xml:space="preserve">Entre no site </w:t>
+      </w:r>
+      <w:hyperlink r:id="rId160" w:history="1">
+        <w:r>
+          <w:rPr>
+            <w:rStyle w:val="Hyperlink"/>
+            <w:i/>
+          </w:rPr>
+          <w:t>https://fonts.google.com</w:t>
+        </w:r>
+      </w:hyperlink>
+      <w:r>
+        <w:rPr>
+          <w:i/>
+        </w:rPr>
+        <w:t xml:space="preserve"> para escolher a fonte que desejamos e copia o código que é gerado para colar no </w:t>
+      </w:r>
+      <w:proofErr w:type="spellStart"/>
+      <w:r>
+        <w:rPr>
+          <w:i/>
+        </w:rPr>
+        <w:t>html</w:t>
+      </w:r>
+      <w:proofErr w:type="spellEnd"/>
+      <w:r>
+        <w:rPr>
+          <w:i/>
+        </w:rPr>
+        <w:t xml:space="preserve"> e no </w:t>
+      </w:r>
+      <w:proofErr w:type="spellStart"/>
+      <w:r>
+        <w:rPr>
+          <w:i/>
+        </w:rPr>
+        <w:t>css</w:t>
+      </w:r>
+      <w:proofErr w:type="spellEnd"/>
+      <w:r>
+        <w:rPr>
+          <w:i/>
+        </w:rPr>
+        <w:t>.</w:t>
+      </w:r>
+    </w:p>
+    <w:p>
+      <w:pPr>
+        <w:rPr>
+          <w:i/>
+        </w:rPr>
+      </w:pPr>
+      <w:r>
+        <w:rPr>
+          <w:i/>
+        </w:rPr>
+        <w:t xml:space="preserve">Lembrando que no </w:t>
+      </w:r>
+      <w:proofErr w:type="spellStart"/>
+      <w:r>
+        <w:rPr>
+          <w:i/>
+        </w:rPr>
+        <w:t>html</w:t>
+      </w:r>
+      <w:proofErr w:type="spellEnd"/>
+      <w:r>
+        <w:rPr>
+          <w:i/>
+        </w:rPr>
+        <w:t xml:space="preserve"> precisamos colar dentro do </w:t>
+      </w:r>
+      <w:proofErr w:type="spellStart"/>
+      <w:r>
+        <w:rPr>
+          <w:i/>
+        </w:rPr>
+        <w:t>head</w:t>
+      </w:r>
+      <w:proofErr w:type="spellEnd"/>
+      <w:r>
+        <w:rPr>
+          <w:i/>
+        </w:rPr>
+        <w:t xml:space="preserve"> e no </w:t>
+      </w:r>
+      <w:proofErr w:type="spellStart"/>
+      <w:r>
+        <w:rPr>
+          <w:i/>
+        </w:rPr>
+        <w:t>css</w:t>
+      </w:r>
+      <w:proofErr w:type="spellEnd"/>
+      <w:r>
+        <w:rPr>
+          <w:i/>
+        </w:rPr>
+        <w:t xml:space="preserve"> colocamos </w:t>
+      </w:r>
+      <w:r>
+        <w:rPr>
+          <w:i/>
+        </w:rPr>
+        <w:t>aonde queremos aplicar a fonte.</w:t>
+      </w:r>
+    </w:p>
+    <w:p>
+      <w:pPr>
+        <w:rPr>
+          <w:i/>
+        </w:rPr>
+      </w:pPr>
+      <w:r>
+        <w:rPr>
+          <w:i/>
+        </w:rPr>
+        <w:drawing>
+          <wp:inline distT="0" distB="0" distL="0" distR="0" wp14:anchorId="26755999" wp14:editId="7EFAFDD9">
+            <wp:extent cx="11336332" cy="4525006"/>
+            <wp:effectExtent l="0" t="0" r="0" b="9525"/>
+            <wp:docPr id="192" name="Imagem 192"/>
+            <wp:cNvGraphicFramePr>
+              <a:graphicFrameLocks xmlns:a="http://schemas.openxmlformats.org/drawingml/2006/main" noChangeAspect="1"/>
+            </wp:cNvGraphicFramePr>
+            <a:graphic xmlns:a="http://schemas.openxmlformats.org/drawingml/2006/main">
+              <a:graphicData uri="http://schemas.openxmlformats.org/drawingml/2006/picture">
+                <pic:pic xmlns:pic="http://schemas.openxmlformats.org/drawingml/2006/picture">
+                  <pic:nvPicPr>
+                    <pic:cNvPr id="1" name=""/>
+                    <pic:cNvPicPr/>
+                  </pic:nvPicPr>
+                  <pic:blipFill>
+                    <a:blip r:embed="rId161"/>
+                    <a:stretch>
+                      <a:fillRect/>
+                    </a:stretch>
+                  </pic:blipFill>
+                  <pic:spPr>
+                    <a:xfrm>
+                      <a:off x="0" y="0"/>
+                      <a:ext cx="11336332" cy="4525006"/>
+                    </a:xfrm>
+                    <a:prstGeom prst="rect">
+                      <a:avLst/>
+                    </a:prstGeom>
+                  </pic:spPr>
+                </pic:pic>
+              </a:graphicData>
+            </a:graphic>
+          </wp:inline>
+        </w:drawing>
+      </w:r>
+    </w:p>
+    <w:p>
+      <w:pPr>
+        <w:rPr>
+          <w:i/>
+        </w:rPr>
+      </w:pPr>
+      <w:r>
+        <w:rPr>
+          <w:i/>
+        </w:rPr>
+        <w:t xml:space="preserve">95 – Para inserir o mapa no site, acessamos o </w:t>
+      </w:r>
+      <w:proofErr w:type="spellStart"/>
+      <w:r>
+        <w:rPr>
+          <w:i/>
+        </w:rPr>
+        <w:t>google</w:t>
+      </w:r>
+      <w:proofErr w:type="spellEnd"/>
+      <w:r>
+        <w:rPr>
+          <w:i/>
+        </w:rPr>
+        <w:t xml:space="preserve"> </w:t>
+      </w:r>
+      <w:proofErr w:type="spellStart"/>
+      <w:r>
+        <w:rPr>
+          <w:i/>
+        </w:rPr>
+        <w:t>maps</w:t>
+      </w:r>
+      <w:proofErr w:type="spellEnd"/>
+      <w:r>
+        <w:rPr>
+          <w:i/>
+        </w:rPr>
+        <w:t xml:space="preserve">, na pesquisa digitamos o estabelecimento desejado no nosso caso é a barbearia Space for </w:t>
+      </w:r>
+      <w:proofErr w:type="spellStart"/>
+      <w:r>
+        <w:rPr>
+          <w:i/>
+        </w:rPr>
+        <w:t>men</w:t>
+      </w:r>
+      <w:proofErr w:type="spellEnd"/>
+      <w:r>
+        <w:rPr>
+          <w:i/>
+        </w:rPr>
+        <w:t xml:space="preserve">, no campo parecido 3 risquinho clica, vai aparecer a seguinte tela com o campo compartilhar ou incorporar, acessamos esse campo e copiamos o link que gera para colocar no </w:t>
+      </w:r>
+      <w:proofErr w:type="spellStart"/>
+      <w:r>
+        <w:rPr>
+          <w:i/>
+        </w:rPr>
+        <w:t>html</w:t>
+      </w:r>
+      <w:proofErr w:type="spellEnd"/>
+      <w:r>
+        <w:rPr>
+          <w:i/>
+        </w:rPr>
+        <w:t>.</w:t>
+      </w:r>
+    </w:p>
+    <w:p>
+      <w:pPr>
+        <w:rPr>
+          <w:i/>
+        </w:rPr>
+      </w:pPr>
+      <w:r>
+        <w:rPr>
+          <w:i/>
+        </w:rPr>
+        <w:drawing>
+          <wp:inline distT="0" distB="0" distL="0" distR="0" wp14:anchorId="49FD78E7" wp14:editId="1C14244A">
+            <wp:extent cx="8297433" cy="3658111"/>
+            <wp:effectExtent l="0" t="0" r="0" b="0"/>
+            <wp:docPr id="193" name="Imagem 193"/>
+            <wp:cNvGraphicFramePr>
+              <a:graphicFrameLocks xmlns:a="http://schemas.openxmlformats.org/drawingml/2006/main" noChangeAspect="1"/>
+            </wp:cNvGraphicFramePr>
+            <a:graphic xmlns:a="http://schemas.openxmlformats.org/drawingml/2006/main">
+              <a:graphicData uri="http://schemas.openxmlformats.org/drawingml/2006/picture">
+                <pic:pic xmlns:pic="http://schemas.openxmlformats.org/drawingml/2006/picture">
+                  <pic:nvPicPr>
+                    <pic:cNvPr id="1" name=""/>
+                    <pic:cNvPicPr/>
+                  </pic:nvPicPr>
+                  <pic:blipFill>
+                    <a:blip r:embed="rId162"/>
+                    <a:stretch>
+                      <a:fillRect/>
+                    </a:stretch>
+                  </pic:blipFill>
+                  <pic:spPr>
+                    <a:xfrm>
+                      <a:off x="0" y="0"/>
+                      <a:ext cx="8297433" cy="3658111"/>
                     </a:xfrm>
                     <a:prstGeom prst="rect">
                       <a:avLst/>
@@ -17096,7 +17853,7 @@
 </file>
 
 <file path=customXml/itemProps4.xml><?xml version="1.0" encoding="utf-8"?>
-<ds:datastoreItem xmlns:ds="http://schemas.openxmlformats.org/officeDocument/2006/customXml" ds:itemID="{7CDF0EEF-27AF-4352-9F1A-A855C075FFCD}">
+<ds:datastoreItem xmlns:ds="http://schemas.openxmlformats.org/officeDocument/2006/customXml" ds:itemID="{6EC3F37B-9E6C-40C7-9222-561AEE93753E}">
   <ds:schemaRefs>
     <ds:schemaRef ds:uri="http://schemas.openxmlformats.org/officeDocument/2006/bibliography"/>
   </ds:schemaRefs>

</xml_diff>

<commit_message>
atualização da aula dia 29/09/2026
</commit_message>
<xml_diff>
--- a/apostila/Projeto Space for me3.docx
+++ b/apostila/Projeto Space for me3.docx
@@ -15751,6 +15751,7 @@
       <w:r>
         <w:rPr>
           <w:i/>
+          <w:noProof/>
         </w:rPr>
         <w:drawing>
           <wp:inline distT="0" distB="0" distL="0" distR="0" wp14:anchorId="7E194DD5" wp14:editId="2BCBF0F2">
@@ -15791,6 +15792,7 @@
       <w:r>
         <w:rPr>
           <w:i/>
+          <w:noProof/>
         </w:rPr>
         <w:drawing>
           <wp:inline distT="0" distB="0" distL="0" distR="0" wp14:anchorId="2DF4BFD4" wp14:editId="0C06F606">
@@ -15964,6 +15966,7 @@
       <w:r>
         <w:rPr>
           <w:i/>
+          <w:noProof/>
         </w:rPr>
         <w:drawing>
           <wp:inline distT="0" distB="0" distL="0" distR="0" wp14:anchorId="130ABF8A" wp14:editId="1E62D3E5">
@@ -16024,6 +16027,7 @@
       <w:r>
         <w:rPr>
           <w:i/>
+          <w:noProof/>
         </w:rPr>
         <w:drawing>
           <wp:inline distT="0" distB="0" distL="0" distR="0" wp14:anchorId="1573ED13" wp14:editId="1B5AB8C9">
@@ -16071,6 +16075,7 @@
       <w:r>
         <w:rPr>
           <w:i/>
+          <w:noProof/>
         </w:rPr>
         <w:drawing>
           <wp:inline distT="0" distB="0" distL="0" distR="0" wp14:anchorId="3F71DD5A" wp14:editId="69DAAD4A">
@@ -16279,6 +16284,7 @@
       <w:r>
         <w:rPr>
           <w:i/>
+          <w:noProof/>
         </w:rPr>
         <w:drawing>
           <wp:inline distT="0" distB="0" distL="0" distR="0" wp14:anchorId="26755999" wp14:editId="7EFAFDD9">
@@ -16395,6 +16401,7 @@
       <w:r>
         <w:rPr>
           <w:i/>
+          <w:noProof/>
         </w:rPr>
         <w:drawing>
           <wp:inline distT="0" distB="0" distL="0" distR="0" wp14:anchorId="49FD78E7" wp14:editId="1C14244A">
@@ -16421,6 +16428,703 @@
                     <a:xfrm>
                       <a:off x="0" y="0"/>
                       <a:ext cx="8297433" cy="3658111"/>
+                    </a:xfrm>
+                    <a:prstGeom prst="rect">
+                      <a:avLst/>
+                    </a:prstGeom>
+                  </pic:spPr>
+                </pic:pic>
+              </a:graphicData>
+            </a:graphic>
+          </wp:inline>
+        </w:drawing>
+      </w:r>
+    </w:p>
+    <w:p>
+      <w:pPr>
+        <w:rPr>
+          <w:i/>
+        </w:rPr>
+      </w:pPr>
+      <w:r>
+        <w:rPr>
+          <w:i/>
+        </w:rPr>
+        <w:t xml:space="preserve">96 – Para melhorar a visualização do nosso mapa no site colocamos para que ele ocupe 100% de largura e 300px de altura no </w:t>
+      </w:r>
+      <w:proofErr w:type="spellStart"/>
+      <w:r>
+        <w:rPr>
+          <w:i/>
+        </w:rPr>
+        <w:t>iframe</w:t>
+      </w:r>
+      <w:proofErr w:type="spellEnd"/>
+      <w:r>
+        <w:rPr>
+          <w:i/>
+        </w:rPr>
+        <w:t xml:space="preserve">. </w:t>
+      </w:r>
+    </w:p>
+    <w:p>
+      <w:pPr>
+        <w:rPr>
+          <w:i/>
+        </w:rPr>
+      </w:pPr>
+      <w:r>
+        <w:rPr>
+          <w:i/>
+          <w:noProof/>
+        </w:rPr>
+        <w:drawing>
+          <wp:inline distT="0" distB="0" distL="0" distR="0" wp14:anchorId="2C6B3DAA" wp14:editId="2929618D">
+            <wp:extent cx="7478169" cy="800212"/>
+            <wp:effectExtent l="0" t="0" r="0" b="0"/>
+            <wp:docPr id="194" name="Imagem 194"/>
+            <wp:cNvGraphicFramePr>
+              <a:graphicFrameLocks xmlns:a="http://schemas.openxmlformats.org/drawingml/2006/main" noChangeAspect="1"/>
+            </wp:cNvGraphicFramePr>
+            <a:graphic xmlns:a="http://schemas.openxmlformats.org/drawingml/2006/main">
+              <a:graphicData uri="http://schemas.openxmlformats.org/drawingml/2006/picture">
+                <pic:pic xmlns:pic="http://schemas.openxmlformats.org/drawingml/2006/picture">
+                  <pic:nvPicPr>
+                    <pic:cNvPr id="1" name=""/>
+                    <pic:cNvPicPr/>
+                  </pic:nvPicPr>
+                  <pic:blipFill>
+                    <a:blip r:embed="rId163"/>
+                    <a:stretch>
+                      <a:fillRect/>
+                    </a:stretch>
+                  </pic:blipFill>
+                  <pic:spPr>
+                    <a:xfrm>
+                      <a:off x="0" y="0"/>
+                      <a:ext cx="7478169" cy="800212"/>
+                    </a:xfrm>
+                    <a:prstGeom prst="rect">
+                      <a:avLst/>
+                    </a:prstGeom>
+                  </pic:spPr>
+                </pic:pic>
+              </a:graphicData>
+            </a:graphic>
+          </wp:inline>
+        </w:drawing>
+      </w:r>
+    </w:p>
+    <w:p>
+      <w:pPr>
+        <w:rPr>
+          <w:i/>
+        </w:rPr>
+      </w:pPr>
+      <w:r>
+        <w:rPr>
+          <w:i/>
+        </w:rPr>
+        <w:t xml:space="preserve">97 – Para deixar nossa seção do mapa de uma forma mais estilizada, vamos dar um espaço interno para cima e para baixo de 3em e 0 </w:t>
+      </w:r>
+      <w:r>
+        <w:rPr>
+          <w:i/>
+        </w:rPr>
+        <w:t>para os</w:t>
+      </w:r>
+      <w:r>
+        <w:rPr>
+          <w:i/>
+        </w:rPr>
+        <w:t xml:space="preserve"> lados.</w:t>
+      </w:r>
+    </w:p>
+    <w:p>
+      <w:pPr>
+        <w:rPr>
+          <w:i/>
+        </w:rPr>
+      </w:pPr>
+      <w:r>
+        <w:rPr>
+          <w:i/>
+          <w:noProof/>
+        </w:rPr>
+        <w:drawing>
+          <wp:inline distT="0" distB="0" distL="0" distR="0" wp14:anchorId="6393016C" wp14:editId="19AA88B1">
+            <wp:extent cx="1448002" cy="543001"/>
+            <wp:effectExtent l="0" t="0" r="0" b="9525"/>
+            <wp:docPr id="195" name="Imagem 195"/>
+            <wp:cNvGraphicFramePr>
+              <a:graphicFrameLocks xmlns:a="http://schemas.openxmlformats.org/drawingml/2006/main" noChangeAspect="1"/>
+            </wp:cNvGraphicFramePr>
+            <a:graphic xmlns:a="http://schemas.openxmlformats.org/drawingml/2006/main">
+              <a:graphicData uri="http://schemas.openxmlformats.org/drawingml/2006/picture">
+                <pic:pic xmlns:pic="http://schemas.openxmlformats.org/drawingml/2006/picture">
+                  <pic:nvPicPr>
+                    <pic:cNvPr id="1" name=""/>
+                    <pic:cNvPicPr/>
+                  </pic:nvPicPr>
+                  <pic:blipFill>
+                    <a:blip r:embed="rId164"/>
+                    <a:stretch>
+                      <a:fillRect/>
+                    </a:stretch>
+                  </pic:blipFill>
+                  <pic:spPr>
+                    <a:xfrm>
+                      <a:off x="0" y="0"/>
+                      <a:ext cx="1448002" cy="543001"/>
+                    </a:xfrm>
+                    <a:prstGeom prst="rect">
+                      <a:avLst/>
+                    </a:prstGeom>
+                  </pic:spPr>
+                </pic:pic>
+              </a:graphicData>
+            </a:graphic>
+          </wp:inline>
+        </w:drawing>
+      </w:r>
+    </w:p>
+    <w:p>
+      <w:pPr>
+        <w:rPr>
+          <w:i/>
+        </w:rPr>
+      </w:pPr>
+      <w:r>
+        <w:rPr>
+          <w:i/>
+        </w:rPr>
+        <w:t>98 – Demos um espaço para baixo no parágrafo da seção mapa e centralizamos o texto.</w:t>
+      </w:r>
+    </w:p>
+    <w:p>
+      <w:pPr>
+        <w:rPr>
+          <w:i/>
+        </w:rPr>
+      </w:pPr>
+      <w:r>
+        <w:rPr>
+          <w:i/>
+          <w:noProof/>
+        </w:rPr>
+        <w:drawing>
+          <wp:inline distT="0" distB="0" distL="0" distR="0" wp14:anchorId="5BFECD21" wp14:editId="59105B61">
+            <wp:extent cx="1714739" cy="733527"/>
+            <wp:effectExtent l="0" t="0" r="0" b="9525"/>
+            <wp:docPr id="196" name="Imagem 196"/>
+            <wp:cNvGraphicFramePr>
+              <a:graphicFrameLocks xmlns:a="http://schemas.openxmlformats.org/drawingml/2006/main" noChangeAspect="1"/>
+            </wp:cNvGraphicFramePr>
+            <a:graphic xmlns:a="http://schemas.openxmlformats.org/drawingml/2006/main">
+              <a:graphicData uri="http://schemas.openxmlformats.org/drawingml/2006/picture">
+                <pic:pic xmlns:pic="http://schemas.openxmlformats.org/drawingml/2006/picture">
+                  <pic:nvPicPr>
+                    <pic:cNvPr id="1" name=""/>
+                    <pic:cNvPicPr/>
+                  </pic:nvPicPr>
+                  <pic:blipFill>
+                    <a:blip r:embed="rId165"/>
+                    <a:stretch>
+                      <a:fillRect/>
+                    </a:stretch>
+                  </pic:blipFill>
+                  <pic:spPr>
+                    <a:xfrm>
+                      <a:off x="0" y="0"/>
+                      <a:ext cx="1714739" cy="733527"/>
+                    </a:xfrm>
+                    <a:prstGeom prst="rect">
+                      <a:avLst/>
+                    </a:prstGeom>
+                  </pic:spPr>
+                </pic:pic>
+              </a:graphicData>
+            </a:graphic>
+          </wp:inline>
+        </w:drawing>
+      </w:r>
+    </w:p>
+    <w:p>
+      <w:pPr>
+        <w:rPr>
+          <w:i/>
+        </w:rPr>
+      </w:pPr>
+      <w:r>
+        <w:rPr>
+          <w:i/>
+        </w:rPr>
+        <w:t xml:space="preserve">99 – Já que estamos </w:t>
+      </w:r>
+      <w:r>
+        <w:rPr>
+          <w:i/>
+        </w:rPr>
+        <w:t xml:space="preserve">mexendo com </w:t>
+      </w:r>
+      <w:proofErr w:type="spellStart"/>
+      <w:r>
+        <w:rPr>
+          <w:i/>
+        </w:rPr>
+        <w:t>inframe</w:t>
+      </w:r>
+      <w:proofErr w:type="spellEnd"/>
+      <w:r>
+        <w:rPr>
+          <w:i/>
+        </w:rPr>
+        <w:t xml:space="preserve"> vamos aprender a incorporar um vídeo do </w:t>
+      </w:r>
+      <w:proofErr w:type="spellStart"/>
+      <w:r>
+        <w:rPr>
+          <w:i/>
+        </w:rPr>
+        <w:t>Youtube</w:t>
+      </w:r>
+      <w:proofErr w:type="spellEnd"/>
+      <w:r>
+        <w:rPr>
+          <w:i/>
+        </w:rPr>
+        <w:t xml:space="preserve">. </w:t>
+      </w:r>
+    </w:p>
+    <w:p>
+      <w:pPr>
+        <w:rPr>
+          <w:i/>
+        </w:rPr>
+      </w:pPr>
+      <w:r>
+        <w:rPr>
+          <w:i/>
+        </w:rPr>
+        <w:t xml:space="preserve">Vamos entra no </w:t>
+      </w:r>
+      <w:proofErr w:type="spellStart"/>
+      <w:r>
+        <w:rPr>
+          <w:i/>
+        </w:rPr>
+        <w:t>Youtube</w:t>
+      </w:r>
+      <w:proofErr w:type="spellEnd"/>
+      <w:r>
+        <w:rPr>
+          <w:i/>
+        </w:rPr>
+        <w:t xml:space="preserve"> no seguinte endereço:</w:t>
+      </w:r>
+      <w:r>
+        <w:t xml:space="preserve"> </w:t>
+      </w:r>
+      <w:hyperlink r:id="rId166" w:history="1">
+        <w:r>
+          <w:rPr>
+            <w:rStyle w:val="Hyperlink"/>
+            <w:i/>
+          </w:rPr>
+          <w:t>https://www.youtube.com/results?search_query=scissor+cut+short+back</w:t>
+        </w:r>
+      </w:hyperlink>
+    </w:p>
+    <w:p>
+      <w:pPr>
+        <w:rPr>
+          <w:i/>
+        </w:rPr>
+      </w:pPr>
+      <w:r>
+        <w:rPr>
+          <w:i/>
+        </w:rPr>
+        <w:t xml:space="preserve">Na página do </w:t>
+      </w:r>
+      <w:proofErr w:type="spellStart"/>
+      <w:r>
+        <w:rPr>
+          <w:i/>
+        </w:rPr>
+        <w:t>youtube</w:t>
+      </w:r>
+      <w:proofErr w:type="spellEnd"/>
+      <w:r>
+        <w:rPr>
+          <w:i/>
+        </w:rPr>
+        <w:t xml:space="preserve"> vai aparecer um campo chamado compartilhar ao clicar nesse campo vai aparecer um ícone de </w:t>
+      </w:r>
+      <w:proofErr w:type="spellStart"/>
+      <w:r>
+        <w:rPr>
+          <w:i/>
+        </w:rPr>
+        <w:t>tag</w:t>
+      </w:r>
+      <w:proofErr w:type="spellEnd"/>
+      <w:r>
+        <w:rPr>
+          <w:i/>
+        </w:rPr>
+        <w:t xml:space="preserve"> &lt;&gt;(</w:t>
+      </w:r>
+      <w:proofErr w:type="gramStart"/>
+      <w:r>
+        <w:rPr>
+          <w:i/>
+        </w:rPr>
+        <w:t>Incorporar)  para</w:t>
+      </w:r>
+      <w:proofErr w:type="gramEnd"/>
+      <w:r>
+        <w:rPr>
+          <w:i/>
+        </w:rPr>
+        <w:t xml:space="preserve"> copiar o link e colar na página.</w:t>
+      </w:r>
+    </w:p>
+    <w:p>
+      <w:pPr>
+        <w:rPr>
+          <w:i/>
+        </w:rPr>
+      </w:pPr>
+      <w:r>
+        <w:rPr>
+          <w:i/>
+          <w:noProof/>
+        </w:rPr>
+        <w:drawing>
+          <wp:inline distT="0" distB="0" distL="0" distR="0" wp14:anchorId="0A23A640" wp14:editId="14ADA205">
+            <wp:extent cx="4867954" cy="3858163"/>
+            <wp:effectExtent l="0" t="0" r="8890" b="9525"/>
+            <wp:docPr id="197" name="Imagem 197"/>
+            <wp:cNvGraphicFramePr>
+              <a:graphicFrameLocks xmlns:a="http://schemas.openxmlformats.org/drawingml/2006/main" noChangeAspect="1"/>
+            </wp:cNvGraphicFramePr>
+            <a:graphic xmlns:a="http://schemas.openxmlformats.org/drawingml/2006/main">
+              <a:graphicData uri="http://schemas.openxmlformats.org/drawingml/2006/picture">
+                <pic:pic xmlns:pic="http://schemas.openxmlformats.org/drawingml/2006/picture">
+                  <pic:nvPicPr>
+                    <pic:cNvPr id="1" name=""/>
+                    <pic:cNvPicPr/>
+                  </pic:nvPicPr>
+                  <pic:blipFill>
+                    <a:blip r:embed="rId167"/>
+                    <a:stretch>
+                      <a:fillRect/>
+                    </a:stretch>
+                  </pic:blipFill>
+                  <pic:spPr>
+                    <a:xfrm>
+                      <a:off x="0" y="0"/>
+                      <a:ext cx="4867954" cy="3858163"/>
+                    </a:xfrm>
+                    <a:prstGeom prst="rect">
+                      <a:avLst/>
+                    </a:prstGeom>
+                  </pic:spPr>
+                </pic:pic>
+              </a:graphicData>
+            </a:graphic>
+          </wp:inline>
+        </w:drawing>
+      </w:r>
+    </w:p>
+    <w:p>
+      <w:pPr>
+        <w:rPr>
+          <w:i/>
+        </w:rPr>
+      </w:pPr>
+      <w:r>
+        <w:rPr>
+          <w:i/>
+        </w:rPr>
+        <w:t xml:space="preserve">100 – Para trabalhar com o vídeo no </w:t>
+      </w:r>
+      <w:proofErr w:type="spellStart"/>
+      <w:r>
+        <w:rPr>
+          <w:i/>
+        </w:rPr>
+        <w:t>css</w:t>
+      </w:r>
+      <w:proofErr w:type="spellEnd"/>
+      <w:r>
+        <w:rPr>
+          <w:i/>
+        </w:rPr>
+        <w:t xml:space="preserve"> adicionamos uma </w:t>
+      </w:r>
+      <w:proofErr w:type="spellStart"/>
+      <w:r>
+        <w:rPr>
+          <w:i/>
+        </w:rPr>
+        <w:t>div</w:t>
+      </w:r>
+      <w:proofErr w:type="spellEnd"/>
+      <w:r>
+        <w:rPr>
+          <w:i/>
+        </w:rPr>
+        <w:t xml:space="preserve"> com o mapa </w:t>
+      </w:r>
+      <w:proofErr w:type="spellStart"/>
+      <w:r>
+        <w:rPr>
+          <w:i/>
+        </w:rPr>
+        <w:t>class</w:t>
+      </w:r>
+      <w:proofErr w:type="spellEnd"/>
+      <w:r>
+        <w:rPr>
+          <w:i/>
+        </w:rPr>
+        <w:t xml:space="preserve"> vídeo entorno do link.</w:t>
+      </w:r>
+    </w:p>
+    <w:p>
+      <w:pPr>
+        <w:rPr>
+          <w:i/>
+        </w:rPr>
+      </w:pPr>
+      <w:r>
+        <w:rPr>
+          <w:i/>
+          <w:noProof/>
+        </w:rPr>
+        <w:drawing>
+          <wp:inline distT="0" distB="0" distL="0" distR="0" wp14:anchorId="4ABF0D55" wp14:editId="1E6F4D53">
+            <wp:extent cx="7525800" cy="1571844"/>
+            <wp:effectExtent l="0" t="0" r="0" b="9525"/>
+            <wp:docPr id="198" name="Imagem 198"/>
+            <wp:cNvGraphicFramePr>
+              <a:graphicFrameLocks xmlns:a="http://schemas.openxmlformats.org/drawingml/2006/main" noChangeAspect="1"/>
+            </wp:cNvGraphicFramePr>
+            <a:graphic xmlns:a="http://schemas.openxmlformats.org/drawingml/2006/main">
+              <a:graphicData uri="http://schemas.openxmlformats.org/drawingml/2006/picture">
+                <pic:pic xmlns:pic="http://schemas.openxmlformats.org/drawingml/2006/picture">
+                  <pic:nvPicPr>
+                    <pic:cNvPr id="1" name=""/>
+                    <pic:cNvPicPr/>
+                  </pic:nvPicPr>
+                  <pic:blipFill>
+                    <a:blip r:embed="rId168"/>
+                    <a:stretch>
+                      <a:fillRect/>
+                    </a:stretch>
+                  </pic:blipFill>
+                  <pic:spPr>
+                    <a:xfrm>
+                      <a:off x="0" y="0"/>
+                      <a:ext cx="7525800" cy="1571844"/>
+                    </a:xfrm>
+                    <a:prstGeom prst="rect">
+                      <a:avLst/>
+                    </a:prstGeom>
+                  </pic:spPr>
+                </pic:pic>
+              </a:graphicData>
+            </a:graphic>
+          </wp:inline>
+        </w:drawing>
+      </w:r>
+    </w:p>
+    <w:p>
+      <w:pPr>
+        <w:rPr>
+          <w:i/>
+        </w:rPr>
+      </w:pPr>
+      <w:r>
+        <w:rPr>
+          <w:i/>
+        </w:rPr>
+        <w:t>101</w:t>
+      </w:r>
+      <w:r>
+        <w:rPr>
+          <w:i/>
+        </w:rPr>
+        <w:t xml:space="preserve"> – No </w:t>
+      </w:r>
+      <w:proofErr w:type="spellStart"/>
+      <w:r>
+        <w:rPr>
+          <w:i/>
+        </w:rPr>
+        <w:t>css</w:t>
+      </w:r>
+      <w:proofErr w:type="spellEnd"/>
+      <w:r>
+        <w:rPr>
+          <w:i/>
+        </w:rPr>
+        <w:t xml:space="preserve">, </w:t>
+      </w:r>
+      <w:proofErr w:type="spellStart"/>
+      <w:r>
+        <w:rPr>
+          <w:i/>
+        </w:rPr>
+        <w:t>class</w:t>
+      </w:r>
+      <w:proofErr w:type="spellEnd"/>
+      <w:r>
+        <w:rPr>
+          <w:i/>
+        </w:rPr>
+        <w:t xml:space="preserve"> vídeo, vamos colocar uma largura para vídeo 560px e vamos dar um espaço externo para cima e para baixo de 1em auto.</w:t>
+      </w:r>
+    </w:p>
+    <w:p>
+      <w:pPr>
+        <w:rPr>
+          <w:i/>
+        </w:rPr>
+      </w:pPr>
+      <w:r>
+        <w:rPr>
+          <w:i/>
+        </w:rPr>
+        <w:drawing>
+          <wp:inline distT="0" distB="0" distL="0" distR="0" wp14:anchorId="59996151" wp14:editId="6C373FE2">
+            <wp:extent cx="1686160" cy="724001"/>
+            <wp:effectExtent l="0" t="0" r="9525" b="0"/>
+            <wp:docPr id="199" name="Imagem 199"/>
+            <wp:cNvGraphicFramePr>
+              <a:graphicFrameLocks xmlns:a="http://schemas.openxmlformats.org/drawingml/2006/main" noChangeAspect="1"/>
+            </wp:cNvGraphicFramePr>
+            <a:graphic xmlns:a="http://schemas.openxmlformats.org/drawingml/2006/main">
+              <a:graphicData uri="http://schemas.openxmlformats.org/drawingml/2006/picture">
+                <pic:pic xmlns:pic="http://schemas.openxmlformats.org/drawingml/2006/picture">
+                  <pic:nvPicPr>
+                    <pic:cNvPr id="1" name=""/>
+                    <pic:cNvPicPr/>
+                  </pic:nvPicPr>
+                  <pic:blipFill>
+                    <a:blip r:embed="rId169"/>
+                    <a:stretch>
+                      <a:fillRect/>
+                    </a:stretch>
+                  </pic:blipFill>
+                  <pic:spPr>
+                    <a:xfrm>
+                      <a:off x="0" y="0"/>
+                      <a:ext cx="1686160" cy="724001"/>
+                    </a:xfrm>
+                    <a:prstGeom prst="rect">
+                      <a:avLst/>
+                    </a:prstGeom>
+                  </pic:spPr>
+                </pic:pic>
+              </a:graphicData>
+            </a:graphic>
+          </wp:inline>
+        </w:drawing>
+      </w:r>
+    </w:p>
+    <w:p>
+      <w:pPr>
+        <w:rPr>
+          <w:i/>
+        </w:rPr>
+      </w:pPr>
+      <w:r>
+        <w:rPr>
+          <w:i/>
+        </w:rPr>
+        <w:t xml:space="preserve">102 – Criamos uma </w:t>
+      </w:r>
+      <w:proofErr w:type="spellStart"/>
+      <w:r>
+        <w:rPr>
+          <w:i/>
+        </w:rPr>
+        <w:t>div</w:t>
+      </w:r>
+      <w:proofErr w:type="spellEnd"/>
+      <w:r>
+        <w:rPr>
+          <w:i/>
+        </w:rPr>
+        <w:t xml:space="preserve"> com a </w:t>
+      </w:r>
+      <w:proofErr w:type="spellStart"/>
+      <w:r>
+        <w:rPr>
+          <w:i/>
+        </w:rPr>
+        <w:t>class</w:t>
+      </w:r>
+      <w:proofErr w:type="spellEnd"/>
+      <w:r>
+        <w:rPr>
+          <w:i/>
+        </w:rPr>
+        <w:t xml:space="preserve"> chamada conteúdo-</w:t>
+      </w:r>
+      <w:proofErr w:type="spellStart"/>
+      <w:r>
+        <w:rPr>
+          <w:i/>
+        </w:rPr>
+        <w:t>beneficios</w:t>
+      </w:r>
+      <w:proofErr w:type="spellEnd"/>
+      <w:r>
+        <w:rPr>
+          <w:i/>
+        </w:rPr>
+        <w:t xml:space="preserve"> que envolve a lista e a imagem benefício para trabalhar com espaço entre elas.</w:t>
+      </w:r>
+    </w:p>
+    <w:p>
+      <w:pPr>
+        <w:rPr>
+          <w:i/>
+        </w:rPr>
+      </w:pPr>
+      <w:r>
+        <w:rPr>
+          <w:i/>
+        </w:rPr>
+        <w:drawing>
+          <wp:inline distT="0" distB="0" distL="0" distR="0" wp14:anchorId="7C5A76CA" wp14:editId="358C211D">
+            <wp:extent cx="5372850" cy="1971950"/>
+            <wp:effectExtent l="0" t="0" r="0" b="9525"/>
+            <wp:docPr id="200" name="Imagem 200"/>
+            <wp:cNvGraphicFramePr>
+              <a:graphicFrameLocks xmlns:a="http://schemas.openxmlformats.org/drawingml/2006/main" noChangeAspect="1"/>
+            </wp:cNvGraphicFramePr>
+            <a:graphic xmlns:a="http://schemas.openxmlformats.org/drawingml/2006/main">
+              <a:graphicData uri="http://schemas.openxmlformats.org/drawingml/2006/picture">
+                <pic:pic xmlns:pic="http://schemas.openxmlformats.org/drawingml/2006/picture">
+                  <pic:nvPicPr>
+                    <pic:cNvPr id="1" name=""/>
+                    <pic:cNvPicPr/>
+                  </pic:nvPicPr>
+                  <pic:blipFill>
+                    <a:blip r:embed="rId170"/>
+                    <a:stretch>
+                      <a:fillRect/>
+                    </a:stretch>
+                  </pic:blipFill>
+                  <pic:spPr>
+                    <a:xfrm>
+                      <a:off x="0" y="0"/>
+                      <a:ext cx="5372850" cy="1971950"/>
                     </a:xfrm>
                     <a:prstGeom prst="rect">
                       <a:avLst/>
@@ -17853,7 +18557,7 @@
 </file>
 
 <file path=customXml/itemProps4.xml><?xml version="1.0" encoding="utf-8"?>
-<ds:datastoreItem xmlns:ds="http://schemas.openxmlformats.org/officeDocument/2006/customXml" ds:itemID="{6EC3F37B-9E6C-40C7-9222-561AEE93753E}">
+<ds:datastoreItem xmlns:ds="http://schemas.openxmlformats.org/officeDocument/2006/customXml" ds:itemID="{F488A889-5972-4F90-AF82-1017B6B1890D}">
   <ds:schemaRefs>
     <ds:schemaRef ds:uri="http://schemas.openxmlformats.org/officeDocument/2006/bibliography"/>
   </ds:schemaRefs>

</xml_diff>

<commit_message>
atualização da aula dia 01/10/2026
</commit_message>
<xml_diff>
--- a/apostila/Projeto Space for me3.docx
+++ b/apostila/Projeto Space for me3.docx
@@ -16997,6 +16997,7 @@
       <w:r>
         <w:rPr>
           <w:i/>
+          <w:noProof/>
         </w:rPr>
         <w:drawing>
           <wp:inline distT="0" distB="0" distL="0" distR="0" wp14:anchorId="59996151" wp14:editId="6C373FE2">
@@ -17099,6 +17100,7 @@
       <w:r>
         <w:rPr>
           <w:i/>
+          <w:noProof/>
         </w:rPr>
         <w:drawing>
           <wp:inline distT="0" distB="0" distL="0" distR="0" wp14:anchorId="7C5A76CA" wp14:editId="358C211D">
@@ -17136,8 +17138,1100 @@
           </wp:inline>
         </w:drawing>
       </w:r>
+    </w:p>
+    <w:p>
+      <w:pPr>
+        <w:rPr>
+          <w:i/>
+        </w:rPr>
+      </w:pPr>
+      <w:r>
+        <w:rPr>
+          <w:i/>
+        </w:rPr>
+        <w:t>103</w:t>
+      </w:r>
+      <w:r>
+        <w:rPr>
+          <w:i/>
+        </w:rPr>
+        <w:t xml:space="preserve"> – Adicionamos uma </w:t>
+      </w:r>
+      <w:proofErr w:type="spellStart"/>
+      <w:r>
+        <w:rPr>
+          <w:i/>
+        </w:rPr>
+        <w:t>class</w:t>
+      </w:r>
+      <w:proofErr w:type="spellEnd"/>
+      <w:r>
+        <w:rPr>
+          <w:i/>
+        </w:rPr>
+        <w:t xml:space="preserve"> para a lista que está dentro da seção benefícios.</w:t>
+      </w:r>
+    </w:p>
+    <w:p>
+      <w:pPr>
+        <w:rPr>
+          <w:i/>
+        </w:rPr>
+      </w:pPr>
+      <w:r>
+        <w:rPr>
+          <w:i/>
+        </w:rPr>
+        <w:drawing>
+          <wp:inline distT="0" distB="0" distL="0" distR="0" wp14:anchorId="16F99942" wp14:editId="00793F30">
+            <wp:extent cx="4267796" cy="1419423"/>
+            <wp:effectExtent l="0" t="0" r="0" b="9525"/>
+            <wp:docPr id="201" name="Imagem 201"/>
+            <wp:cNvGraphicFramePr>
+              <a:graphicFrameLocks xmlns:a="http://schemas.openxmlformats.org/drawingml/2006/main" noChangeAspect="1"/>
+            </wp:cNvGraphicFramePr>
+            <a:graphic xmlns:a="http://schemas.openxmlformats.org/drawingml/2006/main">
+              <a:graphicData uri="http://schemas.openxmlformats.org/drawingml/2006/picture">
+                <pic:pic xmlns:pic="http://schemas.openxmlformats.org/drawingml/2006/picture">
+                  <pic:nvPicPr>
+                    <pic:cNvPr id="1" name=""/>
+                    <pic:cNvPicPr/>
+                  </pic:nvPicPr>
+                  <pic:blipFill>
+                    <a:blip r:embed="rId171"/>
+                    <a:stretch>
+                      <a:fillRect/>
+                    </a:stretch>
+                  </pic:blipFill>
+                  <pic:spPr>
+                    <a:xfrm>
+                      <a:off x="0" y="0"/>
+                      <a:ext cx="4267796" cy="1419423"/>
+                    </a:xfrm>
+                    <a:prstGeom prst="rect">
+                      <a:avLst/>
+                    </a:prstGeom>
+                  </pic:spPr>
+                </pic:pic>
+              </a:graphicData>
+            </a:graphic>
+          </wp:inline>
+        </w:drawing>
+      </w:r>
+    </w:p>
+    <w:p>
+      <w:pPr>
+        <w:rPr>
+          <w:i/>
+        </w:rPr>
+      </w:pPr>
+      <w:r>
+        <w:rPr>
+          <w:i/>
+          <w:noProof/>
+        </w:rPr>
+        <mc:AlternateContent>
+          <mc:Choice Requires="wps">
+            <w:drawing>
+              <wp:anchor distT="0" distB="0" distL="114300" distR="114300" simplePos="0" relativeHeight="251702272" behindDoc="0" locked="0" layoutInCell="1" allowOverlap="1" wp14:anchorId="18916014" wp14:editId="274E4DD3">
+                <wp:simplePos x="0" y="0"/>
+                <wp:positionH relativeFrom="column">
+                  <wp:posOffset>2305049</wp:posOffset>
+                </wp:positionH>
+                <wp:positionV relativeFrom="paragraph">
+                  <wp:posOffset>1360170</wp:posOffset>
+                </wp:positionV>
+                <wp:extent cx="3743325" cy="1066800"/>
+                <wp:effectExtent l="38100" t="0" r="28575" b="76200"/>
+                <wp:wrapNone/>
+                <wp:docPr id="204" name="Conector de Seta Reta 204"/>
+                <wp:cNvGraphicFramePr/>
+                <a:graphic xmlns:a="http://schemas.openxmlformats.org/drawingml/2006/main">
+                  <a:graphicData uri="http://schemas.microsoft.com/office/word/2010/wordprocessingShape">
+                    <wps:wsp>
+                      <wps:cNvCnPr/>
+                      <wps:spPr>
+                        <a:xfrm flipH="1">
+                          <a:off x="0" y="0"/>
+                          <a:ext cx="3743325" cy="1066800"/>
+                        </a:xfrm>
+                        <a:prstGeom prst="straightConnector1">
+                          <a:avLst/>
+                        </a:prstGeom>
+                        <a:ln>
+                          <a:tailEnd type="triangle"/>
+                        </a:ln>
+                      </wps:spPr>
+                      <wps:style>
+                        <a:lnRef idx="1">
+                          <a:schemeClr val="accent2"/>
+                        </a:lnRef>
+                        <a:fillRef idx="0">
+                          <a:schemeClr val="accent2"/>
+                        </a:fillRef>
+                        <a:effectRef idx="0">
+                          <a:schemeClr val="accent2"/>
+                        </a:effectRef>
+                        <a:fontRef idx="minor">
+                          <a:schemeClr val="tx1"/>
+                        </a:fontRef>
+                      </wps:style>
+                      <wps:bodyPr/>
+                    </wps:wsp>
+                  </a:graphicData>
+                </a:graphic>
+                <wp14:sizeRelH relativeFrom="margin">
+                  <wp14:pctWidth>0</wp14:pctWidth>
+                </wp14:sizeRelH>
+                <wp14:sizeRelV relativeFrom="margin">
+                  <wp14:pctHeight>0</wp14:pctHeight>
+                </wp14:sizeRelV>
+              </wp:anchor>
+            </w:drawing>
+          </mc:Choice>
+          <mc:Fallback>
+            <w:pict>
+              <v:shapetype w14:anchorId="4780E4EE" id="_x0000_t32" coordsize="21600,21600" o:spt="32" o:oned="t" path="m,l21600,21600e" filled="f">
+                <v:path arrowok="t" fillok="f" o:connecttype="none"/>
+                <o:lock v:ext="edit" shapetype="t"/>
+              </v:shapetype>
+              <v:shape id="Conector de Seta Reta 204" o:spid="_x0000_s1026" type="#_x0000_t32" style="position:absolute;margin-left:181.5pt;margin-top:107.1pt;width:294.75pt;height:84pt;flip:x;z-index:251702272;visibility:visible;mso-wrap-style:square;mso-width-percent:0;mso-height-percent:0;mso-wrap-distance-left:9pt;mso-wrap-distance-top:0;mso-wrap-distance-right:9pt;mso-wrap-distance-bottom:0;mso-position-horizontal:absolute;mso-position-horizontal-relative:text;mso-position-vertical:absolute;mso-position-vertical-relative:text;mso-width-percent:0;mso-height-percent:0;mso-width-relative:margin;mso-height-relative:margin" o:gfxdata="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" strokecolor="#ed7d31 [3205]" strokeweight=".5pt">
+                <v:stroke endarrow="block" joinstyle="miter"/>
+              </v:shape>
+            </w:pict>
+          </mc:Fallback>
+        </mc:AlternateContent>
+      </w:r>
+      <w:r>
+        <w:rPr>
+          <w:i/>
+        </w:rPr>
+        <w:t xml:space="preserve">104 – Após colocar a uma </w:t>
+      </w:r>
+      <w:proofErr w:type="spellStart"/>
+      <w:r>
+        <w:rPr>
+          <w:i/>
+        </w:rPr>
+        <w:t>class</w:t>
+      </w:r>
+      <w:proofErr w:type="spellEnd"/>
+      <w:r>
+        <w:rPr>
+          <w:i/>
+        </w:rPr>
+        <w:t xml:space="preserve"> na lista definimos a largura para 40% com intuito de colocar a lista ao lado da imagem benefícios depois mudamos a natureza da lista para ficar </w:t>
+      </w:r>
+      <w:proofErr w:type="spellStart"/>
+      <w:r>
+        <w:rPr>
+          <w:i/>
+        </w:rPr>
+        <w:t>inline-block</w:t>
+      </w:r>
+      <w:proofErr w:type="spellEnd"/>
+      <w:r>
+        <w:rPr>
+          <w:i/>
+        </w:rPr>
+        <w:t>, notamos que quando estamos trabalhando com 100% de espaço:</w:t>
+      </w:r>
+    </w:p>
+    <w:p>
+      <w:pPr>
+        <w:pStyle w:val="PargrafodaLista"/>
+        <w:numPr>
+          <w:ilvl w:val="0"/>
+          <w:numId w:val="3"/>
+        </w:numPr>
+        <w:rPr>
+          <w:i/>
+        </w:rPr>
+      </w:pPr>
+      <w:r>
+        <w:rPr>
+          <w:i/>
+        </w:rPr>
+        <w:t xml:space="preserve">Lista com 40% de largura </w:t>
+      </w:r>
+    </w:p>
+    <w:p>
+      <w:pPr>
+        <w:pStyle w:val="PargrafodaLista"/>
+        <w:numPr>
+          <w:ilvl w:val="0"/>
+          <w:numId w:val="3"/>
+        </w:numPr>
+        <w:rPr>
+          <w:i/>
+        </w:rPr>
+      </w:pPr>
+      <w:r>
+        <w:rPr>
+          <w:i/>
+        </w:rPr>
+        <w:t>A imagem com 60% de largura</w:t>
+      </w:r>
+    </w:p>
+    <w:p>
+      <w:pPr>
+        <w:rPr>
+          <w:i/>
+        </w:rPr>
+      </w:pPr>
+      <w:r>
+        <w:rPr>
+          <w:i/>
+        </w:rPr>
+        <w:t xml:space="preserve">Se faz necessário não deixar espaço no </w:t>
+      </w:r>
+      <w:proofErr w:type="spellStart"/>
+      <w:r>
+        <w:rPr>
+          <w:i/>
+        </w:rPr>
+        <w:t>html</w:t>
+      </w:r>
+      <w:proofErr w:type="spellEnd"/>
+      <w:r>
+        <w:rPr>
+          <w:i/>
+        </w:rPr>
+        <w:t xml:space="preserve"> entre a lista e a imagem.,</w:t>
+      </w:r>
+    </w:p>
+    <w:p>
+      <w:pPr>
+        <w:rPr>
+          <w:i/>
+        </w:rPr>
+      </w:pPr>
+      <w:r>
+        <w:rPr>
+          <w:i/>
+        </w:rPr>
+        <w:drawing>
+          <wp:inline distT="0" distB="0" distL="0" distR="0" wp14:anchorId="60ED7D1C" wp14:editId="042A7F3B">
+            <wp:extent cx="1829055" cy="1495634"/>
+            <wp:effectExtent l="0" t="0" r="0" b="9525"/>
+            <wp:docPr id="202" name="Imagem 202"/>
+            <wp:cNvGraphicFramePr>
+              <a:graphicFrameLocks xmlns:a="http://schemas.openxmlformats.org/drawingml/2006/main" noChangeAspect="1"/>
+            </wp:cNvGraphicFramePr>
+            <a:graphic xmlns:a="http://schemas.openxmlformats.org/drawingml/2006/main">
+              <a:graphicData uri="http://schemas.openxmlformats.org/drawingml/2006/picture">
+                <pic:pic xmlns:pic="http://schemas.openxmlformats.org/drawingml/2006/picture">
+                  <pic:nvPicPr>
+                    <pic:cNvPr id="1" name=""/>
+                    <pic:cNvPicPr/>
+                  </pic:nvPicPr>
+                  <pic:blipFill>
+                    <a:blip r:embed="rId172"/>
+                    <a:stretch>
+                      <a:fillRect/>
+                    </a:stretch>
+                  </pic:blipFill>
+                  <pic:spPr>
+                    <a:xfrm>
+                      <a:off x="0" y="0"/>
+                      <a:ext cx="1829055" cy="1495634"/>
+                    </a:xfrm>
+                    <a:prstGeom prst="rect">
+                      <a:avLst/>
+                    </a:prstGeom>
+                  </pic:spPr>
+                </pic:pic>
+              </a:graphicData>
+            </a:graphic>
+          </wp:inline>
+        </w:drawing>
+      </w:r>
+      <w:r>
+        <w:rPr>
+          <w:i/>
+        </w:rPr>
+        <w:drawing>
+          <wp:inline distT="0" distB="0" distL="0" distR="0" wp14:anchorId="1D59202B" wp14:editId="7F33C64B">
+            <wp:extent cx="5220429" cy="1400370"/>
+            <wp:effectExtent l="0" t="0" r="0" b="9525"/>
+            <wp:docPr id="203" name="Imagem 203"/>
+            <wp:cNvGraphicFramePr>
+              <a:graphicFrameLocks xmlns:a="http://schemas.openxmlformats.org/drawingml/2006/main" noChangeAspect="1"/>
+            </wp:cNvGraphicFramePr>
+            <a:graphic xmlns:a="http://schemas.openxmlformats.org/drawingml/2006/main">
+              <a:graphicData uri="http://schemas.openxmlformats.org/drawingml/2006/picture">
+                <pic:pic xmlns:pic="http://schemas.openxmlformats.org/drawingml/2006/picture">
+                  <pic:nvPicPr>
+                    <pic:cNvPr id="1" name=""/>
+                    <pic:cNvPicPr/>
+                  </pic:nvPicPr>
+                  <pic:blipFill>
+                    <a:blip r:embed="rId173"/>
+                    <a:stretch>
+                      <a:fillRect/>
+                    </a:stretch>
+                  </pic:blipFill>
+                  <pic:spPr>
+                    <a:xfrm>
+                      <a:off x="0" y="0"/>
+                      <a:ext cx="5220429" cy="1400370"/>
+                    </a:xfrm>
+                    <a:prstGeom prst="rect">
+                      <a:avLst/>
+                    </a:prstGeom>
+                  </pic:spPr>
+                </pic:pic>
+              </a:graphicData>
+            </a:graphic>
+          </wp:inline>
+        </w:drawing>
+      </w:r>
+    </w:p>
+    <w:p>
+      <w:pPr>
+        <w:rPr>
+          <w:i/>
+        </w:rPr>
+      </w:pPr>
+      <w:r>
+        <w:rPr>
+          <w:i/>
+        </w:rPr>
+        <w:t>105 – Alinhamos a lista no topo da imagem utilizando vertical-</w:t>
+      </w:r>
+      <w:proofErr w:type="spellStart"/>
+      <w:r>
+        <w:rPr>
+          <w:i/>
+        </w:rPr>
+        <w:t>aling</w:t>
+      </w:r>
+      <w:proofErr w:type="spellEnd"/>
+      <w:r>
+        <w:rPr>
+          <w:i/>
+        </w:rPr>
+        <w:t xml:space="preserve">: top, incluímos mais dois itens da lista no </w:t>
+      </w:r>
+      <w:proofErr w:type="spellStart"/>
+      <w:r>
+        <w:rPr>
+          <w:i/>
+        </w:rPr>
+        <w:t>html</w:t>
+      </w:r>
+      <w:proofErr w:type="spellEnd"/>
+      <w:r>
+        <w:rPr>
+          <w:i/>
+        </w:rPr>
+        <w:t xml:space="preserve"> e colocamos um espaço entre os itens da lista.</w:t>
+      </w:r>
+    </w:p>
+    <w:p>
+      <w:pPr>
+        <w:rPr>
+          <w:i/>
+        </w:rPr>
+      </w:pPr>
+      <w:r>
+        <w:rPr>
+          <w:i/>
+          <w:noProof/>
+        </w:rPr>
+        <mc:AlternateContent>
+          <mc:Choice Requires="wps">
+            <w:drawing>
+              <wp:anchor distT="0" distB="0" distL="114300" distR="114300" simplePos="0" relativeHeight="251704320" behindDoc="0" locked="0" layoutInCell="1" allowOverlap="1" wp14:anchorId="6423571B" wp14:editId="7BFEF77F">
+                <wp:simplePos x="0" y="0"/>
+                <wp:positionH relativeFrom="column">
+                  <wp:posOffset>1619250</wp:posOffset>
+                </wp:positionH>
+                <wp:positionV relativeFrom="paragraph">
+                  <wp:posOffset>2952750</wp:posOffset>
+                </wp:positionV>
+                <wp:extent cx="1333500" cy="38100"/>
+                <wp:effectExtent l="38100" t="38100" r="19050" b="95250"/>
+                <wp:wrapNone/>
+                <wp:docPr id="207" name="Conector de Seta Reta 207"/>
+                <wp:cNvGraphicFramePr/>
+                <a:graphic xmlns:a="http://schemas.openxmlformats.org/drawingml/2006/main">
+                  <a:graphicData uri="http://schemas.microsoft.com/office/word/2010/wordprocessingShape">
+                    <wps:wsp>
+                      <wps:cNvCnPr/>
+                      <wps:spPr>
+                        <a:xfrm flipH="1">
+                          <a:off x="0" y="0"/>
+                          <a:ext cx="1333500" cy="38100"/>
+                        </a:xfrm>
+                        <a:prstGeom prst="straightConnector1">
+                          <a:avLst/>
+                        </a:prstGeom>
+                        <a:ln>
+                          <a:tailEnd type="triangle"/>
+                        </a:ln>
+                      </wps:spPr>
+                      <wps:style>
+                        <a:lnRef idx="1">
+                          <a:schemeClr val="accent2"/>
+                        </a:lnRef>
+                        <a:fillRef idx="0">
+                          <a:schemeClr val="accent2"/>
+                        </a:fillRef>
+                        <a:effectRef idx="0">
+                          <a:schemeClr val="accent2"/>
+                        </a:effectRef>
+                        <a:fontRef idx="minor">
+                          <a:schemeClr val="tx1"/>
+                        </a:fontRef>
+                      </wps:style>
+                      <wps:bodyPr/>
+                    </wps:wsp>
+                  </a:graphicData>
+                </a:graphic>
+              </wp:anchor>
+            </w:drawing>
+          </mc:Choice>
+          <mc:Fallback>
+            <w:pict>
+              <v:shape w14:anchorId="663F44F2" id="Conector de Seta Reta 207" o:spid="_x0000_s1026" type="#_x0000_t32" style="position:absolute;margin-left:127.5pt;margin-top:232.5pt;width:105pt;height:3pt;flip:x;z-index:251704320;visibility:visible;mso-wrap-style:square;mso-wrap-distance-left:9pt;mso-wrap-distance-top:0;mso-wrap-distance-right:9pt;mso-wrap-distance-bottom:0;mso-position-horizontal:absolute;mso-position-horizontal-relative:text;mso-position-vertical:absolute;mso-position-vertical-relative:text" o:gfxdata="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" strokecolor="#ed7d31 [3205]" strokeweight=".5pt">
+                <v:stroke endarrow="block" joinstyle="miter"/>
+              </v:shape>
+            </w:pict>
+          </mc:Fallback>
+        </mc:AlternateContent>
+      </w:r>
+      <w:r>
+        <w:rPr>
+          <w:i/>
+          <w:noProof/>
+        </w:rPr>
+        <mc:AlternateContent>
+          <mc:Choice Requires="wps">
+            <w:drawing>
+              <wp:anchor distT="0" distB="0" distL="114300" distR="114300" simplePos="0" relativeHeight="251703296" behindDoc="0" locked="0" layoutInCell="1" allowOverlap="1" wp14:anchorId="2BC3AC55" wp14:editId="21ED28B6">
+                <wp:simplePos x="0" y="0"/>
+                <wp:positionH relativeFrom="column">
+                  <wp:posOffset>1647825</wp:posOffset>
+                </wp:positionH>
+                <wp:positionV relativeFrom="paragraph">
+                  <wp:posOffset>2066925</wp:posOffset>
+                </wp:positionV>
+                <wp:extent cx="1400175" cy="342900"/>
+                <wp:effectExtent l="38100" t="0" r="28575" b="76200"/>
+                <wp:wrapNone/>
+                <wp:docPr id="206" name="Conector de Seta Reta 206"/>
+                <wp:cNvGraphicFramePr/>
+                <a:graphic xmlns:a="http://schemas.openxmlformats.org/drawingml/2006/main">
+                  <a:graphicData uri="http://schemas.microsoft.com/office/word/2010/wordprocessingShape">
+                    <wps:wsp>
+                      <wps:cNvCnPr/>
+                      <wps:spPr>
+                        <a:xfrm flipH="1">
+                          <a:off x="0" y="0"/>
+                          <a:ext cx="1400175" cy="342900"/>
+                        </a:xfrm>
+                        <a:prstGeom prst="straightConnector1">
+                          <a:avLst/>
+                        </a:prstGeom>
+                        <a:ln>
+                          <a:tailEnd type="triangle"/>
+                        </a:ln>
+                      </wps:spPr>
+                      <wps:style>
+                        <a:lnRef idx="1">
+                          <a:schemeClr val="accent2"/>
+                        </a:lnRef>
+                        <a:fillRef idx="0">
+                          <a:schemeClr val="accent2"/>
+                        </a:fillRef>
+                        <a:effectRef idx="0">
+                          <a:schemeClr val="accent2"/>
+                        </a:effectRef>
+                        <a:fontRef idx="minor">
+                          <a:schemeClr val="tx1"/>
+                        </a:fontRef>
+                      </wps:style>
+                      <wps:bodyPr/>
+                    </wps:wsp>
+                  </a:graphicData>
+                </a:graphic>
+              </wp:anchor>
+            </w:drawing>
+          </mc:Choice>
+          <mc:Fallback>
+            <w:pict>
+              <v:shape w14:anchorId="39086CD4" id="Conector de Seta Reta 206" o:spid="_x0000_s1026" type="#_x0000_t32" style="position:absolute;margin-left:129.75pt;margin-top:162.75pt;width:110.25pt;height:27pt;flip:x;z-index:251703296;visibility:visible;mso-wrap-style:square;mso-wrap-distance-left:9pt;mso-wrap-distance-top:0;mso-wrap-distance-right:9pt;mso-wrap-distance-bottom:0;mso-position-horizontal:absolute;mso-position-horizontal-relative:text;mso-position-vertical:absolute;mso-position-vertical-relative:text" o:gfxdata="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" strokecolor="#ed7d31 [3205]" strokeweight=".5pt">
+                <v:stroke endarrow="block" joinstyle="miter"/>
+              </v:shape>
+            </w:pict>
+          </mc:Fallback>
+        </mc:AlternateContent>
+      </w:r>
+      <w:r>
+        <w:rPr>
+          <w:i/>
+        </w:rPr>
+        <w:drawing>
+          <wp:inline distT="0" distB="0" distL="0" distR="0" wp14:anchorId="1711CAC9" wp14:editId="209D3B3E">
+            <wp:extent cx="2105319" cy="1600423"/>
+            <wp:effectExtent l="0" t="0" r="9525" b="0"/>
+            <wp:docPr id="205" name="Imagem 205"/>
+            <wp:cNvGraphicFramePr>
+              <a:graphicFrameLocks xmlns:a="http://schemas.openxmlformats.org/drawingml/2006/main" noChangeAspect="1"/>
+            </wp:cNvGraphicFramePr>
+            <a:graphic xmlns:a="http://schemas.openxmlformats.org/drawingml/2006/main">
+              <a:graphicData uri="http://schemas.openxmlformats.org/drawingml/2006/picture">
+                <pic:pic xmlns:pic="http://schemas.openxmlformats.org/drawingml/2006/picture">
+                  <pic:nvPicPr>
+                    <pic:cNvPr id="1" name=""/>
+                    <pic:cNvPicPr/>
+                  </pic:nvPicPr>
+                  <pic:blipFill>
+                    <a:blip r:embed="rId174"/>
+                    <a:stretch>
+                      <a:fillRect/>
+                    </a:stretch>
+                  </pic:blipFill>
+                  <pic:spPr>
+                    <a:xfrm>
+                      <a:off x="0" y="0"/>
+                      <a:ext cx="2105319" cy="1600423"/>
+                    </a:xfrm>
+                    <a:prstGeom prst="rect">
+                      <a:avLst/>
+                    </a:prstGeom>
+                  </pic:spPr>
+                </pic:pic>
+              </a:graphicData>
+            </a:graphic>
+          </wp:inline>
+        </w:drawing>
+      </w:r>
+      <w:r>
+        <w:rPr>
+          <w:i/>
+        </w:rPr>
+        <w:drawing>
+          <wp:inline distT="0" distB="0" distL="0" distR="0" wp14:anchorId="34E8936B" wp14:editId="596C4A9C">
+            <wp:extent cx="8164064" cy="3267531"/>
+            <wp:effectExtent l="0" t="0" r="8890" b="9525"/>
+            <wp:docPr id="208" name="Imagem 208"/>
+            <wp:cNvGraphicFramePr>
+              <a:graphicFrameLocks xmlns:a="http://schemas.openxmlformats.org/drawingml/2006/main" noChangeAspect="1"/>
+            </wp:cNvGraphicFramePr>
+            <a:graphic xmlns:a="http://schemas.openxmlformats.org/drawingml/2006/main">
+              <a:graphicData uri="http://schemas.openxmlformats.org/drawingml/2006/picture">
+                <pic:pic xmlns:pic="http://schemas.openxmlformats.org/drawingml/2006/picture">
+                  <pic:nvPicPr>
+                    <pic:cNvPr id="1" name=""/>
+                    <pic:cNvPicPr/>
+                  </pic:nvPicPr>
+                  <pic:blipFill>
+                    <a:blip r:embed="rId175"/>
+                    <a:stretch>
+                      <a:fillRect/>
+                    </a:stretch>
+                  </pic:blipFill>
+                  <pic:spPr>
+                    <a:xfrm>
+                      <a:off x="0" y="0"/>
+                      <a:ext cx="8164064" cy="3267531"/>
+                    </a:xfrm>
+                    <a:prstGeom prst="rect">
+                      <a:avLst/>
+                    </a:prstGeom>
+                  </pic:spPr>
+                </pic:pic>
+              </a:graphicData>
+            </a:graphic>
+          </wp:inline>
+        </w:drawing>
+      </w:r>
+    </w:p>
+    <w:p>
+      <w:pPr>
+        <w:rPr>
+          <w:i/>
+        </w:rPr>
+      </w:pPr>
+      <w:r>
+        <w:rPr>
+          <w:i/>
+        </w:rPr>
+        <w:t xml:space="preserve">106 – Na lista queremos que o primeiro item ficasse em encorpado e negrito para isso utilizamos o </w:t>
+      </w:r>
+      <w:proofErr w:type="spellStart"/>
+      <w:r>
+        <w:rPr>
+          <w:i/>
+        </w:rPr>
+        <w:t>first-child</w:t>
+      </w:r>
+      <w:proofErr w:type="spellEnd"/>
+      <w:r>
+        <w:rPr>
+          <w:i/>
+        </w:rPr>
+        <w:t xml:space="preserve"> que significa o primeiro filho conforme o código a baixo.</w:t>
+      </w:r>
+      <w:r>
+        <w:rPr>
+          <w:i/>
+        </w:rPr>
+        <w:t xml:space="preserve"> </w:t>
+      </w:r>
+    </w:p>
+    <w:p>
+      <w:pPr>
+        <w:rPr>
+          <w:i/>
+        </w:rPr>
+      </w:pPr>
+      <w:r>
+        <w:rPr>
+          <w:i/>
+        </w:rPr>
+        <w:drawing>
+          <wp:inline distT="0" distB="0" distL="0" distR="0" wp14:anchorId="1FF5DF7D" wp14:editId="368B7D93">
+            <wp:extent cx="1676634" cy="666843"/>
+            <wp:effectExtent l="0" t="0" r="0" b="0"/>
+            <wp:docPr id="209" name="Imagem 209"/>
+            <wp:cNvGraphicFramePr>
+              <a:graphicFrameLocks xmlns:a="http://schemas.openxmlformats.org/drawingml/2006/main" noChangeAspect="1"/>
+            </wp:cNvGraphicFramePr>
+            <a:graphic xmlns:a="http://schemas.openxmlformats.org/drawingml/2006/main">
+              <a:graphicData uri="http://schemas.openxmlformats.org/drawingml/2006/picture">
+                <pic:pic xmlns:pic="http://schemas.openxmlformats.org/drawingml/2006/picture">
+                  <pic:nvPicPr>
+                    <pic:cNvPr id="1" name=""/>
+                    <pic:cNvPicPr/>
+                  </pic:nvPicPr>
+                  <pic:blipFill>
+                    <a:blip r:embed="rId176"/>
+                    <a:stretch>
+                      <a:fillRect/>
+                    </a:stretch>
+                  </pic:blipFill>
+                  <pic:spPr>
+                    <a:xfrm>
+                      <a:off x="0" y="0"/>
+                      <a:ext cx="1676634" cy="666843"/>
+                    </a:xfrm>
+                    <a:prstGeom prst="rect">
+                      <a:avLst/>
+                    </a:prstGeom>
+                  </pic:spPr>
+                </pic:pic>
+              </a:graphicData>
+            </a:graphic>
+          </wp:inline>
+        </w:drawing>
+      </w:r>
+      <w:r>
+        <w:rPr>
+          <w:i/>
+        </w:rPr>
+        <w:drawing>
+          <wp:inline distT="0" distB="0" distL="0" distR="0" wp14:anchorId="0CE2C46B" wp14:editId="7296045A">
+            <wp:extent cx="2057687" cy="1143160"/>
+            <wp:effectExtent l="0" t="0" r="0" b="0"/>
+            <wp:docPr id="210" name="Imagem 210"/>
+            <wp:cNvGraphicFramePr>
+              <a:graphicFrameLocks xmlns:a="http://schemas.openxmlformats.org/drawingml/2006/main" noChangeAspect="1"/>
+            </wp:cNvGraphicFramePr>
+            <a:graphic xmlns:a="http://schemas.openxmlformats.org/drawingml/2006/main">
+              <a:graphicData uri="http://schemas.openxmlformats.org/drawingml/2006/picture">
+                <pic:pic xmlns:pic="http://schemas.openxmlformats.org/drawingml/2006/picture">
+                  <pic:nvPicPr>
+                    <pic:cNvPr id="1" name=""/>
+                    <pic:cNvPicPr/>
+                  </pic:nvPicPr>
+                  <pic:blipFill>
+                    <a:blip r:embed="rId177"/>
+                    <a:stretch>
+                      <a:fillRect/>
+                    </a:stretch>
+                  </pic:blipFill>
+                  <pic:spPr>
+                    <a:xfrm>
+                      <a:off x="0" y="0"/>
+                      <a:ext cx="2057687" cy="1143160"/>
+                    </a:xfrm>
+                    <a:prstGeom prst="rect">
+                      <a:avLst/>
+                    </a:prstGeom>
+                  </pic:spPr>
+                </pic:pic>
+              </a:graphicData>
+            </a:graphic>
+          </wp:inline>
+        </w:drawing>
+      </w:r>
+    </w:p>
+    <w:p>
+      <w:pPr>
+        <w:rPr>
+          <w:i/>
+        </w:rPr>
+      </w:pPr>
+      <w:r>
+        <w:rPr>
+          <w:i/>
+        </w:rPr>
+        <w:t>107 – Adicionamos ícones de estrela na nossa lista benefícios:</w:t>
+      </w:r>
+    </w:p>
+    <w:p>
+      <w:pPr>
+        <w:rPr>
+          <w:i/>
+        </w:rPr>
+      </w:pPr>
+      <w:r>
+        <w:rPr>
+          <w:i/>
+        </w:rPr>
+        <w:t>Acessamos o site que contenha o ícone de estrela negra</w:t>
+      </w:r>
+    </w:p>
+    <w:p>
+      <w:pPr>
+        <w:rPr>
+          <w:i/>
+        </w:rPr>
+      </w:pPr>
+      <w:hyperlink r:id="rId178" w:history="1">
+        <w:r>
+          <w:rPr>
+            <w:rStyle w:val="Hyperlink"/>
+            <w:i/>
+          </w:rPr>
+          <w:t>https://www.compart.com/en/unicode/U+2605</w:t>
+        </w:r>
+      </w:hyperlink>
+    </w:p>
+    <w:p>
+      <w:pPr>
+        <w:rPr>
+          <w:i/>
+        </w:rPr>
+      </w:pPr>
+      <w:r>
+        <w:rPr>
+          <w:i/>
+        </w:rPr>
+        <w:t>Copiamos o símbolo e colocamos em nosso código conforme imagem a baixo.</w:t>
+      </w:r>
+      <w:r>
+        <w:rPr>
+          <w:i/>
+        </w:rPr>
+        <w:t xml:space="preserve"> </w:t>
+      </w:r>
+    </w:p>
+    <w:p>
+      <w:pPr>
+        <w:rPr>
+          <w:i/>
+        </w:rPr>
+      </w:pPr>
+      <w:r>
+        <w:rPr>
+          <w:i/>
+        </w:rPr>
+        <w:drawing>
+          <wp:inline distT="0" distB="0" distL="0" distR="0" wp14:anchorId="0D5F86F5" wp14:editId="4FE4DECB">
+            <wp:extent cx="1814050" cy="1028700"/>
+            <wp:effectExtent l="0" t="0" r="0" b="0"/>
+            <wp:docPr id="212" name="Imagem 212"/>
+            <wp:cNvGraphicFramePr>
+              <a:graphicFrameLocks xmlns:a="http://schemas.openxmlformats.org/drawingml/2006/main" noChangeAspect="1"/>
+            </wp:cNvGraphicFramePr>
+            <a:graphic xmlns:a="http://schemas.openxmlformats.org/drawingml/2006/main">
+              <a:graphicData uri="http://schemas.openxmlformats.org/drawingml/2006/picture">
+                <pic:pic xmlns:pic="http://schemas.openxmlformats.org/drawingml/2006/picture">
+                  <pic:nvPicPr>
+                    <pic:cNvPr id="1" name=""/>
+                    <pic:cNvPicPr/>
+                  </pic:nvPicPr>
+                  <pic:blipFill>
+                    <a:blip r:embed="rId179"/>
+                    <a:stretch>
+                      <a:fillRect/>
+                    </a:stretch>
+                  </pic:blipFill>
+                  <pic:spPr>
+                    <a:xfrm>
+                      <a:off x="0" y="0"/>
+                      <a:ext cx="1822658" cy="1033582"/>
+                    </a:xfrm>
+                    <a:prstGeom prst="rect">
+                      <a:avLst/>
+                    </a:prstGeom>
+                  </pic:spPr>
+                </pic:pic>
+              </a:graphicData>
+            </a:graphic>
+          </wp:inline>
+        </w:drawing>
+      </w:r>
+      <w:r>
+        <w:rPr>
+          <w:i/>
+        </w:rPr>
+        <w:drawing>
+          <wp:inline distT="0" distB="0" distL="0" distR="0" wp14:anchorId="17358334" wp14:editId="69A28D80">
+            <wp:extent cx="1429896" cy="1295400"/>
+            <wp:effectExtent l="0" t="0" r="0" b="0"/>
+            <wp:docPr id="213" name="Imagem 213"/>
+            <wp:cNvGraphicFramePr>
+              <a:graphicFrameLocks xmlns:a="http://schemas.openxmlformats.org/drawingml/2006/main" noChangeAspect="1"/>
+            </wp:cNvGraphicFramePr>
+            <a:graphic xmlns:a="http://schemas.openxmlformats.org/drawingml/2006/main">
+              <a:graphicData uri="http://schemas.openxmlformats.org/drawingml/2006/picture">
+                <pic:pic xmlns:pic="http://schemas.openxmlformats.org/drawingml/2006/picture">
+                  <pic:nvPicPr>
+                    <pic:cNvPr id="1" name=""/>
+                    <pic:cNvPicPr/>
+                  </pic:nvPicPr>
+                  <pic:blipFill>
+                    <a:blip r:embed="rId180"/>
+                    <a:stretch>
+                      <a:fillRect/>
+                    </a:stretch>
+                  </pic:blipFill>
+                  <pic:spPr>
+                    <a:xfrm>
+                      <a:off x="0" y="0"/>
+                      <a:ext cx="1492385" cy="1352012"/>
+                    </a:xfrm>
+                    <a:prstGeom prst="rect">
+                      <a:avLst/>
+                    </a:prstGeom>
+                  </pic:spPr>
+                </pic:pic>
+              </a:graphicData>
+            </a:graphic>
+          </wp:inline>
+        </w:drawing>
+      </w:r>
+    </w:p>
+    <w:p>
+      <w:pPr>
+        <w:rPr>
+          <w:i/>
+        </w:rPr>
+      </w:pPr>
+      <w:r>
+        <w:rPr>
+          <w:i/>
+        </w:rPr>
+        <w:t xml:space="preserve">108 </w:t>
+      </w:r>
+      <w:r>
+        <w:rPr>
+          <w:i/>
+        </w:rPr>
+        <w:t>–</w:t>
+      </w:r>
+      <w:r>
+        <w:rPr>
+          <w:i/>
+        </w:rPr>
+        <w:t xml:space="preserve"> </w:t>
+      </w:r>
+      <w:r>
+        <w:rPr>
+          <w:i/>
+        </w:rPr>
+        <w:t>Aumentamos o espaço interno da seção benefícios para cima e para baixo.</w:t>
+      </w:r>
+    </w:p>
+    <w:p>
+      <w:pPr>
+        <w:rPr>
+          <w:i/>
+        </w:rPr>
+      </w:pPr>
+      <w:r>
+        <w:rPr>
+          <w:i/>
+        </w:rPr>
+        <w:drawing>
+          <wp:inline distT="0" distB="0" distL="0" distR="0" wp14:anchorId="218FE37B" wp14:editId="2816B6E8">
+            <wp:extent cx="1400370" cy="514422"/>
+            <wp:effectExtent l="0" t="0" r="0" b="0"/>
+            <wp:docPr id="214" name="Imagem 214"/>
+            <wp:cNvGraphicFramePr>
+              <a:graphicFrameLocks xmlns:a="http://schemas.openxmlformats.org/drawingml/2006/main" noChangeAspect="1"/>
+            </wp:cNvGraphicFramePr>
+            <a:graphic xmlns:a="http://schemas.openxmlformats.org/drawingml/2006/main">
+              <a:graphicData uri="http://schemas.openxmlformats.org/drawingml/2006/picture">
+                <pic:pic xmlns:pic="http://schemas.openxmlformats.org/drawingml/2006/picture">
+                  <pic:nvPicPr>
+                    <pic:cNvPr id="1" name=""/>
+                    <pic:cNvPicPr/>
+                  </pic:nvPicPr>
+                  <pic:blipFill>
+                    <a:blip r:embed="rId181"/>
+                    <a:stretch>
+                      <a:fillRect/>
+                    </a:stretch>
+                  </pic:blipFill>
+                  <pic:spPr>
+                    <a:xfrm>
+                      <a:off x="0" y="0"/>
+                      <a:ext cx="1400370" cy="514422"/>
+                    </a:xfrm>
+                    <a:prstGeom prst="rect">
+                      <a:avLst/>
+                    </a:prstGeom>
+                  </pic:spPr>
+                </pic:pic>
+              </a:graphicData>
+            </a:graphic>
+          </wp:inline>
+        </w:drawing>
+      </w:r>
+    </w:p>
+    <w:p>
+      <w:pPr>
+        <w:rPr>
+          <w:i/>
+        </w:rPr>
+      </w:pPr>
+      <w:r>
+        <w:rPr>
+          <w:i/>
+        </w:rPr>
+        <w:t xml:space="preserve">109 – Na </w:t>
+      </w:r>
+      <w:proofErr w:type="spellStart"/>
+      <w:r>
+        <w:rPr>
+          <w:i/>
+        </w:rPr>
+        <w:t>div</w:t>
+      </w:r>
+      <w:proofErr w:type="spellEnd"/>
+      <w:r>
+        <w:rPr>
+          <w:i/>
+        </w:rPr>
+        <w:t xml:space="preserve"> que contem a lista e a imagem benefícios demos uma largura e centralizamos o item (a lista e a imagem) conforme o código.</w:t>
+      </w:r>
+    </w:p>
+    <w:p>
+      <w:pPr>
+        <w:rPr>
+          <w:i/>
+        </w:rPr>
+      </w:pPr>
+      <w:r>
+        <w:rPr>
+          <w:i/>
+        </w:rPr>
+        <w:drawing>
+          <wp:inline distT="0" distB="0" distL="0" distR="0" wp14:anchorId="0ED6BF8B" wp14:editId="5F7EFD41">
+            <wp:extent cx="2114845" cy="724001"/>
+            <wp:effectExtent l="0" t="0" r="0" b="0"/>
+            <wp:docPr id="215" name="Imagem 215"/>
+            <wp:cNvGraphicFramePr>
+              <a:graphicFrameLocks xmlns:a="http://schemas.openxmlformats.org/drawingml/2006/main" noChangeAspect="1"/>
+            </wp:cNvGraphicFramePr>
+            <a:graphic xmlns:a="http://schemas.openxmlformats.org/drawingml/2006/main">
+              <a:graphicData uri="http://schemas.openxmlformats.org/drawingml/2006/picture">
+                <pic:pic xmlns:pic="http://schemas.openxmlformats.org/drawingml/2006/picture">
+                  <pic:nvPicPr>
+                    <pic:cNvPr id="1" name=""/>
+                    <pic:cNvPicPr/>
+                  </pic:nvPicPr>
+                  <pic:blipFill>
+                    <a:blip r:embed="rId182"/>
+                    <a:stretch>
+                      <a:fillRect/>
+                    </a:stretch>
+                  </pic:blipFill>
+                  <pic:spPr>
+                    <a:xfrm>
+                      <a:off x="0" y="0"/>
+                      <a:ext cx="2114845" cy="724001"/>
+                    </a:xfrm>
+                    <a:prstGeom prst="rect">
+                      <a:avLst/>
+                    </a:prstGeom>
+                  </pic:spPr>
+                </pic:pic>
+              </a:graphicData>
+            </a:graphic>
+          </wp:inline>
+        </w:drawing>
+      </w:r>
       <w:bookmarkStart w:id="0" w:name="_GoBack"/>
       <w:bookmarkEnd w:id="0"/>
+    </w:p>
+    <w:p>
+      <w:pPr>
+        <w:rPr>
+          <w:i/>
+        </w:rPr>
+      </w:pPr>
+      <w:r>
+        <w:rPr>
+          <w:i/>
+        </w:rPr>
+        <w:drawing>
+          <wp:inline distT="0" distB="0" distL="0" distR="0" wp14:anchorId="4DDD81FE" wp14:editId="30A095E6">
+            <wp:extent cx="66675" cy="45719"/>
+            <wp:effectExtent l="0" t="0" r="0" b="0"/>
+            <wp:docPr id="211" name="Imagem 211"/>
+            <wp:cNvGraphicFramePr>
+              <a:graphicFrameLocks xmlns:a="http://schemas.openxmlformats.org/drawingml/2006/main" noChangeAspect="1"/>
+            </wp:cNvGraphicFramePr>
+            <a:graphic xmlns:a="http://schemas.openxmlformats.org/drawingml/2006/main">
+              <a:graphicData uri="http://schemas.openxmlformats.org/drawingml/2006/picture">
+                <pic:pic xmlns:pic="http://schemas.openxmlformats.org/drawingml/2006/picture">
+                  <pic:nvPicPr>
+                    <pic:cNvPr id="1" name=""/>
+                    <pic:cNvPicPr/>
+                  </pic:nvPicPr>
+                  <pic:blipFill rotWithShape="1">
+                    <a:blip r:embed="rId183"/>
+                    <a:srcRect l="-5072" t="-5783" r="100000" b="100000"/>
+                    <a:stretch/>
+                  </pic:blipFill>
+                  <pic:spPr bwMode="auto">
+                    <a:xfrm>
+                      <a:off x="0" y="0"/>
+                      <a:ext cx="66684" cy="45725"/>
+                    </a:xfrm>
+                    <a:prstGeom prst="rect">
+                      <a:avLst/>
+                    </a:prstGeom>
+                    <a:ln>
+                      <a:noFill/>
+                    </a:ln>
+                    <a:extLst>
+                      <a:ext uri="{53640926-AAD7-44D8-BBD7-CCE9431645EC}">
+                        <a14:shadowObscured xmlns:a14="http://schemas.microsoft.com/office/drawing/2010/main"/>
+                      </a:ext>
+                    </a:extLst>
+                  </pic:spPr>
+                </pic:pic>
+              </a:graphicData>
+            </a:graphic>
+          </wp:inline>
+        </w:drawing>
+      </w:r>
+    </w:p>
+    <w:p>
+      <w:pPr>
+        <w:jc w:val="right"/>
+        <w:rPr>
+          <w:i/>
+        </w:rPr>
+      </w:pPr>
     </w:p>
     <w:sectPr>
       <w:pgSz w:w="11906" w:h="16838"/>
@@ -18557,7 +19651,7 @@
 </file>
 
 <file path=customXml/itemProps4.xml><?xml version="1.0" encoding="utf-8"?>
-<ds:datastoreItem xmlns:ds="http://schemas.openxmlformats.org/officeDocument/2006/customXml" ds:itemID="{F488A889-5972-4F90-AF82-1017B6B1890D}">
+<ds:datastoreItem xmlns:ds="http://schemas.openxmlformats.org/officeDocument/2006/customXml" ds:itemID="{55B5831F-7B18-44EB-BB59-FC20BBC71944}">
   <ds:schemaRefs>
     <ds:schemaRef ds:uri="http://schemas.openxmlformats.org/officeDocument/2006/bibliography"/>
   </ds:schemaRefs>

</xml_diff>